<commit_message>
More Methods coding. Equations are done.
</commit_message>
<xml_diff>
--- a/2025_earwig_fecundity_revised.docx
+++ b/2025_earwig_fecundity_revised.docx
@@ -373,10 +373,10 @@
       <w:pPr>
         <w:pStyle w:val="Heading2"/>
       </w:pPr>
-      <w:bookmarkStart w:id="4" w:name="multivariate-brood-order-model"/>
+      <w:bookmarkStart w:id="4" w:name="multivariate-clutch-order-model"/>
       <w:bookmarkEnd w:id="3"/>
       <w:r>
-        <w:t>Multivariate Brood-Order Model</w:t>
+        <w:t>Multivariate Clutch-Order Model</w:t>
       </w:r>
     </w:p>
     <w:p>
@@ -395,7 +395,7 @@
         </m:r>
       </m:oMath>
       <w:r>
-        <w:t xml:space="preserve"> and brood </w:t>
+        <w:t xml:space="preserve"> and clutch </w:t>
       </w:r>
       <m:oMath>
         <m:r>
@@ -409,6 +409,7 @@
         <w:t>, mean egg size and egg number were modelled jointly as:</w:t>
       </w:r>
     </w:p>
+    <w:bookmarkStart w:id="5" w:name="eq-clutchorder"/>
     <w:p>
       <w:pPr>
         <w:pStyle w:val="BodyText"/>
@@ -1364,8 +1365,32 @@
               </m:e>
             </m:mr>
           </m:m>
+          <m:r>
+            <w:rPr>
+              <w:rFonts w:ascii="Cambria Math" w:hAnsi="Cambria Math"/>
+            </w:rPr>
+            <m:t>  </m:t>
+          </m:r>
+          <m:d>
+            <m:dPr>
+              <m:ctrlPr>
+                <w:rPr>
+                  <w:rFonts w:ascii="Cambria Math" w:hAnsi="Cambria Math"/>
+                </w:rPr>
+              </m:ctrlPr>
+            </m:dPr>
+            <m:e>
+              <m:r>
+                <w:rPr>
+                  <w:rFonts w:ascii="Cambria Math" w:hAnsi="Cambria Math"/>
+                </w:rPr>
+                <m:t>1</m:t>
+              </m:r>
+            </m:e>
+          </m:d>
         </m:oMath>
       </m:oMathPara>
+      <w:bookmarkEnd w:id="5"/>
     </w:p>
     <w:p>
       <w:pPr>
@@ -1508,7 +1533,7 @@
       <w:pPr>
         <w:pStyle w:val="Heading2"/>
       </w:pPr>
-      <w:bookmarkStart w:id="5" w:name="multilevel-correlations"/>
+      <w:bookmarkStart w:id="6" w:name="multilevel-correlations"/>
       <w:bookmarkEnd w:id="4"/>
       <w:r>
         <w:lastRenderedPageBreak/>
@@ -1519,7 +1544,7 @@
       <w:pPr>
         <w:pStyle w:val="Heading3"/>
       </w:pPr>
-      <w:bookmarkStart w:id="6" w:name="raw-phenotypic-correlation"/>
+      <w:bookmarkStart w:id="7" w:name="raw-phenotypic-correlation"/>
       <w:r>
         <w:t>Raw phenotypic correlation</w:t>
       </w:r>
@@ -1546,8 +1571,8 @@
       <w:pPr>
         <w:pStyle w:val="Heading3"/>
       </w:pPr>
-      <w:bookmarkStart w:id="7" w:name="between-female-correlation"/>
-      <w:bookmarkEnd w:id="6"/>
+      <w:bookmarkStart w:id="8" w:name="between-female-correlation"/>
+      <w:bookmarkEnd w:id="7"/>
       <w:r>
         <w:t>Between-female correlation</w:t>
       </w:r>
@@ -1564,8 +1589,8 @@
       <w:pPr>
         <w:pStyle w:val="Heading3"/>
       </w:pPr>
-      <w:bookmarkStart w:id="8" w:name="X87e37a818f147ef2a5a26f637cd19304f3671a4"/>
-      <w:bookmarkEnd w:id="7"/>
+      <w:bookmarkStart w:id="9" w:name="X87e37a818f147ef2a5a26f637cd19304f3671a4"/>
+      <w:bookmarkEnd w:id="8"/>
       <w:r>
         <w:t>Partitioning among- and residual covariance</w:t>
       </w:r>
@@ -1578,6 +1603,7 @@
         <w:t>To formally partition covariance into among-female and residual components, I fitted a multivariate Gaussian mixed-effects model:</w:t>
       </w:r>
     </w:p>
+    <w:bookmarkStart w:id="10" w:name="eq-residual"/>
     <w:p>
       <w:pPr>
         <w:pStyle w:val="BodyText"/>
@@ -1971,8 +1997,32 @@
               </m:e>
             </m:mr>
           </m:m>
+          <m:r>
+            <w:rPr>
+              <w:rFonts w:ascii="Cambria Math" w:hAnsi="Cambria Math"/>
+            </w:rPr>
+            <m:t>  </m:t>
+          </m:r>
+          <m:d>
+            <m:dPr>
+              <m:ctrlPr>
+                <w:rPr>
+                  <w:rFonts w:ascii="Cambria Math" w:hAnsi="Cambria Math"/>
+                </w:rPr>
+              </m:ctrlPr>
+            </m:dPr>
+            <m:e>
+              <m:r>
+                <w:rPr>
+                  <w:rFonts w:ascii="Cambria Math" w:hAnsi="Cambria Math"/>
+                </w:rPr>
+                <m:t>2</m:t>
+              </m:r>
+            </m:e>
+          </m:d>
         </m:oMath>
       </m:oMathPara>
+      <w:bookmarkEnd w:id="10"/>
     </w:p>
     <w:p>
       <w:pPr>
@@ -2552,9 +2602,9 @@
       <w:pPr>
         <w:pStyle w:val="Heading2"/>
       </w:pPr>
-      <w:bookmarkStart w:id="9" w:name="withinbetween-fixed-effects-model"/>
-      <w:bookmarkEnd w:id="5"/>
-      <w:bookmarkEnd w:id="8"/>
+      <w:bookmarkStart w:id="11" w:name="withinbetween-fixed-effects-model"/>
+      <w:bookmarkEnd w:id="6"/>
+      <w:bookmarkEnd w:id="9"/>
       <w:r>
         <w:lastRenderedPageBreak/>
         <w:t>Within–Between Fixed Effects Model</w:t>
@@ -2580,6 +2630,7 @@
         <w:t>Within-female deviation</w:t>
       </w:r>
     </w:p>
+    <w:bookmarkStart w:id="12" w:name="eq-within"/>
     <w:p>
       <w:pPr>
         <w:pStyle w:val="FirstParagraph"/>
@@ -2709,8 +2760,32 @@
               </m:r>
             </m:sub>
           </m:sSub>
+          <m:r>
+            <w:rPr>
+              <w:rFonts w:ascii="Cambria Math" w:hAnsi="Cambria Math"/>
+            </w:rPr>
+            <m:t>  </m:t>
+          </m:r>
+          <m:d>
+            <m:dPr>
+              <m:ctrlPr>
+                <w:rPr>
+                  <w:rFonts w:ascii="Cambria Math" w:hAnsi="Cambria Math"/>
+                </w:rPr>
+              </m:ctrlPr>
+            </m:dPr>
+            <m:e>
+              <m:r>
+                <w:rPr>
+                  <w:rFonts w:ascii="Cambria Math" w:hAnsi="Cambria Math"/>
+                </w:rPr>
+                <m:t>3</m:t>
+              </m:r>
+            </m:e>
+          </m:d>
         </m:oMath>
       </m:oMathPara>
+      <w:bookmarkEnd w:id="12"/>
     </w:p>
     <w:p>
       <w:pPr>
@@ -2724,6 +2799,7 @@
         <w:t>Between-female component</w:t>
       </w:r>
     </w:p>
+    <w:bookmarkStart w:id="13" w:name="eq-between"/>
     <w:p>
       <w:pPr>
         <w:pStyle w:val="FirstParagraph"/>
@@ -2846,17 +2922,42 @@
               </m:r>
             </m:e>
           </m:acc>
+          <m:r>
+            <w:rPr>
+              <w:rFonts w:ascii="Cambria Math" w:hAnsi="Cambria Math"/>
+            </w:rPr>
+            <m:t>  </m:t>
+          </m:r>
+          <m:d>
+            <m:dPr>
+              <m:ctrlPr>
+                <w:rPr>
+                  <w:rFonts w:ascii="Cambria Math" w:hAnsi="Cambria Math"/>
+                </w:rPr>
+              </m:ctrlPr>
+            </m:dPr>
+            <m:e>
+              <m:r>
+                <w:rPr>
+                  <w:rFonts w:ascii="Cambria Math" w:hAnsi="Cambria Math"/>
+                </w:rPr>
+                <m:t>4</m:t>
+              </m:r>
+            </m:e>
+          </m:d>
         </m:oMath>
       </m:oMathPara>
+      <w:bookmarkEnd w:id="13"/>
     </w:p>
     <w:p>
       <w:pPr>
         <w:pStyle w:val="FirstParagraph"/>
       </w:pPr>
       <w:r>
-        <w:t>We then fitted the following linear mixed-effects model:</w:t>
-      </w:r>
-    </w:p>
+        <w:t>I then fitted the following linear mixed-effects model:</w:t>
+      </w:r>
+    </w:p>
+    <w:bookmarkStart w:id="14" w:name="eq-withinbetween"/>
     <w:p>
       <w:pPr>
         <w:pStyle w:val="BodyText"/>
@@ -3159,8 +3260,32 @@
               </m:r>
             </m:sub>
           </m:sSub>
+          <m:r>
+            <w:rPr>
+              <w:rFonts w:ascii="Cambria Math" w:hAnsi="Cambria Math"/>
+            </w:rPr>
+            <m:t>  </m:t>
+          </m:r>
+          <m:d>
+            <m:dPr>
+              <m:ctrlPr>
+                <w:rPr>
+                  <w:rFonts w:ascii="Cambria Math" w:hAnsi="Cambria Math"/>
+                </w:rPr>
+              </m:ctrlPr>
+            </m:dPr>
+            <m:e>
+              <m:r>
+                <w:rPr>
+                  <w:rFonts w:ascii="Cambria Math" w:hAnsi="Cambria Math"/>
+                </w:rPr>
+                <m:t>5</m:t>
+              </m:r>
+            </m:e>
+          </m:d>
         </m:oMath>
       </m:oMathPara>
+      <w:bookmarkEnd w:id="14"/>
     </w:p>
     <w:p>
       <w:pPr>
@@ -3474,14 +3599,1221 @@
         <w:pStyle w:val="BodyText"/>
       </w:pPr>
       <w:r>
-        <w:t>Weakly informative priors were specified for all model parameters to regularize estimation while remaining minimally restrictive. Fixed effects were assigned zero-centered normal priors. Standard deviations of random effects were assigned exponential priors to constrain variance parameters to positive values while discouraging unrealistically large estimates. Correlation matrices among random effects were assigned LKJ priors to provide weak regularization of covariance structures.All models were fitted usin</w:t>
-      </w:r>
-      <w:r>
-        <w:t xml:space="preserve">g Markov chain Monte Carlo (MCMC) </w:t>
-      </w:r>
+        <w:t>To facilitate comparison of effect sizes, continuous predictors were standardized by subtracting the mean and dividing by the standard deviation:</w:t>
+      </w:r>
+    </w:p>
+    <w:bookmarkStart w:id="15" w:name="eq-standardization"/>
+    <w:p>
+      <w:pPr>
+        <w:pStyle w:val="BodyText"/>
+      </w:pPr>
+      <m:oMathPara>
+        <m:oMathParaPr>
+          <m:jc m:val="center"/>
+        </m:oMathParaPr>
+        <m:oMath>
+          <m:sSub>
+            <m:sSubPr>
+              <m:ctrlPr>
+                <w:rPr>
+                  <w:rFonts w:ascii="Cambria Math" w:hAnsi="Cambria Math"/>
+                </w:rPr>
+              </m:ctrlPr>
+            </m:sSubPr>
+            <m:e>
+              <m:r>
+                <w:rPr>
+                  <w:rFonts w:ascii="Cambria Math" w:hAnsi="Cambria Math"/>
+                </w:rPr>
+                <m:t>X</m:t>
+              </m:r>
+            </m:e>
+            <m:sub>
+              <m:r>
+                <m:rPr>
+                  <m:nor/>
+                </m:rPr>
+                <m:t>std</m:t>
+              </m:r>
+            </m:sub>
+          </m:sSub>
+          <m:r>
+            <m:rPr>
+              <m:sty m:val="p"/>
+            </m:rPr>
+            <w:rPr>
+              <w:rFonts w:ascii="Cambria Math" w:hAnsi="Cambria Math"/>
+            </w:rPr>
+            <m:t>=</m:t>
+          </m:r>
+          <m:f>
+            <m:fPr>
+              <m:ctrlPr>
+                <w:rPr>
+                  <w:rFonts w:ascii="Cambria Math" w:hAnsi="Cambria Math"/>
+                </w:rPr>
+              </m:ctrlPr>
+            </m:fPr>
+            <m:num>
+              <m:r>
+                <w:rPr>
+                  <w:rFonts w:ascii="Cambria Math" w:hAnsi="Cambria Math"/>
+                </w:rPr>
+                <m:t>X</m:t>
+              </m:r>
+              <m:r>
+                <m:rPr>
+                  <m:sty m:val="p"/>
+                </m:rPr>
+                <w:rPr>
+                  <w:rFonts w:ascii="Cambria Math" w:hAnsi="Cambria Math"/>
+                </w:rPr>
+                <m:t>-</m:t>
+              </m:r>
+              <m:acc>
+                <m:accPr>
+                  <m:chr m:val="‾"/>
+                  <m:ctrlPr>
+                    <w:rPr>
+                      <w:rFonts w:ascii="Cambria Math" w:hAnsi="Cambria Math"/>
+                    </w:rPr>
+                  </m:ctrlPr>
+                </m:accPr>
+                <m:e>
+                  <m:r>
+                    <w:rPr>
+                      <w:rFonts w:ascii="Cambria Math" w:hAnsi="Cambria Math"/>
+                    </w:rPr>
+                    <m:t>X</m:t>
+                  </m:r>
+                </m:e>
+              </m:acc>
+            </m:num>
+            <m:den>
+              <m:r>
+                <m:rPr>
+                  <m:sty m:val="p"/>
+                </m:rPr>
+                <w:rPr>
+                  <w:rFonts w:ascii="Cambria Math" w:hAnsi="Cambria Math"/>
+                </w:rPr>
+                <m:t>SD</m:t>
+              </m:r>
+              <m:d>
+                <m:dPr>
+                  <m:ctrlPr>
+                    <w:rPr>
+                      <w:rFonts w:ascii="Cambria Math" w:hAnsi="Cambria Math"/>
+                    </w:rPr>
+                  </m:ctrlPr>
+                </m:dPr>
+                <m:e>
+                  <m:r>
+                    <w:rPr>
+                      <w:rFonts w:ascii="Cambria Math" w:hAnsi="Cambria Math"/>
+                    </w:rPr>
+                    <m:t>X</m:t>
+                  </m:r>
+                </m:e>
+              </m:d>
+            </m:den>
+          </m:f>
+          <m:r>
+            <w:rPr>
+              <w:rFonts w:ascii="Cambria Math" w:hAnsi="Cambria Math"/>
+            </w:rPr>
+            <m:t>  </m:t>
+          </m:r>
+          <m:d>
+            <m:dPr>
+              <m:ctrlPr>
+                <w:rPr>
+                  <w:rFonts w:ascii="Cambria Math" w:hAnsi="Cambria Math"/>
+                </w:rPr>
+              </m:ctrlPr>
+            </m:dPr>
+            <m:e>
+              <m:r>
+                <w:rPr>
+                  <w:rFonts w:ascii="Cambria Math" w:hAnsi="Cambria Math"/>
+                </w:rPr>
+                <m:t>6</m:t>
+              </m:r>
+            </m:e>
+          </m:d>
+        </m:oMath>
+      </m:oMathPara>
+      <w:bookmarkEnd w:id="15"/>
+    </w:p>
+    <w:p>
+      <w:pPr>
+        <w:pStyle w:val="FirstParagraph"/>
+      </w:pPr>
       <w:r>
         <w:lastRenderedPageBreak/>
-        <w:t>sampling with four independent chains and 4,000 iterations to ensure adequate posterior exploration. Convergence was evaluated using the potential scale reduction factor (</w:t>
+        <w:t>The within-female and between-female components were standardized across their respective distributions. When estimating standardized regression coefficients, the response variable was also scaled to unit standard deviation. Standardized coefficients therefore represent the expected change (in standard deviation units) in egg size per one standard deviation change in the predictor.</w:t>
+      </w:r>
+    </w:p>
+    <w:p>
+      <w:pPr>
+        <w:pStyle w:val="BodyText"/>
+      </w:pPr>
+      <w:r>
+        <w:t>To test whether females differed in their propensity to trade off egg size against egg number, I fitted a random-slopes model allowing the within-female effect of egg number to vary among females:</w:t>
+      </w:r>
+    </w:p>
+    <w:bookmarkStart w:id="16" w:name="eq-randomslopes"/>
+    <w:p>
+      <w:pPr>
+        <w:pStyle w:val="BodyText"/>
+        <w:rPr>
+          <w:sz w:val="20"/>
+          <w:szCs w:val="20"/>
+        </w:rPr>
+      </w:pPr>
+      <m:oMathPara>
+        <m:oMathParaPr>
+          <m:jc m:val="center"/>
+        </m:oMathParaPr>
+        <m:oMath>
+          <m:sSub>
+            <m:sSubPr>
+              <m:ctrlPr>
+                <w:rPr>
+                  <w:rFonts w:ascii="Cambria Math" w:hAnsi="Cambria Math"/>
+                  <w:sz w:val="20"/>
+                  <w:szCs w:val="20"/>
+                </w:rPr>
+              </m:ctrlPr>
+            </m:sSubPr>
+            <m:e>
+              <m:r>
+                <m:rPr>
+                  <m:nor/>
+                </m:rPr>
+                <w:rPr>
+                  <w:sz w:val="20"/>
+                  <w:szCs w:val="20"/>
+                </w:rPr>
+                <m:t>mean egg size</m:t>
+              </m:r>
+            </m:e>
+            <m:sub>
+              <m:r>
+                <w:rPr>
+                  <w:rFonts w:ascii="Cambria Math" w:hAnsi="Cambria Math"/>
+                  <w:sz w:val="20"/>
+                  <w:szCs w:val="20"/>
+                </w:rPr>
+                <m:t>ij</m:t>
+              </m:r>
+            </m:sub>
+          </m:sSub>
+          <m:r>
+            <m:rPr>
+              <m:sty m:val="p"/>
+            </m:rPr>
+            <w:rPr>
+              <w:rFonts w:ascii="Cambria Math" w:hAnsi="Cambria Math"/>
+              <w:sz w:val="20"/>
+              <w:szCs w:val="20"/>
+            </w:rPr>
+            <m:t>=</m:t>
+          </m:r>
+          <m:sSub>
+            <m:sSubPr>
+              <m:ctrlPr>
+                <w:rPr>
+                  <w:rFonts w:ascii="Cambria Math" w:hAnsi="Cambria Math"/>
+                  <w:sz w:val="20"/>
+                  <w:szCs w:val="20"/>
+                </w:rPr>
+              </m:ctrlPr>
+            </m:sSubPr>
+            <m:e>
+              <m:r>
+                <w:rPr>
+                  <w:rFonts w:ascii="Cambria Math" w:hAnsi="Cambria Math"/>
+                  <w:sz w:val="20"/>
+                  <w:szCs w:val="20"/>
+                </w:rPr>
+                <m:t>β</m:t>
+              </m:r>
+            </m:e>
+            <m:sub>
+              <m:r>
+                <w:rPr>
+                  <w:rFonts w:ascii="Cambria Math" w:hAnsi="Cambria Math"/>
+                  <w:sz w:val="20"/>
+                  <w:szCs w:val="20"/>
+                </w:rPr>
+                <m:t>0</m:t>
+              </m:r>
+            </m:sub>
+          </m:sSub>
+          <m:r>
+            <m:rPr>
+              <m:sty m:val="p"/>
+            </m:rPr>
+            <w:rPr>
+              <w:rFonts w:ascii="Cambria Math" w:hAnsi="Cambria Math"/>
+              <w:sz w:val="20"/>
+              <w:szCs w:val="20"/>
+            </w:rPr>
+            <m:t>+</m:t>
+          </m:r>
+          <m:sSub>
+            <m:sSubPr>
+              <m:ctrlPr>
+                <w:rPr>
+                  <w:rFonts w:ascii="Cambria Math" w:hAnsi="Cambria Math"/>
+                  <w:sz w:val="20"/>
+                  <w:szCs w:val="20"/>
+                </w:rPr>
+              </m:ctrlPr>
+            </m:sSubPr>
+            <m:e>
+              <m:r>
+                <w:rPr>
+                  <w:rFonts w:ascii="Cambria Math" w:hAnsi="Cambria Math"/>
+                  <w:sz w:val="20"/>
+                  <w:szCs w:val="20"/>
+                </w:rPr>
+                <m:t>β</m:t>
+              </m:r>
+            </m:e>
+            <m:sub>
+              <m:r>
+                <w:rPr>
+                  <w:rFonts w:ascii="Cambria Math" w:hAnsi="Cambria Math"/>
+                  <w:sz w:val="20"/>
+                  <w:szCs w:val="20"/>
+                </w:rPr>
+                <m:t>W</m:t>
+              </m:r>
+            </m:sub>
+          </m:sSub>
+          <m:r>
+            <w:rPr>
+              <w:rFonts w:ascii="Cambria Math" w:hAnsi="Cambria Math"/>
+              <w:sz w:val="20"/>
+              <w:szCs w:val="20"/>
+            </w:rPr>
+            <m:t> </m:t>
+          </m:r>
+          <m:sSub>
+            <m:sSubPr>
+              <m:ctrlPr>
+                <w:rPr>
+                  <w:rFonts w:ascii="Cambria Math" w:hAnsi="Cambria Math"/>
+                  <w:sz w:val="20"/>
+                  <w:szCs w:val="20"/>
+                </w:rPr>
+              </m:ctrlPr>
+            </m:sSubPr>
+            <m:e>
+              <m:r>
+                <m:rPr>
+                  <m:nor/>
+                </m:rPr>
+                <w:rPr>
+                  <w:sz w:val="20"/>
+                  <w:szCs w:val="20"/>
+                </w:rPr>
+                <m:t>egg_number</m:t>
+              </m:r>
+            </m:e>
+            <m:sub>
+              <m:r>
+                <m:rPr>
+                  <m:nor/>
+                </m:rPr>
+                <w:rPr>
+                  <w:sz w:val="20"/>
+                  <w:szCs w:val="20"/>
+                </w:rPr>
+                <m:t>within</m:t>
+              </m:r>
+              <m:r>
+                <m:rPr>
+                  <m:sty m:val="p"/>
+                </m:rPr>
+                <w:rPr>
+                  <w:rFonts w:ascii="Cambria Math" w:hAnsi="Cambria Math"/>
+                  <w:sz w:val="20"/>
+                  <w:szCs w:val="20"/>
+                </w:rPr>
+                <m:t>,</m:t>
+              </m:r>
+              <m:r>
+                <w:rPr>
+                  <w:rFonts w:ascii="Cambria Math" w:hAnsi="Cambria Math"/>
+                  <w:sz w:val="20"/>
+                  <w:szCs w:val="20"/>
+                </w:rPr>
+                <m:t>ij</m:t>
+              </m:r>
+            </m:sub>
+          </m:sSub>
+          <m:r>
+            <m:rPr>
+              <m:sty m:val="p"/>
+            </m:rPr>
+            <w:rPr>
+              <w:rFonts w:ascii="Cambria Math" w:hAnsi="Cambria Math"/>
+              <w:sz w:val="20"/>
+              <w:szCs w:val="20"/>
+            </w:rPr>
+            <m:t>+</m:t>
+          </m:r>
+          <m:sSub>
+            <m:sSubPr>
+              <m:ctrlPr>
+                <w:rPr>
+                  <w:rFonts w:ascii="Cambria Math" w:hAnsi="Cambria Math"/>
+                  <w:sz w:val="20"/>
+                  <w:szCs w:val="20"/>
+                </w:rPr>
+              </m:ctrlPr>
+            </m:sSubPr>
+            <m:e>
+              <m:r>
+                <w:rPr>
+                  <w:rFonts w:ascii="Cambria Math" w:hAnsi="Cambria Math"/>
+                  <w:sz w:val="20"/>
+                  <w:szCs w:val="20"/>
+                </w:rPr>
+                <m:t>β</m:t>
+              </m:r>
+            </m:e>
+            <m:sub>
+              <m:r>
+                <w:rPr>
+                  <w:rFonts w:ascii="Cambria Math" w:hAnsi="Cambria Math"/>
+                  <w:sz w:val="20"/>
+                  <w:szCs w:val="20"/>
+                </w:rPr>
+                <m:t>B</m:t>
+              </m:r>
+            </m:sub>
+          </m:sSub>
+          <m:r>
+            <w:rPr>
+              <w:rFonts w:ascii="Cambria Math" w:hAnsi="Cambria Math"/>
+              <w:sz w:val="20"/>
+              <w:szCs w:val="20"/>
+            </w:rPr>
+            <m:t> </m:t>
+          </m:r>
+          <m:sSub>
+            <m:sSubPr>
+              <m:ctrlPr>
+                <w:rPr>
+                  <w:rFonts w:ascii="Cambria Math" w:hAnsi="Cambria Math"/>
+                  <w:sz w:val="20"/>
+                  <w:szCs w:val="20"/>
+                </w:rPr>
+              </m:ctrlPr>
+            </m:sSubPr>
+            <m:e>
+              <m:r>
+                <m:rPr>
+                  <m:nor/>
+                </m:rPr>
+                <w:rPr>
+                  <w:sz w:val="20"/>
+                  <w:szCs w:val="20"/>
+                </w:rPr>
+                <m:t>egg_number</m:t>
+              </m:r>
+            </m:e>
+            <m:sub>
+              <m:r>
+                <m:rPr>
+                  <m:nor/>
+                </m:rPr>
+                <w:rPr>
+                  <w:sz w:val="20"/>
+                  <w:szCs w:val="20"/>
+                </w:rPr>
+                <m:t>between</m:t>
+              </m:r>
+              <m:r>
+                <m:rPr>
+                  <m:sty m:val="p"/>
+                </m:rPr>
+                <w:rPr>
+                  <w:rFonts w:ascii="Cambria Math" w:hAnsi="Cambria Math"/>
+                  <w:sz w:val="20"/>
+                  <w:szCs w:val="20"/>
+                </w:rPr>
+                <m:t>,</m:t>
+              </m:r>
+              <m:r>
+                <w:rPr>
+                  <w:rFonts w:ascii="Cambria Math" w:hAnsi="Cambria Math"/>
+                  <w:sz w:val="20"/>
+                  <w:szCs w:val="20"/>
+                </w:rPr>
+                <m:t>i</m:t>
+              </m:r>
+            </m:sub>
+          </m:sSub>
+          <m:r>
+            <m:rPr>
+              <m:sty m:val="p"/>
+            </m:rPr>
+            <w:rPr>
+              <w:rFonts w:ascii="Cambria Math" w:hAnsi="Cambria Math"/>
+              <w:sz w:val="20"/>
+              <w:szCs w:val="20"/>
+            </w:rPr>
+            <m:t>+</m:t>
+          </m:r>
+          <m:d>
+            <m:dPr>
+              <m:ctrlPr>
+                <w:rPr>
+                  <w:rFonts w:ascii="Cambria Math" w:hAnsi="Cambria Math"/>
+                  <w:sz w:val="20"/>
+                  <w:szCs w:val="20"/>
+                </w:rPr>
+              </m:ctrlPr>
+            </m:dPr>
+            <m:e>
+              <m:r>
+                <w:rPr>
+                  <w:rFonts w:ascii="Cambria Math" w:hAnsi="Cambria Math"/>
+                  <w:sz w:val="20"/>
+                  <w:szCs w:val="20"/>
+                </w:rPr>
+                <m:t>1</m:t>
+              </m:r>
+              <m:r>
+                <m:rPr>
+                  <m:sty m:val="p"/>
+                </m:rPr>
+                <w:rPr>
+                  <w:rFonts w:ascii="Cambria Math" w:hAnsi="Cambria Math"/>
+                  <w:sz w:val="20"/>
+                  <w:szCs w:val="20"/>
+                </w:rPr>
+                <m:t>+</m:t>
+              </m:r>
+              <m:sSub>
+                <m:sSubPr>
+                  <m:ctrlPr>
+                    <w:rPr>
+                      <w:rFonts w:ascii="Cambria Math" w:hAnsi="Cambria Math"/>
+                      <w:sz w:val="20"/>
+                      <w:szCs w:val="20"/>
+                    </w:rPr>
+                  </m:ctrlPr>
+                </m:sSubPr>
+                <m:e>
+                  <m:r>
+                    <m:rPr>
+                      <m:nor/>
+                    </m:rPr>
+                    <w:rPr>
+                      <w:sz w:val="20"/>
+                      <w:szCs w:val="20"/>
+                    </w:rPr>
+                    <m:t>egg_number</m:t>
+                  </m:r>
+                </m:e>
+                <m:sub>
+                  <m:r>
+                    <m:rPr>
+                      <m:nor/>
+                    </m:rPr>
+                    <w:rPr>
+                      <w:sz w:val="20"/>
+                      <w:szCs w:val="20"/>
+                    </w:rPr>
+                    <m:t>within</m:t>
+                  </m:r>
+                </m:sub>
+              </m:sSub>
+              <m:r>
+                <m:rPr>
+                  <m:sty m:val="p"/>
+                </m:rPr>
+                <w:rPr>
+                  <w:rFonts w:ascii="Cambria Math" w:hAnsi="Cambria Math"/>
+                  <w:sz w:val="20"/>
+                  <w:szCs w:val="20"/>
+                </w:rPr>
+                <m:t>∣</m:t>
+              </m:r>
+              <m:r>
+                <m:rPr>
+                  <m:nor/>
+                </m:rPr>
+                <w:rPr>
+                  <w:sz w:val="20"/>
+                  <w:szCs w:val="20"/>
+                </w:rPr>
+                <m:t>id</m:t>
+              </m:r>
+            </m:e>
+          </m:d>
+          <m:r>
+            <m:rPr>
+              <m:sty m:val="p"/>
+            </m:rPr>
+            <w:rPr>
+              <w:rFonts w:ascii="Cambria Math" w:hAnsi="Cambria Math"/>
+              <w:sz w:val="20"/>
+              <w:szCs w:val="20"/>
+            </w:rPr>
+            <m:t>+</m:t>
+          </m:r>
+          <m:sSub>
+            <m:sSubPr>
+              <m:ctrlPr>
+                <w:rPr>
+                  <w:rFonts w:ascii="Cambria Math" w:hAnsi="Cambria Math"/>
+                  <w:sz w:val="20"/>
+                  <w:szCs w:val="20"/>
+                </w:rPr>
+              </m:ctrlPr>
+            </m:sSubPr>
+            <m:e>
+              <m:r>
+                <w:rPr>
+                  <w:rFonts w:ascii="Cambria Math" w:hAnsi="Cambria Math"/>
+                  <w:sz w:val="20"/>
+                  <w:szCs w:val="20"/>
+                </w:rPr>
+                <m:t>ε</m:t>
+              </m:r>
+            </m:e>
+            <m:sub>
+              <m:r>
+                <w:rPr>
+                  <w:rFonts w:ascii="Cambria Math" w:hAnsi="Cambria Math"/>
+                  <w:sz w:val="20"/>
+                  <w:szCs w:val="20"/>
+                </w:rPr>
+                <m:t>ij</m:t>
+              </m:r>
+            </m:sub>
+          </m:sSub>
+          <m:r>
+            <w:rPr>
+              <w:rFonts w:ascii="Cambria Math" w:hAnsi="Cambria Math"/>
+              <w:sz w:val="20"/>
+              <w:szCs w:val="20"/>
+            </w:rPr>
+            <m:t>  </m:t>
+          </m:r>
+          <m:d>
+            <m:dPr>
+              <m:ctrlPr>
+                <w:rPr>
+                  <w:rFonts w:ascii="Cambria Math" w:hAnsi="Cambria Math"/>
+                  <w:sz w:val="20"/>
+                  <w:szCs w:val="20"/>
+                </w:rPr>
+              </m:ctrlPr>
+            </m:dPr>
+            <m:e>
+              <m:r>
+                <w:rPr>
+                  <w:rFonts w:ascii="Cambria Math" w:hAnsi="Cambria Math"/>
+                  <w:sz w:val="20"/>
+                  <w:szCs w:val="20"/>
+                </w:rPr>
+                <m:t>7</m:t>
+              </m:r>
+            </m:e>
+          </m:d>
+        </m:oMath>
+      </m:oMathPara>
+      <w:bookmarkEnd w:id="16"/>
+    </w:p>
+    <w:p>
+      <w:pPr>
+        <w:pStyle w:val="FirstParagraph"/>
+      </w:pPr>
+      <w:r>
+        <w:t>This model estimates variance in within-female slopes as well as the intercept–slope correlation, thereby quantifying heterogeneity in allocation strategies. Specifically, it allows assessment of whether females with larger average egg size differ systematically in the strength or direction of their within-female trade-off. This model was used to quantify individual variation in slopes but not to derive standardized fixed effects.</w:t>
+      </w:r>
+    </w:p>
+    <w:p>
+      <w:pPr>
+        <w:pStyle w:val="Heading2"/>
+      </w:pPr>
+      <w:bookmarkStart w:id="17" w:name="X66c50ccfd0266e428f76d39573138b87b12f29d"/>
+      <w:bookmarkEnd w:id="11"/>
+      <w:r>
+        <w:t>Controlling for clutch order in within–between models</w:t>
+      </w:r>
+    </w:p>
+    <w:p>
+      <w:pPr>
+        <w:pStyle w:val="FirstParagraph"/>
+      </w:pPr>
+      <w:r>
+        <w:t>Because both egg number and egg size varied systematically across clutches, we tested whether clutch order explained the within-female association by including clutch as a fixed effect in the within–between model:</w:t>
+      </w:r>
+    </w:p>
+    <w:bookmarkStart w:id="18" w:name="eq-clutchorderwithinbetween"/>
+    <w:p>
+      <w:pPr>
+        <w:pStyle w:val="BodyText"/>
+      </w:pPr>
+      <m:oMathPara>
+        <m:oMathParaPr>
+          <m:jc m:val="center"/>
+        </m:oMathParaPr>
+        <m:oMath>
+          <m:sSub>
+            <m:sSubPr>
+              <m:ctrlPr>
+                <w:rPr>
+                  <w:rFonts w:ascii="Cambria Math" w:hAnsi="Cambria Math" w:cs="Times New Roman"/>
+                  <w:sz w:val="20"/>
+                  <w:szCs w:val="20"/>
+                </w:rPr>
+              </m:ctrlPr>
+            </m:sSubPr>
+            <m:e>
+              <m:r>
+                <m:rPr>
+                  <m:nor/>
+                </m:rPr>
+                <w:rPr>
+                  <w:rFonts w:cs="Times New Roman"/>
+                  <w:sz w:val="20"/>
+                  <w:szCs w:val="20"/>
+                </w:rPr>
+                <m:t>mean egg size</m:t>
+              </m:r>
+            </m:e>
+            <m:sub>
+              <m:r>
+                <w:rPr>
+                  <w:rFonts w:ascii="Cambria Math" w:hAnsi="Cambria Math" w:cs="Times New Roman"/>
+                  <w:sz w:val="20"/>
+                  <w:szCs w:val="20"/>
+                </w:rPr>
+                <m:t>ij</m:t>
+              </m:r>
+            </m:sub>
+          </m:sSub>
+          <m:r>
+            <m:rPr>
+              <m:sty m:val="p"/>
+            </m:rPr>
+            <w:rPr>
+              <w:rFonts w:ascii="Cambria Math" w:hAnsi="Cambria Math" w:cs="Times New Roman"/>
+              <w:sz w:val="20"/>
+              <w:szCs w:val="20"/>
+            </w:rPr>
+            <m:t>=</m:t>
+          </m:r>
+          <m:sSub>
+            <m:sSubPr>
+              <m:ctrlPr>
+                <w:rPr>
+                  <w:rFonts w:ascii="Cambria Math" w:hAnsi="Cambria Math" w:cs="Times New Roman"/>
+                  <w:sz w:val="20"/>
+                  <w:szCs w:val="20"/>
+                </w:rPr>
+              </m:ctrlPr>
+            </m:sSubPr>
+            <m:e>
+              <m:r>
+                <w:rPr>
+                  <w:rFonts w:ascii="Cambria Math" w:hAnsi="Cambria Math" w:cs="Times New Roman"/>
+                  <w:sz w:val="20"/>
+                  <w:szCs w:val="20"/>
+                </w:rPr>
+                <m:t>β</m:t>
+              </m:r>
+            </m:e>
+            <m:sub>
+              <m:r>
+                <w:rPr>
+                  <w:rFonts w:ascii="Cambria Math" w:hAnsi="Cambria Math" w:cs="Times New Roman"/>
+                  <w:sz w:val="20"/>
+                  <w:szCs w:val="20"/>
+                </w:rPr>
+                <m:t>0</m:t>
+              </m:r>
+            </m:sub>
+          </m:sSub>
+          <m:r>
+            <m:rPr>
+              <m:sty m:val="p"/>
+            </m:rPr>
+            <w:rPr>
+              <w:rFonts w:ascii="Cambria Math" w:hAnsi="Cambria Math" w:cs="Times New Roman"/>
+              <w:sz w:val="20"/>
+              <w:szCs w:val="20"/>
+            </w:rPr>
+            <m:t>+</m:t>
+          </m:r>
+          <m:sSub>
+            <m:sSubPr>
+              <m:ctrlPr>
+                <w:rPr>
+                  <w:rFonts w:ascii="Cambria Math" w:hAnsi="Cambria Math" w:cs="Times New Roman"/>
+                  <w:sz w:val="20"/>
+                  <w:szCs w:val="20"/>
+                </w:rPr>
+              </m:ctrlPr>
+            </m:sSubPr>
+            <m:e>
+              <m:r>
+                <w:rPr>
+                  <w:rFonts w:ascii="Cambria Math" w:hAnsi="Cambria Math" w:cs="Times New Roman"/>
+                  <w:sz w:val="20"/>
+                  <w:szCs w:val="20"/>
+                </w:rPr>
+                <m:t>β</m:t>
+              </m:r>
+            </m:e>
+            <m:sub>
+              <m:r>
+                <w:rPr>
+                  <w:rFonts w:ascii="Cambria Math" w:hAnsi="Cambria Math" w:cs="Times New Roman"/>
+                  <w:sz w:val="20"/>
+                  <w:szCs w:val="20"/>
+                </w:rPr>
+                <m:t>W</m:t>
+              </m:r>
+            </m:sub>
+          </m:sSub>
+          <m:r>
+            <w:rPr>
+              <w:rFonts w:ascii="Cambria Math" w:hAnsi="Cambria Math" w:cs="Times New Roman"/>
+              <w:sz w:val="20"/>
+              <w:szCs w:val="20"/>
+            </w:rPr>
+            <m:t> </m:t>
+          </m:r>
+          <m:sSub>
+            <m:sSubPr>
+              <m:ctrlPr>
+                <w:rPr>
+                  <w:rFonts w:ascii="Cambria Math" w:hAnsi="Cambria Math" w:cs="Times New Roman"/>
+                  <w:sz w:val="20"/>
+                  <w:szCs w:val="20"/>
+                </w:rPr>
+              </m:ctrlPr>
+            </m:sSubPr>
+            <m:e>
+              <m:r>
+                <m:rPr>
+                  <m:nor/>
+                </m:rPr>
+                <w:rPr>
+                  <w:rFonts w:cs="Times New Roman"/>
+                  <w:sz w:val="20"/>
+                  <w:szCs w:val="20"/>
+                </w:rPr>
+                <m:t>egg_number</m:t>
+              </m:r>
+            </m:e>
+            <m:sub>
+              <m:r>
+                <m:rPr>
+                  <m:nor/>
+                </m:rPr>
+                <w:rPr>
+                  <w:rFonts w:cs="Times New Roman"/>
+                  <w:sz w:val="20"/>
+                  <w:szCs w:val="20"/>
+                </w:rPr>
+                <m:t>within</m:t>
+              </m:r>
+              <m:r>
+                <m:rPr>
+                  <m:sty m:val="p"/>
+                </m:rPr>
+                <w:rPr>
+                  <w:rFonts w:ascii="Cambria Math" w:hAnsi="Cambria Math" w:cs="Times New Roman"/>
+                  <w:sz w:val="20"/>
+                  <w:szCs w:val="20"/>
+                </w:rPr>
+                <m:t>,</m:t>
+              </m:r>
+              <m:r>
+                <w:rPr>
+                  <w:rFonts w:ascii="Cambria Math" w:hAnsi="Cambria Math" w:cs="Times New Roman"/>
+                  <w:sz w:val="20"/>
+                  <w:szCs w:val="20"/>
+                </w:rPr>
+                <m:t>ij</m:t>
+              </m:r>
+            </m:sub>
+          </m:sSub>
+          <m:r>
+            <m:rPr>
+              <m:sty m:val="p"/>
+            </m:rPr>
+            <w:rPr>
+              <w:rFonts w:ascii="Cambria Math" w:hAnsi="Cambria Math" w:cs="Times New Roman"/>
+              <w:sz w:val="20"/>
+              <w:szCs w:val="20"/>
+            </w:rPr>
+            <m:t>+</m:t>
+          </m:r>
+          <m:sSub>
+            <m:sSubPr>
+              <m:ctrlPr>
+                <w:rPr>
+                  <w:rFonts w:ascii="Cambria Math" w:hAnsi="Cambria Math" w:cs="Times New Roman"/>
+                  <w:sz w:val="20"/>
+                  <w:szCs w:val="20"/>
+                </w:rPr>
+              </m:ctrlPr>
+            </m:sSubPr>
+            <m:e>
+              <m:r>
+                <w:rPr>
+                  <w:rFonts w:ascii="Cambria Math" w:hAnsi="Cambria Math" w:cs="Times New Roman"/>
+                  <w:sz w:val="20"/>
+                  <w:szCs w:val="20"/>
+                </w:rPr>
+                <m:t>β</m:t>
+              </m:r>
+            </m:e>
+            <m:sub>
+              <m:r>
+                <w:rPr>
+                  <w:rFonts w:ascii="Cambria Math" w:hAnsi="Cambria Math" w:cs="Times New Roman"/>
+                  <w:sz w:val="20"/>
+                  <w:szCs w:val="20"/>
+                </w:rPr>
+                <m:t>B</m:t>
+              </m:r>
+            </m:sub>
+          </m:sSub>
+          <m:r>
+            <w:rPr>
+              <w:rFonts w:ascii="Cambria Math" w:hAnsi="Cambria Math" w:cs="Times New Roman"/>
+              <w:sz w:val="20"/>
+              <w:szCs w:val="20"/>
+            </w:rPr>
+            <m:t> </m:t>
+          </m:r>
+          <m:sSub>
+            <m:sSubPr>
+              <m:ctrlPr>
+                <w:rPr>
+                  <w:rFonts w:ascii="Cambria Math" w:hAnsi="Cambria Math" w:cs="Times New Roman"/>
+                  <w:sz w:val="20"/>
+                  <w:szCs w:val="20"/>
+                </w:rPr>
+              </m:ctrlPr>
+            </m:sSubPr>
+            <m:e>
+              <m:r>
+                <m:rPr>
+                  <m:nor/>
+                </m:rPr>
+                <w:rPr>
+                  <w:rFonts w:cs="Times New Roman"/>
+                  <w:sz w:val="20"/>
+                  <w:szCs w:val="20"/>
+                </w:rPr>
+                <m:t>egg_number</m:t>
+              </m:r>
+            </m:e>
+            <m:sub>
+              <m:r>
+                <m:rPr>
+                  <m:nor/>
+                </m:rPr>
+                <w:rPr>
+                  <w:rFonts w:cs="Times New Roman"/>
+                  <w:sz w:val="20"/>
+                  <w:szCs w:val="20"/>
+                </w:rPr>
+                <m:t>between</m:t>
+              </m:r>
+              <m:r>
+                <m:rPr>
+                  <m:sty m:val="p"/>
+                </m:rPr>
+                <w:rPr>
+                  <w:rFonts w:ascii="Cambria Math" w:hAnsi="Cambria Math" w:cs="Times New Roman"/>
+                  <w:sz w:val="20"/>
+                  <w:szCs w:val="20"/>
+                </w:rPr>
+                <m:t>,</m:t>
+              </m:r>
+              <m:r>
+                <w:rPr>
+                  <w:rFonts w:ascii="Cambria Math" w:hAnsi="Cambria Math" w:cs="Times New Roman"/>
+                  <w:sz w:val="20"/>
+                  <w:szCs w:val="20"/>
+                </w:rPr>
+                <m:t>i</m:t>
+              </m:r>
+            </m:sub>
+          </m:sSub>
+          <m:r>
+            <m:rPr>
+              <m:sty m:val="p"/>
+            </m:rPr>
+            <w:rPr>
+              <w:rFonts w:ascii="Cambria Math" w:hAnsi="Cambria Math" w:cs="Times New Roman"/>
+              <w:sz w:val="20"/>
+              <w:szCs w:val="20"/>
+            </w:rPr>
+            <m:t>+</m:t>
+          </m:r>
+          <m:sSub>
+            <m:sSubPr>
+              <m:ctrlPr>
+                <w:rPr>
+                  <w:rFonts w:ascii="Cambria Math" w:hAnsi="Cambria Math" w:cs="Times New Roman"/>
+                  <w:sz w:val="20"/>
+                  <w:szCs w:val="20"/>
+                </w:rPr>
+              </m:ctrlPr>
+            </m:sSubPr>
+            <m:e>
+              <m:r>
+                <w:rPr>
+                  <w:rFonts w:ascii="Cambria Math" w:hAnsi="Cambria Math" w:cs="Times New Roman"/>
+                  <w:sz w:val="20"/>
+                  <w:szCs w:val="20"/>
+                </w:rPr>
+                <m:t>β</m:t>
+              </m:r>
+            </m:e>
+            <m:sub>
+              <m:r>
+                <m:rPr>
+                  <m:nor/>
+                </m:rPr>
+                <w:rPr>
+                  <w:rFonts w:cs="Times New Roman"/>
+                  <w:sz w:val="20"/>
+                  <w:szCs w:val="20"/>
+                </w:rPr>
+                <m:t>brood</m:t>
+              </m:r>
+            </m:sub>
+          </m:sSub>
+          <m:r>
+            <w:rPr>
+              <w:rFonts w:ascii="Cambria Math" w:hAnsi="Cambria Math" w:cs="Times New Roman"/>
+              <w:sz w:val="20"/>
+              <w:szCs w:val="20"/>
+            </w:rPr>
+            <m:t> </m:t>
+          </m:r>
+          <m:sSub>
+            <m:sSubPr>
+              <m:ctrlPr>
+                <w:rPr>
+                  <w:rFonts w:ascii="Cambria Math" w:hAnsi="Cambria Math" w:cs="Times New Roman"/>
+                  <w:sz w:val="20"/>
+                  <w:szCs w:val="20"/>
+                </w:rPr>
+              </m:ctrlPr>
+            </m:sSubPr>
+            <m:e>
+              <m:r>
+                <m:rPr>
+                  <m:nor/>
+                </m:rPr>
+                <w:rPr>
+                  <w:rFonts w:cs="Times New Roman"/>
+                  <w:sz w:val="20"/>
+                  <w:szCs w:val="20"/>
+                </w:rPr>
+                <m:t>brood</m:t>
+              </m:r>
+            </m:e>
+            <m:sub>
+              <m:r>
+                <w:rPr>
+                  <w:rFonts w:ascii="Cambria Math" w:hAnsi="Cambria Math" w:cs="Times New Roman"/>
+                  <w:sz w:val="20"/>
+                  <w:szCs w:val="20"/>
+                </w:rPr>
+                <m:t>ij</m:t>
+              </m:r>
+            </m:sub>
+          </m:sSub>
+          <m:r>
+            <m:rPr>
+              <m:sty m:val="p"/>
+            </m:rPr>
+            <w:rPr>
+              <w:rFonts w:ascii="Cambria Math" w:hAnsi="Cambria Math" w:cs="Times New Roman"/>
+              <w:sz w:val="20"/>
+              <w:szCs w:val="20"/>
+            </w:rPr>
+            <m:t>+</m:t>
+          </m:r>
+          <m:sSub>
+            <m:sSubPr>
+              <m:ctrlPr>
+                <w:rPr>
+                  <w:rFonts w:ascii="Cambria Math" w:hAnsi="Cambria Math" w:cs="Times New Roman"/>
+                  <w:sz w:val="20"/>
+                  <w:szCs w:val="20"/>
+                </w:rPr>
+              </m:ctrlPr>
+            </m:sSubPr>
+            <m:e>
+              <m:r>
+                <w:rPr>
+                  <w:rFonts w:ascii="Cambria Math" w:hAnsi="Cambria Math" w:cs="Times New Roman"/>
+                  <w:sz w:val="20"/>
+                  <w:szCs w:val="20"/>
+                </w:rPr>
+                <m:t>b</m:t>
+              </m:r>
+            </m:e>
+            <m:sub>
+              <m:r>
+                <w:rPr>
+                  <w:rFonts w:ascii="Cambria Math" w:hAnsi="Cambria Math" w:cs="Times New Roman"/>
+                  <w:sz w:val="20"/>
+                  <w:szCs w:val="20"/>
+                </w:rPr>
+                <m:t>0</m:t>
+              </m:r>
+              <m:r>
+                <w:rPr>
+                  <w:rFonts w:ascii="Cambria Math" w:hAnsi="Cambria Math" w:cs="Times New Roman"/>
+                  <w:sz w:val="20"/>
+                  <w:szCs w:val="20"/>
+                </w:rPr>
+                <m:t>i</m:t>
+              </m:r>
+            </m:sub>
+          </m:sSub>
+          <m:r>
+            <m:rPr>
+              <m:sty m:val="p"/>
+            </m:rPr>
+            <w:rPr>
+              <w:rFonts w:ascii="Cambria Math" w:hAnsi="Cambria Math" w:cs="Times New Roman"/>
+              <w:sz w:val="20"/>
+              <w:szCs w:val="20"/>
+            </w:rPr>
+            <m:t>+</m:t>
+          </m:r>
+          <m:sSub>
+            <m:sSubPr>
+              <m:ctrlPr>
+                <w:rPr>
+                  <w:rFonts w:ascii="Cambria Math" w:hAnsi="Cambria Math" w:cs="Times New Roman"/>
+                  <w:sz w:val="20"/>
+                  <w:szCs w:val="20"/>
+                </w:rPr>
+              </m:ctrlPr>
+            </m:sSubPr>
+            <m:e>
+              <m:r>
+                <w:rPr>
+                  <w:rFonts w:ascii="Cambria Math" w:hAnsi="Cambria Math" w:cs="Times New Roman"/>
+                  <w:sz w:val="20"/>
+                  <w:szCs w:val="20"/>
+                </w:rPr>
+                <m:t>ε</m:t>
+              </m:r>
+            </m:e>
+            <m:sub>
+              <m:r>
+                <w:rPr>
+                  <w:rFonts w:ascii="Cambria Math" w:hAnsi="Cambria Math" w:cs="Times New Roman"/>
+                  <w:sz w:val="20"/>
+                  <w:szCs w:val="20"/>
+                </w:rPr>
+                <m:t>ij</m:t>
+              </m:r>
+            </m:sub>
+          </m:sSub>
+          <m:r>
+            <w:rPr>
+              <w:rFonts w:ascii="Cambria Math" w:hAnsi="Cambria Math" w:cs="Times New Roman"/>
+              <w:sz w:val="20"/>
+              <w:szCs w:val="20"/>
+            </w:rPr>
+            <m:t>  </m:t>
+          </m:r>
+          <m:d>
+            <m:dPr>
+              <m:ctrlPr>
+                <w:rPr>
+                  <w:rFonts w:ascii="Cambria Math" w:hAnsi="Cambria Math" w:cs="Times New Roman"/>
+                  <w:sz w:val="20"/>
+                  <w:szCs w:val="20"/>
+                </w:rPr>
+              </m:ctrlPr>
+            </m:dPr>
+            <m:e>
+              <m:r>
+                <w:rPr>
+                  <w:rFonts w:ascii="Cambria Math" w:hAnsi="Cambria Math" w:cs="Times New Roman"/>
+                  <w:sz w:val="20"/>
+                  <w:szCs w:val="20"/>
+                </w:rPr>
+                <m:t>8</m:t>
+              </m:r>
+            </m:e>
+          </m:d>
+        </m:oMath>
+      </m:oMathPara>
+      <w:bookmarkEnd w:id="18"/>
+    </w:p>
+    <w:p>
+      <w:pPr>
+        <w:pStyle w:val="FirstParagraph"/>
+      </w:pPr>
+      <w:r>
+        <w:lastRenderedPageBreak/>
+        <w:t xml:space="preserve">This model evaluates whether the within-female slope persists after accounting for systematic clutch-related shifts in reproductive output. A reduction of </w:t>
+      </w:r>
+      <m:oMath>
+        <m:sSub>
+          <m:sSubPr>
+            <m:ctrlPr>
+              <w:rPr>
+                <w:rFonts w:ascii="Cambria Math" w:hAnsi="Cambria Math"/>
+              </w:rPr>
+            </m:ctrlPr>
+          </m:sSubPr>
+          <m:e>
+            <m:r>
+              <w:rPr>
+                <w:rFonts w:ascii="Cambria Math" w:hAnsi="Cambria Math"/>
+              </w:rPr>
+              <m:t>β</m:t>
+            </m:r>
+          </m:e>
+          <m:sub>
+            <m:r>
+              <w:rPr>
+                <w:rFonts w:ascii="Cambria Math" w:hAnsi="Cambria Math"/>
+              </w:rPr>
+              <m:t>W</m:t>
+            </m:r>
+          </m:sub>
+        </m:sSub>
+      </m:oMath>
+      <w:r>
+        <w:t xml:space="preserve"> toward zero indicates that any apparent within-female association was driven by parallel clutch-order changes rather than plastic allocation per se.</w:t>
+      </w:r>
+    </w:p>
+    <w:p>
+      <w:pPr>
+        <w:pStyle w:val="BodyText"/>
+      </w:pPr>
+      <w:r>
+        <w:t>Weakly informative priors were specified for all model parameters to regularize estimation while remaining minimally restrictive. All models were fitted using Markov chain Monte Carlo (MCMC) sampling with four independent chains and 4,000 iterations to ensure adequate posterior exploration. Convergence was evaluated using the potential scale reduction factor (</w:t>
       </w:r>
       <m:oMath>
         <m:acc>
@@ -3590,10 +4922,11 @@
       <w:pPr>
         <w:pStyle w:val="Heading1"/>
       </w:pPr>
-      <w:bookmarkStart w:id="10" w:name="results"/>
+      <w:bookmarkStart w:id="19" w:name="results"/>
       <w:bookmarkEnd w:id="2"/>
-      <w:bookmarkEnd w:id="9"/>
-      <w:r>
+      <w:bookmarkEnd w:id="17"/>
+      <w:r>
+        <w:lastRenderedPageBreak/>
         <w:t>Results</w:t>
       </w:r>
     </w:p>
@@ -3602,36 +4935,52 @@
         <w:pStyle w:val="FirstParagraph"/>
       </w:pPr>
       <w:r>
+        <w:t xml:space="preserve">Equation </w:t>
+      </w:r>
+      <w:hyperlink w:anchor="eq-clutchorder">
+        <w:r>
+          <w:rPr>
+            <w:rStyle w:val="Hyperlink"/>
+          </w:rPr>
+          <w:t>Equation 1</w:t>
+        </w:r>
+      </w:hyperlink>
+    </w:p>
+    <w:p>
+      <w:pPr>
+        <w:pStyle w:val="BodyText"/>
+      </w:pPr>
+      <w:r>
         <w:t>Results Effect of clutch order on egg size and number Both egg number and egg size declined in the second clutch. In the multivariate Gaussian–Poisson model, egg size was smaller in clutch two (x̄ ± SE = 3.41 ± 0.03) relative to clutch one (3.54 ± 0.03; β = −0.12, 95% CrI [−0.21, −0.04]). Egg number also declined substantially (clutch one: 51.55 ± 2.49; clutch two: 34.14 ± 2.65; log-scale β = −0.41, 95% CrI [−0.48, −0.34]), corresponding to an approximate 34% reduction on the natural scale (e^(−0.41) ≈ 0.66</w:t>
       </w:r>
       <w:r>
-        <w:t xml:space="preserve">). Among-female variation remained detectable </w:t>
+        <w:t xml:space="preserve">). Among-female variation remained detectable for both egg size (SD = 0.091, 95% CrI [0.009, 0.165]) and egg number (SD = 0.355, 95% CrI [0.273, 0.460]), indicating persistent heterogeneity among females across broods. Correlations between egg number and egg size Across all observations, the raw Pearson correlation between egg number and egg size was weak and close to zero (r_raw = −0.04, 95% CI [−0.25, 0.19]), suggesting no clear phenotypic association when hierarchical structure was ignored. In contrast, </w:t>
+      </w:r>
+      <w:r>
+        <w:t>the between-female Pearson correlation calculated from female means was moderate and negative (r_between = −0.31, 95% CI [−0.55, −0.02]). Females that produced more eggs on average tended to lay smaller eggs. The multivariate Gaussian model partitioned covariation into among-female and residual components. After accounting for female identity, the residual (within-female) correlation between egg number and egg size was effectively zero and highly uncertain (r_within = 0.0025, 95% CrI [−0.86, 0.85]). Thus, a</w:t>
+      </w:r>
+      <w:r>
+        <w:t xml:space="preserve">pparent phenotypic independence masked a moderate negative association among females but no detectable clutch-level trade-off within females. Within–between mixed-effects models In the within–between mixed-effects model, egg size varied among females (random-intercept SD = 0.07, 95% CrI [0.00, 0.14]). The </w:t>
       </w:r>
       <w:r>
         <w:lastRenderedPageBreak/>
-        <w:t xml:space="preserve">for both egg size (SD = 0.091, 95% CrI [0.009, 0.165]) and egg number (SD = 0.355, 95% CrI [0.273, 0.460]), indicating persistent heterogeneity among females across broods. Correlations between egg number and egg size Across all observations, the raw Pearson correlation between egg number and egg size was weak and close to zero (r_raw = −0.04, 95% CI [−0.25, 0.19]), suggesting no clear phenotypic association when hierarchical structure was ignored. In contrast, </w:t>
-      </w:r>
-      <w:r>
-        <w:t>the between-female Pearson correlation calculated from female means was moderate and negative (r_between = −0.31, 95% CI [−0.55, −0.02]). Females that produced more eggs on average tended to lay smaller eggs. The multivariate Gaussian model partitioned covariation into among-female and residual components. After accounting for female identity, the residual (within-female) correlation between egg number and egg size was effectively zero and highly uncertain (r_within = 0.0025, 95% CrI [−0.86, 0.85]). Thus, a</w:t>
-      </w:r>
-      <w:r>
-        <w:t>pparent phenotypic independence masked a moderate negative association among females but no detectable clutch-level trade-off within females. Within–between mixed-effects models In the within–between mixed-effects model, egg size varied among females (random-intercept SD = 0.07, 95% CrI [0.00, 0.14]). The within-female effect of egg number on egg size was small and uncertain (β_W = 0.0027, 95% CrI [−0.0006, 0.0057]). On the natural scale, this corresponds to an increase of approximately 0.027 units in egg s</w:t>
+        <w:t>within-female effect of egg number on egg size was small and uncertain (β_W = 0.0027, 95% CrI [−0.0006, 0.0057]). On the natural scale, this corresponds to an increase of approximately 0.027 units in egg s</w:t>
       </w:r>
       <w:r>
         <w:t>ize for every additional 10 eggs within a female—an effect that was not credibly different from zero. In contrast, the between-female effect was negative (β_B = −0.0038, 95% CrI [−0.0076, 0.0000]). Females differing by 10 eggs in mean clutch size differed by approximately 0.038 units in egg size. Although the credible interval extended to zero, the posterior distribution was predominantly negative, consistent with a modest among-female trade-off. Standardized coefficients reinforced the difference in magnit</w:t>
       </w:r>
       <w:r>
-        <w:t xml:space="preserve">ude between hierarchical levels. </w:t>
+        <w:t>ude between hierarchical levels. The standardized within-female effect was positive but uncertain (β_W,standardized = 0.17, 95% CrI [−0.04, 0.36]), whereas the standardized between-female effect was negative and its credible interval did not overlap zero (β_B,standardized = −0.23, 95% CrI [−0.452, −0.002]). Thus, the negative association was stronger and more consistent among females than within females. Allowing within-female slopes to vary among females produced similar fixed-effect estimates (β_W = 0.003</w:t>
+      </w:r>
+      <w:r>
+        <w:t>4, 95% CrI [−0.0004, 0.0076]; β_B = −0.0041, 95% CrI [−0.0082, −0.0002]). Variation in within-female slopes was small (SD = 0.0046, 95% CrI [0.0003, 0.0110]), and the intercept–slope correlation was highly uncertain (r = 0.20, 95% CrI [−0.67, 0.85]), indicating no strong evidence that females differed substantially in plastic allocation patterns. Because both egg number and egg size declined across clutches, clutch order was included as an additional fixed effect to test whether it explained the weak positi</w:t>
+      </w:r>
+      <w:r>
+        <w:t xml:space="preserve">ve within-female slope. When clutch order was accounted for, the within-female effect collapsed to zero (β_W = −0.0004, 95% CrI [−0.0045, 0.0035]). Thus, there was no evidence that females plastically traded egg number against egg size within clutches; the apparent association in the initial model was entirely explained by parallel </w:t>
       </w:r>
       <w:r>
         <w:lastRenderedPageBreak/>
-        <w:t>The standardized within-female effect was positive but uncertain (β_W,standardized = 0.17, 95% CrI [−0.04, 0.36]), whereas the standardized between-female effect was negative and its credible interval did not overlap zero (β_B,standardized = −0.23, 95% CrI [−0.452, −0.002]). Thus, the negative association was stronger and more consistent among females than within females. Allowing within-female slopes to vary among females produced similar fixed-effect estimates (β_W = 0.003</w:t>
-      </w:r>
-      <w:r>
-        <w:t>4, 95% CrI [−0.0004, 0.0076]; β_B = −0.0041, 95% CrI [−0.0082, −0.0002]). Variation in within-female slopes was small (SD = 0.0046, 95% CrI [0.0003, 0.0110]), and the intercept–slope correlation was highly uncertain (r = 0.20, 95% CrI [−0.67, 0.85]), indicating no strong evidence that females differed substantially in plastic allocation patterns. Because both egg number and egg size declined across clutches, clutch order was included as an additional fixed effect to test whether it explained the weak positi</w:t>
-      </w:r>
-      <w:r>
-        <w:t>ve within-female slope. When clutch order was accounted for, the within-female effect collapsed to zero (β_W = −0.0004, 95% CrI [−0.0045, 0.0035]). Thus, there was no evidence that females plastically traded egg number against egg size within clutches; the apparent association in the initial model was entirely explained by parallel declines from clutch one to clutch two. Summary Overall, egg size and egg number declined substantially between clutches. Persistent differences among females generated a moderat</w:t>
+        <w:t>declines from clutch one to clutch two. Summary Overall, egg size and egg number declined substantially between clutches. Persistent differences among females generated a moderat</w:t>
       </w:r>
       <w:r>
         <w:t>e negative association between mean egg size and number, whereas there was no evidence for a consistent within-female trade-off once clutch order was accounted for. These results indicate that apparent number–size trade-offs arise primarily from stable among-female differences rather than dynamic allocation decisions within females.</w:t>
@@ -3641,10 +4990,9 @@
       <w:pPr>
         <w:pStyle w:val="Heading1"/>
       </w:pPr>
-      <w:bookmarkStart w:id="11" w:name="X2adf980c3cdf557e751ed69a8410e917bd83bb9"/>
-      <w:bookmarkEnd w:id="10"/>
-      <w:r>
-        <w:lastRenderedPageBreak/>
+      <w:bookmarkStart w:id="20" w:name="X2adf980c3cdf557e751ed69a8410e917bd83bb9"/>
+      <w:bookmarkEnd w:id="19"/>
+      <w:r>
         <w:t>Effect of clutch order on egg size and number</w:t>
       </w:r>
     </w:p>
@@ -3828,8 +5176,8 @@
       <w:pPr>
         <w:pStyle w:val="Heading1"/>
       </w:pPr>
-      <w:bookmarkStart w:id="12" w:name="correlations"/>
-      <w:bookmarkEnd w:id="11"/>
+      <w:bookmarkStart w:id="21" w:name="correlations"/>
+      <w:bookmarkEnd w:id="20"/>
       <w:r>
         <w:t>Correlations</w:t>
       </w:r>
@@ -3899,7 +5247,11 @@
         </m:sSub>
       </m:oMath>
       <w:r>
-        <w:t xml:space="preserve"> = -0.31, 95% CI [-0.55, -0.02]). Females that produced more eggs on average tended to lay smaller eggs. The multivariate Gaussian model partitioned covariation into among-female and residual components. After accounting for female identity, the residual correlation between egg number and egg size was effectively zero and highly uncertain (</w:t>
+        <w:t xml:space="preserve"> = -0.31, 95% CI </w:t>
+      </w:r>
+      <w:r>
+        <w:lastRenderedPageBreak/>
+        <w:t>[-0.55, -0.02]). Females that produced more eggs on average tended to lay smaller eggs. The multivariate Gaussian model partitioned covariation into among-female and residual components. After accounting for female identity, the residual correlation between egg number and egg size was effectively zero and highly uncertain (</w:t>
       </w:r>
       <m:oMath>
         <m:sSub>
@@ -3948,10 +5300,9 @@
       <w:pPr>
         <w:pStyle w:val="Heading1"/>
       </w:pPr>
-      <w:bookmarkStart w:id="13" w:name="withinbetween-fixed-effects-models"/>
-      <w:bookmarkEnd w:id="12"/>
-      <w:r>
-        <w:lastRenderedPageBreak/>
+      <w:bookmarkStart w:id="22" w:name="withinbetween-fixed-effects-models"/>
+      <w:bookmarkEnd w:id="21"/>
+      <w:r>
         <w:t>Within–between fixed-effects models</w:t>
       </w:r>
     </w:p>
@@ -3960,7 +5311,7 @@
         <w:pStyle w:val="FirstParagraph"/>
       </w:pPr>
       <w:r>
-        <w:t>In the within–between mixed-effects model, egg size varied among females (random-intercept SD = 0.07, 95% CrI [0.00, 0.14]). The within-female effect of egg number on egg size was small and uncertain (</w:t>
+        <w:t>In the within–between mixed-effects model, egg size varied among females (random-intercept SD = 0.07, 95% CrI [0.00, 0.15]). The within-female effect of egg number on egg size was small and uncertain (</w:t>
       </w:r>
       <m:oMath>
         <m:sSub>
@@ -3990,7 +5341,7 @@
         </m:sSub>
       </m:oMath>
       <w:r>
-        <w:t xml:space="preserve"> = 0.0027, 95% CrI [-0.0006, 0.0057]). In contrast, the between-female effect was negative and its credible interval narrowly excluded zero (</w:t>
+        <w:t xml:space="preserve"> = 0.0028, 95% CrI [-0.0005, 0.0061]). In contrast, the between-female effect was negative and its credible interval narrowly excluded zero (</w:t>
       </w:r>
       <m:oMath>
         <m:sSub>
@@ -4020,7 +5371,7 @@
         </m:sSub>
       </m:oMath>
       <w:r>
-        <w:t xml:space="preserve"> = -0.0038, 95% CrI [-0.0076, 0.0000]). Allowing within-female slopes to vary among females produced similar fixed-effect estimates (</w:t>
+        <w:t xml:space="preserve"> = -0.0039, 95% CrI [-0.0076, -0.0001]). Allowing within-female slopes to vary among females produced similar fixed-effect estimates (</w:t>
       </w:r>
       <m:oMath>
         <m:sSub>
@@ -4128,7 +5479,7 @@
         </m:sSub>
       </m:oMath>
       <w:r>
-        <w:t xml:space="preserve"> = 0.17, 95% CrI [-0.04, 0.36]). The standardized between-female effect was negative and did not overlap zero (</w:t>
+        <w:t xml:space="preserve"> = 0.17, 95% CrI [-0.03, 0.38]). The standardized between-female effect was negative and did not overlap zero (</w:t>
       </w:r>
       <m:oMath>
         <m:sSub>
@@ -4158,7 +5509,7 @@
         </m:sSub>
       </m:oMath>
       <w:r>
-        <w:t xml:space="preserve"> = -0.23, 95% CrI [-0.452, -0.002]). Thus, the negative association was stronger and more consistent among females than within females, a finding that supports the between-female Pearson correlation.</w:t>
+        <w:t xml:space="preserve"> = -0.23, 95% CrI [-0.455, -0.006]). Thus, the negative association was stronger and more consistent among females than within females, a finding that supports the between-female Pearson correlation.</w:t>
       </w:r>
     </w:p>
     <w:p>
@@ -4166,6 +5517,7 @@
         <w:pStyle w:val="BodyText"/>
       </w:pPr>
       <w:r>
+        <w:lastRenderedPageBreak/>
         <w:t>Because both egg number and egg size declined across clutches, I evaluated whether clutch order explained the within-female association. When clutch-order was included as a fixed effect, the within-female slope collapsed to zero (</w:t>
       </w:r>
       <m:oMath>
@@ -4203,10 +5555,9 @@
       <w:pPr>
         <w:pStyle w:val="Heading1"/>
       </w:pPr>
-      <w:bookmarkStart w:id="14" w:name="discussion"/>
-      <w:bookmarkEnd w:id="13"/>
-      <w:r>
-        <w:lastRenderedPageBreak/>
+      <w:bookmarkStart w:id="23" w:name="discussion"/>
+      <w:bookmarkEnd w:id="22"/>
+      <w:r>
         <w:t>Discussion</w:t>
       </w:r>
     </w:p>
@@ -4228,7 +5579,11 @@
         <w:t>F. auricularia</w:t>
       </w:r>
       <w:r>
-        <w:t>, residual egg number and residual egg size (adjusted for female body mass) are negatively correlated at the phenotypic level. However, these findings must be treated with caution; they are based on pseudo-replicated data (both clutches for each female were pooled and treated as independent), a situation that can lead to Simpson’s Paradox (Simpson 1951) and spurious correlations because within-individual relationships are masked by among-individual variation. Indeed, I also observed a negative, albeit weake</w:t>
+        <w:t xml:space="preserve">, residual egg number and residual egg size (adjusted for female body mass) are negatively correlated at the phenotypic level. However, these findings must be treated with caution; they are based on pseudo-replicated data (both clutches for each female were pooled and treated as independent), a situation that can lead to Simpson’s Paradox (Simpson 1951) and spurious correlations because within-individual </w:t>
+      </w:r>
+      <w:r>
+        <w:lastRenderedPageBreak/>
+        <w:t>relationships are masked by among-individual variation. Indeed, I also observed a negative, albeit weake</w:t>
       </w:r>
       <w:r>
         <w:t>r, correlation at the phenotypic level. However, by partitioning the variance into its among- and within-individual components, I found that females do not make the predicted trade-off. Rather, I found evidence that egg number and size are positively correlated within females.</w:t>
@@ -4239,11 +5594,7 @@
         <w:pStyle w:val="BodyText"/>
       </w:pPr>
       <w:r>
-        <w:t xml:space="preserve">My study revealed that second clutches comprised, on average, fewer and smaller eggs than first clutches, which can be explained at both the proximate and ultimate levels of causation. My </w:t>
-      </w:r>
-      <w:r>
-        <w:lastRenderedPageBreak/>
-        <w:t xml:space="preserve">findings are consistent with those of another study on a Montreal population (Tourneur and Gingras 1992) and with one involving an Italian population (Koch and Meunier 2014). Tourneur and Gingras (1992) proximally attributed the fewer, smaller eggs in second clutches to ovarian structure and function in </w:t>
+        <w:t xml:space="preserve">My study revealed that second clutches comprised, on average, fewer and smaller eggs than first clutches, which can be explained at both the proximate and ultimate levels of causation. My findings are consistent with those of another study on a Montreal population (Tourneur and Gingras 1992) and with one involving an Italian population (Koch and Meunier 2014). Tourneur and Gingras (1992) proximally attributed the fewer, smaller eggs in second clutches to ovarian structure and function in </w:t>
       </w:r>
       <w:r>
         <w:rPr>
@@ -4253,13 +5604,13 @@
         <w:t>F. auricularia</w:t>
       </w:r>
       <w:r>
-        <w:t>. Specifically, they suggested that second clutches are smaller than first ones because some (or all) oviarioles become non-functional and thus produce no eggs after the first clutch. This redu</w:t>
-      </w:r>
-      <w:r>
-        <w:t>ction in ovariole number might explain the smaller second clutches that I observed here, but why did females not produce larger eggs and thus exhibit the expected number-size trade-off? One possibility is that females had a shallower resource pool from which to build eggs for the second clutch, for example, because they had less time to accumulate reproductive resources for the second clutch than for the first. Females in the wild presumably spent from mid-spring to mid-fall acquiring resources for reproduc</w:t>
-      </w:r>
-      <w:r>
-        <w:t>tion, while they had only about a month in the laboratory to do so for the second one. Hence, by partitioning their fewer resources equally to each functional ovariole during their second bout of oogenesis, females produced fewer and smaller eggs than in their first clutches. This proximate explanation assumes that females use a resource-allocation strategy for eggs that does not vary across their clutches.</w:t>
+        <w:t>. Specifically, they suggested that second clutches are smaller than first ones because some (or all) oviarioles become non-functional and thus produce no eggs after the first clutch. This reduction in ovariole number might explain the smaller second clutches that I observed here, but why did females not produce larger eggs and thus exhibit the expected number-size trade-off? One possibility is that females had a shallower resource pool from which to build eggs for the second clutch, for examp</w:t>
+      </w:r>
+      <w:r>
+        <w:t>le, because they had less time to accumulate reproductive resources for the second clutch than for the first. Females in the wild presumably spent from mid-spring to mid-fall acquiring resources for reproduction, while they had only about a month in the laboratory to do so for the second one. Hence, by partitioning their fewer resources equally to each functional ovariole during their second bout of oogenesis, females produced fewer and smaller eggs than in their first clutches. This proximate explanation a</w:t>
+      </w:r>
+      <w:r>
+        <w:t>ssumes that females use a resource-allocation strategy for eggs that does not vary across their clutches.</w:t>
       </w:r>
     </w:p>
     <w:p>
@@ -4267,6 +5618,7 @@
         <w:pStyle w:val="BodyText"/>
       </w:pPr>
       <w:r>
+        <w:lastRenderedPageBreak/>
         <w:t>Producing fewer but smaller eggs seems like a costly fitness decision since, in most animal taxa, larger eggs generally have a higher probability of hatching and producing larger offspring, which, in turn, have a higher probability of surviving to adulthood (e.g. birds: Williams 1994; amphibians: Ficetola and De Bernardi 2009; reptiles: Nelson et al. 2004; fish: Einum and Fleming 2000). Although this does not appear to be the typical case in insects (Church et al. 2019), larger eggs are more likely to hatch</w:t>
       </w:r>
       <w:r>
@@ -4280,11 +5632,7 @@
         <w:t>F. auricularia</w:t>
       </w:r>
       <w:r>
-        <w:t xml:space="preserve"> (Koch </w:t>
-      </w:r>
-      <w:r>
-        <w:lastRenderedPageBreak/>
-        <w:t xml:space="preserve">and Meunier 2014), so egg size appears to ultimately have some positive fitness effects for the mother and offspring in this species. Therefore, the smaller earwig eggs in the second clutch by female </w:t>
+        <w:t xml:space="preserve"> (Koch and Meunier 2014), so egg size appears to ultimately have some positive fitness effects for the mother and offspring in this species. Therefore, the smaller earwig eggs in the second clutch by female </w:t>
       </w:r>
       <w:r>
         <w:rPr>
@@ -4313,14 +5661,14 @@
         <w:t xml:space="preserve"> (Koch and Meunier 2014). This latter population, however, is from a more temperate locale than Montreal, which experiences a milder climate and thus perhaps less intense selection on reduced development time. I did not find the predicted positive among-female correlation between clutch and egg size. Rather, the weak negative among-individual correlation between clutch and egg size suggests that variance in resou</w:t>
       </w:r>
       <w:r>
-        <w:t>rce allocation may exceed variance in resource acquisition in this population of earwigs (see Careau and Wilson 2017). In other words, some female earwigs in my study population might prioritise investment in egg number versus egg size and vice versa. Taken together, my results resemble Careau and Wilson’s (2017) “sink or swim” scenario, which is generally reserved for performance trade-offs. That is, females in my population of earwigs might ultimately produce an among-female (albeit weak) trade-off due to</w:t>
-      </w:r>
-      <w:r>
-        <w:t xml:space="preserve"> differences among females in how they allocate resources to clutch and egg size, with some </w:t>
+        <w:t xml:space="preserve">rce allocation may exceed variance in </w:t>
       </w:r>
       <w:r>
         <w:lastRenderedPageBreak/>
-        <w:t>females prioritising egg number over size, while also producing a positive residual correlation due to a combination of ovary (dis)function, and the equal apportionment of fewer resources to eggs. Further research is needed to identify the proximate mechanisms underlying the observed multilevel correlation patterns.</w:t>
+        <w:t>resource acquisition in this population of earwigs (see Careau and Wilson 2017). In other words, some female earwigs in my study population might prioritise investment in egg number versus egg size and vice versa. Taken together, my results resemble Careau and Wilson’s (2017) “sink or swim” scenario, which is generally reserved for performance trade-offs. That is, females in my population of earwigs might ultimately produce an among-female (albeit weak) trade-off due to</w:t>
+      </w:r>
+      <w:r>
+        <w:t xml:space="preserve"> differences among females in how they allocate resources to clutch and egg size, with some females prioritising egg number over size, while also producing a positive residual correlation due to a combination of ovary (dis)function, and the equal apportionment of fewer resources to eggs. Further research is needed to identify the proximate mechanisms underlying the observed multilevel correlation patterns.</w:t>
       </w:r>
     </w:p>
     <w:p>
@@ -4376,7 +5724,11 @@
         <w:pStyle w:val="BodyText"/>
       </w:pPr>
       <w:r>
-        <w:t>In contrast, I found evidence that variation in egg size within a clutch was greater in second clutches than in first clutches, the opposite of the pattern observed in birds. (e.g., Yosef and Zduniak 2008). Empiricists have argued that lower variation in egg size within a clutch is probably linked to environmental factors and food availability. For example, desert finches (</w:t>
+        <w:t xml:space="preserve">In contrast, I found evidence that variation in egg size within a clutch was greater in second clutches than in first clutches, the opposite of the pattern observed in birds. (e.g., Yosef and </w:t>
+      </w:r>
+      <w:r>
+        <w:lastRenderedPageBreak/>
+        <w:t>Zduniak 2008). Empiricists have argued that lower variation in egg size within a clutch is probably linked to environmental factors and food availability. For example, desert finches (</w:t>
       </w:r>
       <w:r>
         <w:rPr>
@@ -4406,27 +5758,24 @@
         <w:t>Paris caeruleus</w:t>
       </w:r>
       <w:r>
-        <w:t xml:space="preserve">) in better nutritional condition had clutches with less variation in egg size (Nilsson and Svensson </w:t>
-      </w:r>
+        <w:t>) in better nutritional condition had clutc</w:t>
+      </w:r>
+      <w:r>
+        <w:t>hes with less variation in egg size (Nilsson and Svensson 1993). Although information on intraclutch egg-size variation and its proximal drivers is scarce in insects, the same principles may apply, given that female earwigs in my study had less time to accumulate resources and maximise their body condition before producing their second clutch. If true, then females might have allocated resources maximally to the eggs in their first clutch, following an individual allocation strategy based on intrinsic facto</w:t>
+      </w:r>
+      <w:r>
+        <w:t>rs such as body condition. This strategy would produce individual-specific egg sizes that are consistent across eggs within a clutch. In second clutches, by contrast, females might have allocated an optimal (but smaller) amount of resources to each oocyte until the last few oocytes, when they had fewer resources remaining and thus produced a few significantly smaller eggs. I did not record laying order in this study and therefore cannot assess whether larger eggs were laid first or last. Within-clutch varia</w:t>
+      </w:r>
+      <w:r>
+        <w:t>tion in egg size is adaptive in birds. For example, larger eggs later in the egg-laying sequence may be a brood-survival strategy that counteracts the effects of hatching asynchrony, whereas smaller eggs later in the laying sequence may be a brood-reduction strategy (Slagsvold et al. 1984). However, it is unknown whether variation in egg size has an equivalent adaptive function in insects expressing maternal care.</w:t>
+      </w:r>
+    </w:p>
+    <w:p>
+      <w:pPr>
+        <w:pStyle w:val="BodyText"/>
+      </w:pPr>
       <w:r>
         <w:lastRenderedPageBreak/>
-        <w:t>1993). Although information on intraclutch egg-size variation and its proximal drivers is scarce in insects, the same principl</w:t>
-      </w:r>
-      <w:r>
-        <w:t>es may apply, given that female earwigs in my study had less time to accumulate resources and maximise their body condition before producing their second clutch. If true, then females might have allocated resources maximally to the eggs in their first clutch, following an individual allocation strategy based on intrinsic factors such as body condition. This strategy would produce individual-specific egg sizes that are consistent across eggs within a clutch. In second clutches, by contrast, females might hav</w:t>
-      </w:r>
-      <w:r>
-        <w:t>e allocated an optimal (but smaller) amount of resources to each oocyte until the last few oocytes, when they had fewer resources remaining and thus produced a few significantly smaller eggs. I did not record laying order in this study and therefore cannot assess whether larger eggs were laid first or last. Within-clutch variation in egg size is adaptive in birds. For example, larger eggs later in the egg-laying sequence may be a brood-survival strategy that counteracts the effects of hatching asynchrony, w</w:t>
-      </w:r>
-      <w:r>
-        <w:t>hereas smaller eggs later in the laying sequence may be a brood-reduction strategy (Slagsvold et al. 1984). However, it is unknown whether variation in egg size has an equivalent adaptive function in insects expressing maternal care.</w:t>
-      </w:r>
-    </w:p>
-    <w:p>
-      <w:pPr>
-        <w:pStyle w:val="BodyText"/>
-      </w:pPr>
-      <w:r>
         <w:t>In conclusion, by partitioning variance into its among- and within-individual components, I found that female European earwigs do not trade off clutch and egg size. Instead, I found a positive correlation between egg number and size and some evidence for an among-female trade-off. I also discovered that second clutches consist of eggs with a more variable size than first clutches, but the among-female variation in average egg size was similar between the two clutches.</w:t>
       </w:r>
     </w:p>
@@ -4434,10 +5783,9 @@
       <w:pPr>
         <w:pStyle w:val="Heading1"/>
       </w:pPr>
-      <w:bookmarkStart w:id="15" w:name="data-availability"/>
-      <w:bookmarkEnd w:id="14"/>
-      <w:r>
-        <w:lastRenderedPageBreak/>
+      <w:bookmarkStart w:id="24" w:name="data-availability"/>
+      <w:bookmarkEnd w:id="23"/>
+      <w:r>
         <w:t>Data availability</w:t>
       </w:r>
     </w:p>
@@ -4453,8 +5801,8 @@
       <w:pPr>
         <w:pStyle w:val="Heading1"/>
       </w:pPr>
-      <w:bookmarkStart w:id="16" w:name="author-contributions"/>
-      <w:bookmarkEnd w:id="15"/>
+      <w:bookmarkStart w:id="25" w:name="author-contributions"/>
+      <w:bookmarkEnd w:id="24"/>
       <w:r>
         <w:t>Author contributions</w:t>
       </w:r>
@@ -4471,8 +5819,8 @@
       <w:pPr>
         <w:pStyle w:val="Heading1"/>
       </w:pPr>
-      <w:bookmarkStart w:id="17" w:name="funding"/>
-      <w:bookmarkEnd w:id="16"/>
+      <w:bookmarkStart w:id="26" w:name="funding"/>
+      <w:bookmarkEnd w:id="25"/>
       <w:r>
         <w:t>Funding</w:t>
       </w:r>
@@ -4489,8 +5837,8 @@
       <w:pPr>
         <w:pStyle w:val="Heading1"/>
       </w:pPr>
-      <w:bookmarkStart w:id="18" w:name="conflict-of-interest"/>
-      <w:bookmarkEnd w:id="17"/>
+      <w:bookmarkStart w:id="27" w:name="conflict-of-interest"/>
+      <w:bookmarkEnd w:id="26"/>
       <w:r>
         <w:t>Conflict of Interest</w:t>
       </w:r>
@@ -4507,8 +5855,8 @@
       <w:pPr>
         <w:pStyle w:val="Heading1"/>
       </w:pPr>
-      <w:bookmarkStart w:id="19" w:name="acknowledgements"/>
-      <w:bookmarkEnd w:id="18"/>
+      <w:bookmarkStart w:id="28" w:name="acknowledgements"/>
+      <w:bookmarkEnd w:id="27"/>
       <w:r>
         <w:t>Acknowledgements</w:t>
       </w:r>
@@ -4530,8 +5878,8 @@
       <w:pPr>
         <w:pStyle w:val="Heading1"/>
       </w:pPr>
-      <w:bookmarkStart w:id="20" w:name="references"/>
-      <w:bookmarkEnd w:id="19"/>
+      <w:bookmarkStart w:id="29" w:name="references"/>
+      <w:bookmarkEnd w:id="28"/>
       <w:r>
         <w:lastRenderedPageBreak/>
         <w:t>References</w:t>
@@ -4541,8 +5889,8 @@
       <w:pPr>
         <w:pStyle w:val="Bibliography"/>
       </w:pPr>
-      <w:bookmarkStart w:id="21" w:name="ref-bernardo1996"/>
-      <w:bookmarkStart w:id="22" w:name="refs"/>
+      <w:bookmarkStart w:id="30" w:name="ref-bernardo1996"/>
+      <w:bookmarkStart w:id="31" w:name="refs"/>
       <w:r>
         <w:t>Bernardo, J. 1996. The particular maternal effect of propagule size, especially egg size: Patterns, models, quality of evidence and interpretations. Am Zool 36:216–236.</w:t>
       </w:r>
@@ -4551,8 +5899,8 @@
       <w:pPr>
         <w:pStyle w:val="Bibliography"/>
       </w:pPr>
-      <w:bookmarkStart w:id="23" w:name="ref-boos2014"/>
-      <w:bookmarkEnd w:id="21"/>
+      <w:bookmarkStart w:id="32" w:name="ref-boos2014"/>
+      <w:bookmarkEnd w:id="30"/>
       <w:r>
         <w:t>Boos, S., J. Meunier, S. Pichon, and M. Kölliker. 2014. Maternal care provides antifungal protection to eggs in the european earwig. Behav Ecol 25:754–761.</w:t>
       </w:r>
@@ -4561,8 +5909,8 @@
       <w:pPr>
         <w:pStyle w:val="Bibliography"/>
       </w:pPr>
-      <w:bookmarkStart w:id="24" w:name="ref-careau2017"/>
-      <w:bookmarkEnd w:id="23"/>
+      <w:bookmarkStart w:id="33" w:name="ref-careau2017"/>
+      <w:bookmarkEnd w:id="32"/>
       <w:r>
         <w:t>Careau, V., and R. Wilson. 2017. Of uberfleas and krakens: Detecting trade-offs using mixed models. Integr Comp Biol 57:362–371.</w:t>
       </w:r>
@@ -4571,8 +5919,8 @@
       <w:pPr>
         <w:pStyle w:val="Bibliography"/>
       </w:pPr>
-      <w:bookmarkStart w:id="25" w:name="ref-cavaleiro2014"/>
-      <w:bookmarkEnd w:id="24"/>
+      <w:bookmarkStart w:id="34" w:name="ref-cavaleiro2014"/>
+      <w:bookmarkEnd w:id="33"/>
       <w:r>
         <w:t>Cavaleiro, F. I., and M. J. Santos. 2014. Egg number-egg size: An important trade-off in parasite life history strategies. Int J Parasitol 44:173–182.</w:t>
       </w:r>
@@ -4581,8 +5929,8 @@
       <w:pPr>
         <w:pStyle w:val="Bibliography"/>
       </w:pPr>
-      <w:bookmarkStart w:id="26" w:name="ref-church2019"/>
-      <w:bookmarkEnd w:id="25"/>
+      <w:bookmarkStart w:id="35" w:name="ref-church2019"/>
+      <w:bookmarkEnd w:id="34"/>
       <w:r>
         <w:t>Church, S. H., S. Donoughe, B. A. S. de Medeiros, and C. G. Extavour. 2019. Insect egg size and shape evolve with ecology but not developmental rate. Nature 571:58–62.</w:t>
       </w:r>
@@ -4591,8 +5939,8 @@
       <w:pPr>
         <w:pStyle w:val="Bibliography"/>
       </w:pPr>
-      <w:bookmarkStart w:id="27" w:name="ref-clutton-brock1984"/>
-      <w:bookmarkEnd w:id="26"/>
+      <w:bookmarkStart w:id="36" w:name="ref-clutton-brock1984"/>
+      <w:bookmarkEnd w:id="35"/>
       <w:r>
         <w:t>Clutton-Brock, T. H. 1984. Reproductive effort and terminal investment in iteroparous animals. Am Nat 123:212–229.</w:t>
       </w:r>
@@ -4601,8 +5949,8 @@
       <w:pPr>
         <w:pStyle w:val="Bibliography"/>
       </w:pPr>
-      <w:bookmarkStart w:id="28" w:name="ref-clutton-brock1991"/>
-      <w:bookmarkEnd w:id="27"/>
+      <w:bookmarkStart w:id="37" w:name="ref-clutton-brock1991"/>
+      <w:bookmarkEnd w:id="36"/>
       <w:r>
         <w:t>Clutton-Brock, T. H. 1991. The Evolution of Parental Care. Princeton University Press.</w:t>
       </w:r>
@@ -4611,8 +5959,8 @@
       <w:pPr>
         <w:pStyle w:val="Bibliography"/>
       </w:pPr>
-      <w:bookmarkStart w:id="29" w:name="ref-einum2000"/>
-      <w:bookmarkEnd w:id="28"/>
+      <w:bookmarkStart w:id="38" w:name="ref-einum2000"/>
+      <w:bookmarkEnd w:id="37"/>
       <w:r>
         <w:t>Einum, S., and I. A. Fleming. 2000. Highly fecund mothers sacrifice offspring survival to maximize fitness. Nature 405:565–567.</w:t>
       </w:r>
@@ -4621,8 +5969,8 @@
       <w:pPr>
         <w:pStyle w:val="Bibliography"/>
       </w:pPr>
-      <w:bookmarkStart w:id="30" w:name="ref-falconer1996"/>
-      <w:bookmarkEnd w:id="29"/>
+      <w:bookmarkStart w:id="39" w:name="ref-falconer1996"/>
+      <w:bookmarkEnd w:id="38"/>
       <w:r>
         <w:t>Falconer, D. S., and T. F. C. MacKay. 1996. An Introduction Quantitative Genetics. Pearson Education Limited, Essex, England.</w:t>
       </w:r>
@@ -4631,8 +5979,8 @@
       <w:pPr>
         <w:pStyle w:val="Bibliography"/>
       </w:pPr>
-      <w:bookmarkStart w:id="31" w:name="ref-ficetola2009"/>
-      <w:bookmarkEnd w:id="30"/>
+      <w:bookmarkStart w:id="40" w:name="ref-ficetola2009"/>
+      <w:bookmarkEnd w:id="39"/>
       <w:r>
         <w:t>Ficetola, G. F., and F. De Bernardi. 2009. Offspring size and survival in the frog rana latastei: From among-population to within-clutch variation. Biol J Linn Soc 97:845–853.</w:t>
       </w:r>
@@ -4641,8 +5989,8 @@
       <w:pPr>
         <w:pStyle w:val="Bibliography"/>
       </w:pPr>
-      <w:bookmarkStart w:id="32" w:name="ref-fox2000"/>
-      <w:bookmarkEnd w:id="31"/>
+      <w:bookmarkStart w:id="41" w:name="ref-fox2000"/>
+      <w:bookmarkEnd w:id="40"/>
       <w:r>
         <w:t>Fox, C. W., and M. E. Czesak. 2000. Evolutionary ecology of progeny size in arthropods. Annu Rev Entomol 45:341–369.</w:t>
       </w:r>
@@ -4651,8 +5999,8 @@
       <w:pPr>
         <w:pStyle w:val="Bibliography"/>
       </w:pPr>
-      <w:bookmarkStart w:id="33" w:name="ref-hargitai2005"/>
-      <w:bookmarkEnd w:id="32"/>
+      <w:bookmarkStart w:id="42" w:name="ref-hargitai2005"/>
+      <w:bookmarkEnd w:id="41"/>
       <w:r>
         <w:t>Hargitai, R., J. Török, L. Tóth, G. Hegyi, B. Rosivall, B. Szigeti, and E. Szöllősi. 2005. Effects of environmental conditions and parental quality on inter-and intraclutch egg-size variation in the collared flycatcher (ficedula albicollis). The Auk 122:509–522.</w:t>
       </w:r>
@@ -4661,8 +6009,8 @@
       <w:pPr>
         <w:pStyle w:val="Bibliography"/>
       </w:pPr>
-      <w:bookmarkStart w:id="34" w:name="ref-harvey1983"/>
-      <w:bookmarkEnd w:id="33"/>
+      <w:bookmarkStart w:id="43" w:name="ref-harvey1983"/>
+      <w:bookmarkEnd w:id="42"/>
       <w:r>
         <w:t>Harvey, G. T. 1983. Environmental and genetic effects on mean egg weight in spruce budworm (lepidoptera: tortricidae). The Canadian Entomologist 115:1109–1117.</w:t>
       </w:r>
@@ -4671,8 +6019,8 @@
       <w:pPr>
         <w:pStyle w:val="Bibliography"/>
       </w:pPr>
-      <w:bookmarkStart w:id="35" w:name="ref-kelly2014"/>
-      <w:bookmarkEnd w:id="34"/>
+      <w:bookmarkStart w:id="44" w:name="ref-kelly2014"/>
+      <w:bookmarkEnd w:id="43"/>
       <w:r>
         <w:t>Kelly, C. D., B. Tawes, and A. Worthington. 2014. Evaluating indices of body condition in two cricket species. Ecology and Evolution 4:4476–4487.</w:t>
       </w:r>
@@ -4681,8 +6029,8 @@
       <w:pPr>
         <w:pStyle w:val="Bibliography"/>
       </w:pPr>
-      <w:bookmarkStart w:id="36" w:name="ref-koch2014"/>
-      <w:bookmarkEnd w:id="35"/>
+      <w:bookmarkStart w:id="45" w:name="ref-koch2014"/>
+      <w:bookmarkEnd w:id="44"/>
       <w:r>
         <w:t>Koch, L. K., and J. Meunier. 2014. Mother and offspring fitness in an insect with maternal care: Phenotypic trade-offs between egg number, egg mass and egg care. BMC Evol Biol 14:125.</w:t>
       </w:r>
@@ -4691,8 +6039,8 @@
       <w:pPr>
         <w:pStyle w:val="Bibliography"/>
       </w:pPr>
-      <w:bookmarkStart w:id="37" w:name="ref-kolliker2007"/>
-      <w:bookmarkEnd w:id="36"/>
+      <w:bookmarkStart w:id="46" w:name="ref-kolliker2007"/>
+      <w:bookmarkEnd w:id="45"/>
       <w:r>
         <w:lastRenderedPageBreak/>
         <w:t>Kölliker, M. 2007. Benefits and costs of earwig (forficula auricularia) family life. Behav Ecol Sociobiol 61:1489–1497.</w:t>
@@ -4702,8 +6050,8 @@
       <w:pPr>
         <w:pStyle w:val="Bibliography"/>
       </w:pPr>
-      <w:bookmarkStart w:id="38" w:name="ref-meunier2024"/>
-      <w:bookmarkEnd w:id="37"/>
+      <w:bookmarkStart w:id="47" w:name="ref-meunier2024"/>
+      <w:bookmarkEnd w:id="46"/>
       <w:r>
         <w:t>Meunier, J. 2024. The biology and social life of earwigs (dermaptera). Annu Rev Entomol 69:259–276.</w:t>
       </w:r>
@@ -4712,8 +6060,8 @@
       <w:pPr>
         <w:pStyle w:val="Bibliography"/>
       </w:pPr>
-      <w:bookmarkStart w:id="39" w:name="ref-nelson2004"/>
-      <w:bookmarkEnd w:id="38"/>
+      <w:bookmarkStart w:id="48" w:name="ref-nelson2004"/>
+      <w:bookmarkEnd w:id="47"/>
       <w:r>
         <w:t>Nelson, N. J., M. B. Thompson, S. Pledger, S. N. Keall, and C. H. Daugherty. 2004. Egg mass determines hatchling size, and incubation temperature influences post‐hatching growth, of tuatara sphenodon punctatus. J Zool 263:77–87.</w:t>
       </w:r>
@@ -4722,8 +6070,8 @@
       <w:pPr>
         <w:pStyle w:val="Bibliography"/>
       </w:pPr>
-      <w:bookmarkStart w:id="40" w:name="ref-nilsson1993"/>
-      <w:bookmarkEnd w:id="39"/>
+      <w:bookmarkStart w:id="49" w:name="ref-nilsson1993"/>
+      <w:bookmarkEnd w:id="48"/>
       <w:r>
         <w:t>Nilsson, J. ‐Å., and E. Svensson. 1993. Causes and consequences of egg mass variation between and within blue tit clutches. J Zool 230:469–481.</w:t>
       </w:r>
@@ -4732,8 +6080,8 @@
       <w:pPr>
         <w:pStyle w:val="Bibliography"/>
       </w:pPr>
-      <w:bookmarkStart w:id="41" w:name="ref-parker1982"/>
-      <w:bookmarkEnd w:id="40"/>
+      <w:bookmarkStart w:id="50" w:name="ref-parker1982"/>
+      <w:bookmarkEnd w:id="49"/>
       <w:r>
         <w:t>Parker, G. A. 1982. Why are there so many tiny sperm? Sperm competition and the maintenance of two sexes. J Theor Biol 96:281–294.</w:t>
       </w:r>
@@ -4742,8 +6090,8 @@
       <w:pPr>
         <w:pStyle w:val="Bibliography"/>
       </w:pPr>
-      <w:bookmarkStart w:id="42" w:name="ref-peig2009"/>
-      <w:bookmarkEnd w:id="41"/>
+      <w:bookmarkStart w:id="51" w:name="ref-peig2009"/>
+      <w:bookmarkEnd w:id="50"/>
       <w:r>
         <w:t>Peig, J., and A. J. Green. 2009. New perspectives for estimating body condition from mass/length data: The scaled mass index as an alternative method. Oikos 118:1883–1891.</w:t>
       </w:r>
@@ -4752,8 +6100,8 @@
       <w:pPr>
         <w:pStyle w:val="Bibliography"/>
       </w:pPr>
-      <w:bookmarkStart w:id="43" w:name="ref-peig2010"/>
-      <w:bookmarkEnd w:id="42"/>
+      <w:bookmarkStart w:id="52" w:name="ref-peig2010"/>
+      <w:bookmarkEnd w:id="51"/>
       <w:r>
         <w:t>Peig, J., and A. J. Green. 2010. The paradigm of body condition: A critical reappraisal of current methods based on mass and length. Funct Ecol 24:1323–1332.</w:t>
       </w:r>
@@ -4762,8 +6110,8 @@
       <w:pPr>
         <w:pStyle w:val="Bibliography"/>
       </w:pPr>
-      <w:bookmarkStart w:id="44" w:name="ref-r2013"/>
-      <w:bookmarkEnd w:id="43"/>
+      <w:bookmarkStart w:id="53" w:name="ref-r2013"/>
+      <w:bookmarkEnd w:id="52"/>
       <w:r>
         <w:t>R Core Team. 2025. R: A language and environment for statistical computing. Vienna, Austria.</w:t>
       </w:r>
@@ -4772,8 +6120,8 @@
       <w:pPr>
         <w:pStyle w:val="Bibliography"/>
       </w:pPr>
-      <w:bookmarkStart w:id="45" w:name="ref-reznick2000"/>
-      <w:bookmarkEnd w:id="44"/>
+      <w:bookmarkStart w:id="54" w:name="ref-reznick2000"/>
+      <w:bookmarkEnd w:id="53"/>
       <w:r>
         <w:t>Reznick, D., L. Nunney, and A. Tessier. 2000. Big houses, big cars, superfleas and the costs of reproduction. Trends Ecol Evol 15:421–425.</w:t>
       </w:r>
@@ -4782,8 +6130,8 @@
       <w:pPr>
         <w:pStyle w:val="Bibliography"/>
       </w:pPr>
-      <w:bookmarkStart w:id="46" w:name="ref-roff1992a"/>
-      <w:bookmarkEnd w:id="45"/>
+      <w:bookmarkStart w:id="55" w:name="ref-roff1992a"/>
+      <w:bookmarkEnd w:id="54"/>
       <w:r>
         <w:t>Roff, D. 1992. Evolution of Life Histories: Theory and Analysis. Chapman &amp; Hall, Inc., New York, NY.</w:t>
       </w:r>
@@ -4792,8 +6140,8 @@
       <w:pPr>
         <w:pStyle w:val="Bibliography"/>
       </w:pPr>
-      <w:bookmarkStart w:id="47" w:name="ref-schindelin2012"/>
-      <w:bookmarkEnd w:id="46"/>
+      <w:bookmarkStart w:id="56" w:name="ref-schindelin2012"/>
+      <w:bookmarkEnd w:id="55"/>
       <w:r>
         <w:t>Schindelin, J., I. Arganda-Carreras, E. Frise, V. Kaynig, M. Longair, T. Pietzsch, S. Preibisch, C. Rueden, S. Saalfeld, B. Schmid, J.-Y. Tinevez, D. J. White, V. Hartenstein, K. Eliceiri, P. Tomancak, and A. Cardona. 2012. Fiji: An open-source platform for biological-image analysis. Nat Methods 9:676–682. Max Planck Institute of Molecular Cell Biology; Genetics, Dresden, Germany.</w:t>
       </w:r>
@@ -4802,8 +6150,8 @@
       <w:pPr>
         <w:pStyle w:val="Bibliography"/>
       </w:pPr>
-      <w:bookmarkStart w:id="48" w:name="ref-seko2006"/>
-      <w:bookmarkEnd w:id="47"/>
+      <w:bookmarkStart w:id="57" w:name="ref-seko2006"/>
+      <w:bookmarkEnd w:id="56"/>
       <w:r>
         <w:t>Seko, T., T. Miyatake, S. Fujioka, and F. Nakasuji. 2006. Genetic and environmental sources of egg size, fecundity and body size in the migrant skipper, parnara guttata guttata (lepidoptera: hesperiidae). Popul Ecol 48:225–232.</w:t>
       </w:r>
@@ -4812,8 +6160,8 @@
       <w:pPr>
         <w:pStyle w:val="Bibliography"/>
       </w:pPr>
-      <w:bookmarkStart w:id="49" w:name="ref-shine1978"/>
-      <w:bookmarkEnd w:id="48"/>
+      <w:bookmarkStart w:id="58" w:name="ref-shine1978"/>
+      <w:bookmarkEnd w:id="57"/>
       <w:r>
         <w:t>Shine, R. 1978. Propagule size and parental care: The “safe harbor” hypothesis. J Theor Biol 75:417–424.</w:t>
       </w:r>
@@ -4822,8 +6170,8 @@
       <w:pPr>
         <w:pStyle w:val="Bibliography"/>
       </w:pPr>
-      <w:bookmarkStart w:id="50" w:name="ref-simpson1951"/>
-      <w:bookmarkEnd w:id="49"/>
+      <w:bookmarkStart w:id="59" w:name="ref-simpson1951"/>
+      <w:bookmarkEnd w:id="58"/>
       <w:r>
         <w:t>Simpson, E. H. 1951. The interpretation of interaction in contingency tables. Journal of the Royal Statistical Society: Series B (Methodological) 13:238–241.</w:t>
       </w:r>
@@ -4832,8 +6180,8 @@
       <w:pPr>
         <w:pStyle w:val="Bibliography"/>
       </w:pPr>
-      <w:bookmarkStart w:id="51" w:name="ref-slagsvold1984"/>
-      <w:bookmarkEnd w:id="50"/>
+      <w:bookmarkStart w:id="60" w:name="ref-slagsvold1984"/>
+      <w:bookmarkEnd w:id="59"/>
       <w:r>
         <w:lastRenderedPageBreak/>
         <w:t>Slagsvold, T., J. Sandvik, G. Rofstad, Ö. Lorentsen, and M. Husby. 1984. On the adaptive value of intraclutch egg-size variation in birds. The Auk 101:685–697.</w:t>
@@ -4843,8 +6191,8 @@
       <w:pPr>
         <w:pStyle w:val="Bibliography"/>
       </w:pPr>
-      <w:bookmarkStart w:id="52" w:name="ref-smith1974"/>
-      <w:bookmarkEnd w:id="51"/>
+      <w:bookmarkStart w:id="61" w:name="ref-smith1974"/>
+      <w:bookmarkEnd w:id="60"/>
       <w:r>
         <w:t>Smith, C. C., and S. D. Fretwell. 1974. The optimal balance between size and number of offspring. Am Nat 108:499–506.</w:t>
       </w:r>
@@ -4853,8 +6201,8 @@
       <w:pPr>
         <w:pStyle w:val="Bibliography"/>
       </w:pPr>
-      <w:bookmarkStart w:id="53" w:name="ref-staerkle2008"/>
-      <w:bookmarkEnd w:id="52"/>
+      <w:bookmarkStart w:id="62" w:name="ref-staerkle2008"/>
+      <w:bookmarkEnd w:id="61"/>
       <w:r>
         <w:t>Staerkle, M., and M. Kölliker. 2008. Maternal food regurgitation to nymphs in earwigs (</w:t>
       </w:r>
@@ -4873,8 +6221,8 @@
       <w:pPr>
         <w:pStyle w:val="Bibliography"/>
       </w:pPr>
-      <w:bookmarkStart w:id="54" w:name="ref-stearns1992"/>
-      <w:bookmarkEnd w:id="53"/>
+      <w:bookmarkStart w:id="63" w:name="ref-stearns1992"/>
+      <w:bookmarkEnd w:id="62"/>
       <w:r>
         <w:t>Stearns, S. C. 1992. The Evolution of Life Histories. Oxford University Press.</w:t>
       </w:r>
@@ -4883,8 +6231,8 @@
       <w:pPr>
         <w:pStyle w:val="Bibliography"/>
       </w:pPr>
-      <w:bookmarkStart w:id="55" w:name="ref-stoffel2017"/>
-      <w:bookmarkEnd w:id="54"/>
+      <w:bookmarkStart w:id="64" w:name="ref-stoffel2017"/>
+      <w:bookmarkEnd w:id="63"/>
       <w:r>
         <w:t>Stoffel, M. A., S. Nakagawa, and H. Schielzeth. 2017. RptR: Repeatability estimation and variance decomposition by generalized linear mixed‐effects models. Methods Ecol Evol 8:1639–1644.</w:t>
       </w:r>
@@ -4893,8 +6241,8 @@
       <w:pPr>
         <w:pStyle w:val="Bibliography"/>
       </w:pPr>
-      <w:bookmarkStart w:id="56" w:name="ref-torres-vila2012"/>
-      <w:bookmarkEnd w:id="55"/>
+      <w:bookmarkStart w:id="65" w:name="ref-torres-vila2012"/>
+      <w:bookmarkEnd w:id="64"/>
       <w:r>
         <w:t xml:space="preserve">Torres-Vila, L., E. Cruces-Caldera, M. Rodrı́guez-Molina, and L. Cauterruccio. 2012. Host plant selects for egg size in the moth lobesia botrana: Integrating reproductive and ecological trade-offs is not a simple matter. Pp. 145–167 </w:t>
       </w:r>
@@ -4913,8 +6261,8 @@
       <w:pPr>
         <w:pStyle w:val="Bibliography"/>
       </w:pPr>
-      <w:bookmarkStart w:id="57" w:name="ref-tourneur2018"/>
-      <w:bookmarkEnd w:id="56"/>
+      <w:bookmarkStart w:id="66" w:name="ref-tourneur2018"/>
+      <w:bookmarkEnd w:id="65"/>
       <w:r>
         <w:t xml:space="preserve">Tourneur, J.-C. 2018. Factors affecting the egg-laying pattern of </w:t>
       </w:r>
@@ -4933,8 +6281,8 @@
       <w:pPr>
         <w:pStyle w:val="Bibliography"/>
       </w:pPr>
-      <w:bookmarkStart w:id="58" w:name="ref-tourneur1992"/>
-      <w:bookmarkEnd w:id="57"/>
+      <w:bookmarkStart w:id="67" w:name="ref-tourneur1992"/>
+      <w:bookmarkEnd w:id="66"/>
       <w:r>
         <w:t xml:space="preserve">Tourneur, J.-C., and J. Gingras. 1992. Egg laying in a northeastern North American (montréal, québec) population of </w:t>
       </w:r>
@@ -4953,8 +6301,8 @@
       <w:pPr>
         <w:pStyle w:val="Bibliography"/>
       </w:pPr>
-      <w:bookmarkStart w:id="59" w:name="ref-vannoordwijk1986"/>
-      <w:bookmarkEnd w:id="58"/>
+      <w:bookmarkStart w:id="68" w:name="ref-vannoordwijk1986"/>
+      <w:bookmarkEnd w:id="67"/>
       <w:r>
         <w:t>Van Noordwijk, A. J., and G. de Jong. 1986. Acquisition and allocation of resources: Their influence on variation in life history tactics. Am Nat 128:137–142.</w:t>
       </w:r>
@@ -4963,8 +6311,8 @@
       <w:pPr>
         <w:pStyle w:val="Bibliography"/>
       </w:pPr>
-      <w:bookmarkStart w:id="60" w:name="ref-williams1994"/>
-      <w:bookmarkEnd w:id="59"/>
+      <w:bookmarkStart w:id="69" w:name="ref-williams1994"/>
+      <w:bookmarkEnd w:id="68"/>
       <w:r>
         <w:t>Williams, T. D. 1994. Intraspecific variation in egg size and egg composition in birds: Effects on offspring fitness. Biol Rev Camb Philos Soc 69:35–59.</w:t>
       </w:r>
@@ -4973,8 +6321,8 @@
       <w:pPr>
         <w:pStyle w:val="Bibliography"/>
       </w:pPr>
-      <w:bookmarkStart w:id="61" w:name="ref-winkler1987"/>
-      <w:bookmarkEnd w:id="60"/>
+      <w:bookmarkStart w:id="70" w:name="ref-winkler1987"/>
+      <w:bookmarkEnd w:id="69"/>
       <w:r>
         <w:t>Winkler, D. W., and K. Wallin. 1987. Offspring size and number: A life history model linking effort per offspring and total effort. Am Nat 129:708–720.</w:t>
       </w:r>
@@ -4983,8 +6331,8 @@
       <w:pPr>
         <w:pStyle w:val="Bibliography"/>
       </w:pPr>
-      <w:bookmarkStart w:id="62" w:name="ref-yanagi2006"/>
-      <w:bookmarkEnd w:id="61"/>
+      <w:bookmarkStart w:id="71" w:name="ref-yanagi2006"/>
+      <w:bookmarkEnd w:id="70"/>
       <w:r>
         <w:t>Yanagi, S., T. Oikawa, and T. Miyatake. 2006. Heritability and genetic correlation estimates for egg size and number in callosobruchus chinensis (coleoptera: bruchidae). Ann Entomol Soc Am 99:364–368.</w:t>
       </w:r>
@@ -4993,14 +6341,14 @@
       <w:pPr>
         <w:pStyle w:val="Bibliography"/>
       </w:pPr>
-      <w:bookmarkStart w:id="63" w:name="ref-yosef2008"/>
-      <w:bookmarkEnd w:id="62"/>
+      <w:bookmarkStart w:id="72" w:name="ref-yosef2008"/>
+      <w:bookmarkEnd w:id="71"/>
       <w:r>
         <w:t>Yosef, R., and P. Zduniak. 2008. Variation in clutch size, egg size variability and reproductive output in the desert finch (rhodospiza obsoleta). J Arid Environ 72:1631–1635.</w:t>
       </w:r>
     </w:p>
-    <w:bookmarkEnd w:id="22"/>
-    <w:bookmarkEnd w:id="63"/>
+    <w:bookmarkEnd w:id="31"/>
+    <w:bookmarkEnd w:id="72"/>
     <w:p>
       <w:pPr>
         <w:pStyle w:val="BodyText"/>
@@ -5038,22 +6386,22 @@
               <w:pStyle w:val="Compact"/>
               <w:jc w:val="center"/>
             </w:pPr>
-            <w:bookmarkStart w:id="64" w:name="fig-one"/>
+            <w:bookmarkStart w:id="73" w:name="fig-one"/>
             <w:r>
               <w:rPr>
                 <w:noProof/>
               </w:rPr>
               <w:drawing>
-                <wp:inline distT="0" distB="0" distL="0" distR="0" wp14:anchorId="265547F7" wp14:editId="30B69C95">
+                <wp:inline distT="0" distB="0" distL="0" distR="0" wp14:anchorId="545B7255" wp14:editId="533DFB3F">
                   <wp:extent cx="3810000" cy="2540000"/>
                   <wp:effectExtent l="0" t="0" r="0" b="0"/>
-                  <wp:docPr id="85" name="Picture"/>
+                  <wp:docPr id="94" name="Picture"/>
                   <wp:cNvGraphicFramePr/>
                   <a:graphic xmlns:a="http://schemas.openxmlformats.org/drawingml/2006/main">
                     <a:graphicData uri="http://schemas.openxmlformats.org/drawingml/2006/picture">
                       <pic:pic xmlns:pic="http://schemas.openxmlformats.org/drawingml/2006/picture">
                         <pic:nvPicPr>
-                          <pic:cNvPr id="86" name="Picture" descr="figure_1.jpg"/>
+                          <pic:cNvPr id="95" name="Picture" descr="figure_1.jpg"/>
                           <pic:cNvPicPr>
                             <a:picLocks noChangeAspect="1" noChangeArrowheads="1"/>
                           </pic:cNvPicPr>
@@ -5106,7 +6454,7 @@
             </w:r>
           </w:p>
         </w:tc>
-        <w:bookmarkEnd w:id="64"/>
+        <w:bookmarkEnd w:id="73"/>
       </w:tr>
     </w:tbl>
     <w:p>
@@ -5137,22 +6485,22 @@
               <w:pStyle w:val="Compact"/>
               <w:jc w:val="center"/>
             </w:pPr>
-            <w:bookmarkStart w:id="65" w:name="fig-two"/>
+            <w:bookmarkStart w:id="74" w:name="fig-two"/>
             <w:r>
               <w:rPr>
                 <w:noProof/>
               </w:rPr>
               <w:drawing>
-                <wp:inline distT="0" distB="0" distL="0" distR="0" wp14:anchorId="68A1CF67" wp14:editId="229E8301">
+                <wp:inline distT="0" distB="0" distL="0" distR="0" wp14:anchorId="0BDC8DF6" wp14:editId="273EC353">
                   <wp:extent cx="3810000" cy="2540000"/>
                   <wp:effectExtent l="0" t="0" r="0" b="0"/>
-                  <wp:docPr id="89" name="Picture"/>
+                  <wp:docPr id="98" name="Picture"/>
                   <wp:cNvGraphicFramePr/>
                   <a:graphic xmlns:a="http://schemas.openxmlformats.org/drawingml/2006/main">
                     <a:graphicData uri="http://schemas.openxmlformats.org/drawingml/2006/picture">
                       <pic:pic xmlns:pic="http://schemas.openxmlformats.org/drawingml/2006/picture">
                         <pic:nvPicPr>
-                          <pic:cNvPr id="90" name="Picture" descr="figure_2.jpg"/>
+                          <pic:cNvPr id="99" name="Picture" descr="figure_2.jpg"/>
                           <pic:cNvPicPr>
                             <a:picLocks noChangeAspect="1" noChangeArrowheads="1"/>
                           </pic:cNvPicPr>
@@ -5205,9 +6553,9 @@
             </w:r>
           </w:p>
         </w:tc>
-        <w:bookmarkEnd w:id="65"/>
+        <w:bookmarkEnd w:id="74"/>
       </w:tr>
-      <w:bookmarkEnd w:id="20"/>
+      <w:bookmarkEnd w:id="29"/>
     </w:tbl>
     <w:p/>
     <w:sectPr>
@@ -5669,7 +7017,7 @@
   <w:abstractNum w:abstractNumId="10" w15:restartNumberingAfterBreak="0">
     <w:nsid w:val="0000A990"/>
     <w:multiLevelType w:val="multilevel"/>
-    <w:tmpl w:val="B428F156"/>
+    <w:tmpl w:val="8B8600AE"/>
     <w:lvl w:ilvl="0">
       <w:numFmt w:val="bullet"/>
       <w:lvlText w:val=" "/>
@@ -5746,7 +7094,7 @@
   <w:abstractNum w:abstractNumId="11" w15:restartNumberingAfterBreak="0">
     <w:nsid w:val="00A99411"/>
     <w:multiLevelType w:val="multilevel"/>
-    <w:tmpl w:val="50C4FAAC"/>
+    <w:tmpl w:val="00E49014"/>
     <w:lvl w:ilvl="0">
       <w:start w:val="1"/>
       <w:numFmt w:val="decimal"/>
@@ -5832,7 +7180,7 @@
   <w:abstractNum w:abstractNumId="12" w15:restartNumberingAfterBreak="0">
     <w:nsid w:val="00A99412"/>
     <w:multiLevelType w:val="multilevel"/>
-    <w:tmpl w:val="E83CC8D6"/>
+    <w:tmpl w:val="ADB239D8"/>
     <w:lvl w:ilvl="0">
       <w:start w:val="2"/>
       <w:numFmt w:val="decimal"/>
@@ -6230,10 +7578,10 @@
   <w:num w:numId="13" w16cid:durableId="442194333">
     <w:abstractNumId w:val="14"/>
   </w:num>
-  <w:num w:numId="14" w16cid:durableId="742337998">
+  <w:num w:numId="14" w16cid:durableId="605622670">
     <w:abstractNumId w:val="10"/>
   </w:num>
-  <w:num w:numId="15" w16cid:durableId="683480457">
+  <w:num w:numId="15" w16cid:durableId="1870681935">
     <w:abstractNumId w:val="11"/>
     <w:lvlOverride w:ilvl="0">
       <w:startOverride w:val="1"/>
@@ -6263,7 +7611,7 @@
       <w:startOverride w:val="1"/>
     </w:lvlOverride>
   </w:num>
-  <w:num w:numId="16" w16cid:durableId="1201823662">
+  <w:num w:numId="16" w16cid:durableId="1209416791">
     <w:abstractNumId w:val="12"/>
     <w:lvlOverride w:ilvl="0">
       <w:startOverride w:val="2"/>

</xml_diff>

<commit_message>
Revised Methods and completed the Results.
</commit_message>
<xml_diff>
--- a/2025_earwig_fecundity_revised.docx
+++ b/2025_earwig_fecundity_revised.docx
@@ -1522,10 +1522,27 @@
         <w:t>r</w:t>
       </w:r>
       <w:r>
-        <w:t>). This estimate reflects the overall linear association between traits without accounting for repeated measures or hierarchical structure. To quantify among-female covariation, I calculated the Pearson correlation between female mean egg number and female mean egg size. Female means were calculated across broods. This approach isolates between-female covariance independent of within-female variation. To formally partition covariance into among-female and residual components, I fitted a multivariate Gaussi</w:t>
-      </w:r>
-      <w:r>
-        <w:t>an mixed-effects model:</w:t>
+        <w:t>). This estimate reflects the overall linear association between traits without accounting for repeated measures or hierarchical structure. To quantify among-female covariation, I calculated the Pearson correlation between female mean egg number and female mean egg size. Female means were calculated across broods. This approach isolates between-female covariance independent of within-female variation. To formally partition covariance into among-female and residual components, I fitted a multivariate mixed-</w:t>
+      </w:r>
+      <w:r>
+        <w:t>effects model in which both traits were modelled as Gaussian responses with female identity included as a random intercept, and residual correlations were estimated (</w:t>
+      </w:r>
+      <w:r>
+        <w:rPr>
+          <w:rStyle w:val="VerbatimChar"/>
+        </w:rPr>
+        <w:t>set_rescor(TRUE)</w:t>
+      </w:r>
+      <w:r>
+        <w:t>).</w:t>
+      </w:r>
+    </w:p>
+    <w:p>
+      <w:pPr>
+        <w:pStyle w:val="BodyText"/>
+      </w:pPr>
+      <w:r>
+        <w:t>I modelled egg size and egg number jointly as:</w:t>
       </w:r>
     </w:p>
     <w:bookmarkStart w:id="5" w:name="eq-residual"/>
@@ -1576,7 +1593,7 @@
                       <m:rPr>
                         <m:nor/>
                       </m:rPr>
-                      <m:t>MeanEggSize</m:t>
+                      <m:t>mean_egg_size</m:t>
                     </m:r>
                   </m:e>
                   <m:sub>
@@ -1612,30 +1629,15 @@
                       <w:rPr>
                         <w:rFonts w:ascii="Cambria Math" w:hAnsi="Cambria Math"/>
                       </w:rPr>
-                      <m:t>β</m:t>
+                      <m:t>α</m:t>
                     </m:r>
                   </m:e>
                   <m:sub>
                     <m:r>
-                      <w:rPr>
-                        <w:rFonts w:ascii="Cambria Math" w:hAnsi="Cambria Math"/>
-                      </w:rPr>
-                      <m:t>1</m:t>
-                    </m:r>
-                    <m:r>
                       <m:rPr>
-                        <m:sty m:val="p"/>
+                        <m:nor/>
                       </m:rPr>
-                      <w:rPr>
-                        <w:rFonts w:ascii="Cambria Math" w:hAnsi="Cambria Math"/>
-                      </w:rPr>
-                      <m:t>,</m:t>
-                    </m:r>
-                    <m:r>
-                      <w:rPr>
-                        <w:rFonts w:ascii="Cambria Math" w:hAnsi="Cambria Math"/>
-                      </w:rPr>
-                      <m:t>0</m:t>
+                      <m:t>size</m:t>
                     </m:r>
                   </m:sub>
                 </m:sSub>
@@ -1661,15 +1663,15 @@
                       <w:rPr>
                         <w:rFonts w:ascii="Cambria Math" w:hAnsi="Cambria Math"/>
                       </w:rPr>
-                      <m:t>b</m:t>
+                      <m:t>u</m:t>
                     </m:r>
                   </m:e>
                   <m:sub>
                     <m:r>
-                      <w:rPr>
-                        <w:rFonts w:ascii="Cambria Math" w:hAnsi="Cambria Math"/>
-                      </w:rPr>
-                      <m:t>1</m:t>
+                      <m:rPr>
+                        <m:nor/>
+                      </m:rPr>
+                      <m:t>size</m:t>
                     </m:r>
                     <m:r>
                       <m:rPr>
@@ -1715,10 +1717,10 @@
                   </m:e>
                   <m:sub>
                     <m:r>
-                      <w:rPr>
-                        <w:rFonts w:ascii="Cambria Math" w:hAnsi="Cambria Math"/>
-                      </w:rPr>
-                      <m:t>1</m:t>
+                      <m:rPr>
+                        <m:nor/>
+                      </m:rPr>
+                      <m:t>size</m:t>
                     </m:r>
                     <m:r>
                       <m:rPr>
@@ -1740,10 +1742,6 @@
               </m:e>
             </m:mr>
             <m:mr>
-              <m:e/>
-              <m:e/>
-            </m:mr>
-            <m:mr>
               <m:e>
                 <m:sSub>
                   <m:sSubPr>
@@ -1758,7 +1756,7 @@
                       <m:rPr>
                         <m:nor/>
                       </m:rPr>
-                      <m:t>EggNumber</m:t>
+                      <m:t>egg_number</m:t>
                     </m:r>
                   </m:e>
                   <m:sub>
@@ -1794,30 +1792,15 @@
                       <w:rPr>
                         <w:rFonts w:ascii="Cambria Math" w:hAnsi="Cambria Math"/>
                       </w:rPr>
-                      <m:t>β</m:t>
+                      <m:t>α</m:t>
                     </m:r>
                   </m:e>
                   <m:sub>
                     <m:r>
-                      <w:rPr>
-                        <w:rFonts w:ascii="Cambria Math" w:hAnsi="Cambria Math"/>
-                      </w:rPr>
-                      <m:t>2</m:t>
-                    </m:r>
-                    <m:r>
                       <m:rPr>
-                        <m:sty m:val="p"/>
+                        <m:nor/>
                       </m:rPr>
-                      <w:rPr>
-                        <w:rFonts w:ascii="Cambria Math" w:hAnsi="Cambria Math"/>
-                      </w:rPr>
-                      <m:t>,</m:t>
-                    </m:r>
-                    <m:r>
-                      <w:rPr>
-                        <w:rFonts w:ascii="Cambria Math" w:hAnsi="Cambria Math"/>
-                      </w:rPr>
-                      <m:t>0</m:t>
+                      <m:t>number</m:t>
                     </m:r>
                   </m:sub>
                 </m:sSub>
@@ -1843,15 +1826,15 @@
                       <w:rPr>
                         <w:rFonts w:ascii="Cambria Math" w:hAnsi="Cambria Math"/>
                       </w:rPr>
-                      <m:t>b</m:t>
+                      <m:t>u</m:t>
                     </m:r>
                   </m:e>
                   <m:sub>
                     <m:r>
-                      <w:rPr>
-                        <w:rFonts w:ascii="Cambria Math" w:hAnsi="Cambria Math"/>
-                      </w:rPr>
-                      <m:t>2</m:t>
+                      <m:rPr>
+                        <m:nor/>
+                      </m:rPr>
+                      <m:t>number</m:t>
                     </m:r>
                     <m:r>
                       <m:rPr>
@@ -1897,10 +1880,10 @@
                   </m:e>
                   <m:sub>
                     <m:r>
-                      <w:rPr>
-                        <w:rFonts w:ascii="Cambria Math" w:hAnsi="Cambria Math"/>
-                      </w:rPr>
-                      <m:t>2</m:t>
+                      <m:rPr>
+                        <m:nor/>
+                      </m:rPr>
+                      <m:t>number</m:t>
                     </m:r>
                     <m:r>
                       <m:rPr>
@@ -1954,504 +1937,7 @@
         <w:pStyle w:val="FirstParagraph"/>
       </w:pPr>
       <w:r>
-        <w:t>with random effects and residuals distributed as:</w:t>
-      </w:r>
-    </w:p>
-    <w:p>
-      <w:pPr>
-        <w:pStyle w:val="BodyText"/>
-      </w:pPr>
-      <m:oMathPara>
-        <m:oMathParaPr>
-          <m:jc m:val="center"/>
-        </m:oMathParaPr>
-        <m:oMath>
-          <m:d>
-            <m:dPr>
-              <m:ctrlPr>
-                <w:rPr>
-                  <w:rFonts w:ascii="Cambria Math" w:hAnsi="Cambria Math"/>
-                </w:rPr>
-              </m:ctrlPr>
-            </m:dPr>
-            <m:e>
-              <m:m>
-                <m:mPr>
-                  <m:plcHide m:val="1"/>
-                  <m:mcs>
-                    <m:mc>
-                      <m:mcPr>
-                        <m:count m:val="1"/>
-                        <m:mcJc m:val="center"/>
-                      </m:mcPr>
-                    </m:mc>
-                  </m:mcs>
-                  <m:ctrlPr>
-                    <w:rPr>
-                      <w:rFonts w:ascii="Cambria Math" w:hAnsi="Cambria Math"/>
-                    </w:rPr>
-                  </m:ctrlPr>
-                </m:mPr>
-                <m:mr>
-                  <m:e>
-                    <m:sSub>
-                      <m:sSubPr>
-                        <m:ctrlPr>
-                          <w:rPr>
-                            <w:rFonts w:ascii="Cambria Math" w:hAnsi="Cambria Math"/>
-                          </w:rPr>
-                        </m:ctrlPr>
-                      </m:sSubPr>
-                      <m:e>
-                        <m:r>
-                          <w:rPr>
-                            <w:rFonts w:ascii="Cambria Math" w:hAnsi="Cambria Math"/>
-                          </w:rPr>
-                          <m:t>b</m:t>
-                        </m:r>
-                      </m:e>
-                      <m:sub>
-                        <m:r>
-                          <w:rPr>
-                            <w:rFonts w:ascii="Cambria Math" w:hAnsi="Cambria Math"/>
-                          </w:rPr>
-                          <m:t>1</m:t>
-                        </m:r>
-                        <m:r>
-                          <m:rPr>
-                            <m:sty m:val="p"/>
-                          </m:rPr>
-                          <w:rPr>
-                            <w:rFonts w:ascii="Cambria Math" w:hAnsi="Cambria Math"/>
-                          </w:rPr>
-                          <m:t>,</m:t>
-                        </m:r>
-                        <m:r>
-                          <w:rPr>
-                            <w:rFonts w:ascii="Cambria Math" w:hAnsi="Cambria Math"/>
-                          </w:rPr>
-                          <m:t>i</m:t>
-                        </m:r>
-                      </m:sub>
-                    </m:sSub>
-                  </m:e>
-                </m:mr>
-                <m:mr>
-                  <m:e>
-                    <m:sSub>
-                      <m:sSubPr>
-                        <m:ctrlPr>
-                          <w:rPr>
-                            <w:rFonts w:ascii="Cambria Math" w:hAnsi="Cambria Math"/>
-                          </w:rPr>
-                        </m:ctrlPr>
-                      </m:sSubPr>
-                      <m:e>
-                        <m:r>
-                          <w:rPr>
-                            <w:rFonts w:ascii="Cambria Math" w:hAnsi="Cambria Math"/>
-                          </w:rPr>
-                          <m:t>b</m:t>
-                        </m:r>
-                      </m:e>
-                      <m:sub>
-                        <m:r>
-                          <w:rPr>
-                            <w:rFonts w:ascii="Cambria Math" w:hAnsi="Cambria Math"/>
-                          </w:rPr>
-                          <m:t>2</m:t>
-                        </m:r>
-                        <m:r>
-                          <m:rPr>
-                            <m:sty m:val="p"/>
-                          </m:rPr>
-                          <w:rPr>
-                            <w:rFonts w:ascii="Cambria Math" w:hAnsi="Cambria Math"/>
-                          </w:rPr>
-                          <m:t>,</m:t>
-                        </m:r>
-                        <m:r>
-                          <w:rPr>
-                            <w:rFonts w:ascii="Cambria Math" w:hAnsi="Cambria Math"/>
-                          </w:rPr>
-                          <m:t>i</m:t>
-                        </m:r>
-                      </m:sub>
-                    </m:sSub>
-                  </m:e>
-                </m:mr>
-              </m:m>
-            </m:e>
-          </m:d>
-          <m:r>
-            <m:rPr>
-              <m:scr m:val="script"/>
-              <m:sty m:val="p"/>
-            </m:rPr>
-            <w:rPr>
-              <w:rFonts w:ascii="Cambria Math" w:hAnsi="Cambria Math"/>
-            </w:rPr>
-            <m:t>∼M</m:t>
-          </m:r>
-          <m:r>
-            <m:rPr>
-              <m:scr m:val="script"/>
-              <m:sty m:val="p"/>
-            </m:rPr>
-            <w:rPr>
-              <w:rFonts w:ascii="Cambria Math" w:hAnsi="Cambria Math"/>
-            </w:rPr>
-            <m:t>VN</m:t>
-          </m:r>
-          <m:d>
-            <m:dPr>
-              <m:ctrlPr>
-                <w:rPr>
-                  <w:rFonts w:ascii="Cambria Math" w:hAnsi="Cambria Math"/>
-                </w:rPr>
-              </m:ctrlPr>
-            </m:dPr>
-            <m:e>
-              <m:d>
-                <m:dPr>
-                  <m:ctrlPr>
-                    <w:rPr>
-                      <w:rFonts w:ascii="Cambria Math" w:hAnsi="Cambria Math"/>
-                    </w:rPr>
-                  </m:ctrlPr>
-                </m:dPr>
-                <m:e>
-                  <m:m>
-                    <m:mPr>
-                      <m:plcHide m:val="1"/>
-                      <m:mcs>
-                        <m:mc>
-                          <m:mcPr>
-                            <m:count m:val="1"/>
-                            <m:mcJc m:val="center"/>
-                          </m:mcPr>
-                        </m:mc>
-                      </m:mcs>
-                      <m:ctrlPr>
-                        <w:rPr>
-                          <w:rFonts w:ascii="Cambria Math" w:hAnsi="Cambria Math"/>
-                        </w:rPr>
-                      </m:ctrlPr>
-                    </m:mPr>
-                    <m:mr>
-                      <m:e>
-                        <m:r>
-                          <w:rPr>
-                            <w:rFonts w:ascii="Cambria Math" w:hAnsi="Cambria Math"/>
-                          </w:rPr>
-                          <m:t>0</m:t>
-                        </m:r>
-                      </m:e>
-                    </m:mr>
-                    <m:mr>
-                      <m:e>
-                        <m:r>
-                          <w:rPr>
-                            <w:rFonts w:ascii="Cambria Math" w:hAnsi="Cambria Math"/>
-                          </w:rPr>
-                          <m:t>0</m:t>
-                        </m:r>
-                      </m:e>
-                    </m:mr>
-                  </m:m>
-                </m:e>
-              </m:d>
-              <m:r>
-                <m:rPr>
-                  <m:sty m:val="p"/>
-                </m:rPr>
-                <w:rPr>
-                  <w:rFonts w:ascii="Cambria Math" w:hAnsi="Cambria Math"/>
-                </w:rPr>
-                <m:t>,</m:t>
-              </m:r>
-              <m:sSub>
-                <m:sSubPr>
-                  <m:ctrlPr>
-                    <w:rPr>
-                      <w:rFonts w:ascii="Cambria Math" w:hAnsi="Cambria Math"/>
-                    </w:rPr>
-                  </m:ctrlPr>
-                </m:sSubPr>
-                <m:e>
-                  <m:r>
-                    <w:rPr>
-                      <w:rFonts w:ascii="Cambria Math" w:hAnsi="Cambria Math"/>
-                    </w:rPr>
-                    <m:t>Σ</m:t>
-                  </m:r>
-                </m:e>
-                <m:sub>
-                  <m:r>
-                    <w:rPr>
-                      <w:rFonts w:ascii="Cambria Math" w:hAnsi="Cambria Math"/>
-                    </w:rPr>
-                    <m:t>b</m:t>
-                  </m:r>
-                </m:sub>
-              </m:sSub>
-            </m:e>
-          </m:d>
-          <m:r>
-            <m:rPr>
-              <m:sty m:val="p"/>
-            </m:rPr>
-            <w:rPr>
-              <w:rFonts w:ascii="Cambria Math" w:hAnsi="Cambria Math"/>
-            </w:rPr>
-            <m:t>,</m:t>
-          </m:r>
-          <m:r>
-            <w:rPr>
-              <w:rFonts w:ascii="Cambria Math" w:hAnsi="Cambria Math"/>
-            </w:rPr>
-            <m:t>  </m:t>
-          </m:r>
-          <m:d>
-            <m:dPr>
-              <m:ctrlPr>
-                <w:rPr>
-                  <w:rFonts w:ascii="Cambria Math" w:hAnsi="Cambria Math"/>
-                </w:rPr>
-              </m:ctrlPr>
-            </m:dPr>
-            <m:e>
-              <m:m>
-                <m:mPr>
-                  <m:plcHide m:val="1"/>
-                  <m:mcs>
-                    <m:mc>
-                      <m:mcPr>
-                        <m:count m:val="1"/>
-                        <m:mcJc m:val="center"/>
-                      </m:mcPr>
-                    </m:mc>
-                  </m:mcs>
-                  <m:ctrlPr>
-                    <w:rPr>
-                      <w:rFonts w:ascii="Cambria Math" w:hAnsi="Cambria Math"/>
-                    </w:rPr>
-                  </m:ctrlPr>
-                </m:mPr>
-                <m:mr>
-                  <m:e>
-                    <m:sSub>
-                      <m:sSubPr>
-                        <m:ctrlPr>
-                          <w:rPr>
-                            <w:rFonts w:ascii="Cambria Math" w:hAnsi="Cambria Math"/>
-                          </w:rPr>
-                        </m:ctrlPr>
-                      </m:sSubPr>
-                      <m:e>
-                        <m:r>
-                          <w:rPr>
-                            <w:rFonts w:ascii="Cambria Math" w:hAnsi="Cambria Math"/>
-                          </w:rPr>
-                          <m:t>ε</m:t>
-                        </m:r>
-                      </m:e>
-                      <m:sub>
-                        <m:r>
-                          <w:rPr>
-                            <w:rFonts w:ascii="Cambria Math" w:hAnsi="Cambria Math"/>
-                          </w:rPr>
-                          <m:t>1</m:t>
-                        </m:r>
-                        <m:r>
-                          <m:rPr>
-                            <m:sty m:val="p"/>
-                          </m:rPr>
-                          <w:rPr>
-                            <w:rFonts w:ascii="Cambria Math" w:hAnsi="Cambria Math"/>
-                          </w:rPr>
-                          <m:t>,</m:t>
-                        </m:r>
-                        <m:r>
-                          <w:rPr>
-                            <w:rFonts w:ascii="Cambria Math" w:hAnsi="Cambria Math"/>
-                          </w:rPr>
-                          <m:t>ij</m:t>
-                        </m:r>
-                      </m:sub>
-                    </m:sSub>
-                  </m:e>
-                </m:mr>
-                <m:mr>
-                  <m:e>
-                    <m:sSub>
-                      <m:sSubPr>
-                        <m:ctrlPr>
-                          <w:rPr>
-                            <w:rFonts w:ascii="Cambria Math" w:hAnsi="Cambria Math"/>
-                          </w:rPr>
-                        </m:ctrlPr>
-                      </m:sSubPr>
-                      <m:e>
-                        <m:r>
-                          <w:rPr>
-                            <w:rFonts w:ascii="Cambria Math" w:hAnsi="Cambria Math"/>
-                          </w:rPr>
-                          <m:t>ε</m:t>
-                        </m:r>
-                      </m:e>
-                      <m:sub>
-                        <m:r>
-                          <w:rPr>
-                            <w:rFonts w:ascii="Cambria Math" w:hAnsi="Cambria Math"/>
-                          </w:rPr>
-                          <m:t>2</m:t>
-                        </m:r>
-                        <m:r>
-                          <m:rPr>
-                            <m:sty m:val="p"/>
-                          </m:rPr>
-                          <w:rPr>
-                            <w:rFonts w:ascii="Cambria Math" w:hAnsi="Cambria Math"/>
-                          </w:rPr>
-                          <m:t>,</m:t>
-                        </m:r>
-                        <m:r>
-                          <w:rPr>
-                            <w:rFonts w:ascii="Cambria Math" w:hAnsi="Cambria Math"/>
-                          </w:rPr>
-                          <m:t>ij</m:t>
-                        </m:r>
-                      </m:sub>
-                    </m:sSub>
-                  </m:e>
-                </m:mr>
-              </m:m>
-            </m:e>
-          </m:d>
-          <m:r>
-            <m:rPr>
-              <m:scr m:val="script"/>
-              <m:sty m:val="p"/>
-            </m:rPr>
-            <w:rPr>
-              <w:rFonts w:ascii="Cambria Math" w:hAnsi="Cambria Math"/>
-            </w:rPr>
-            <m:t>∼M</m:t>
-          </m:r>
-          <m:r>
-            <m:rPr>
-              <m:scr m:val="script"/>
-              <m:sty m:val="p"/>
-            </m:rPr>
-            <w:rPr>
-              <w:rFonts w:ascii="Cambria Math" w:hAnsi="Cambria Math"/>
-            </w:rPr>
-            <m:t>VN</m:t>
-          </m:r>
-          <m:d>
-            <m:dPr>
-              <m:ctrlPr>
-                <w:rPr>
-                  <w:rFonts w:ascii="Cambria Math" w:hAnsi="Cambria Math"/>
-                </w:rPr>
-              </m:ctrlPr>
-            </m:dPr>
-            <m:e>
-              <m:d>
-                <m:dPr>
-                  <m:ctrlPr>
-                    <w:rPr>
-                      <w:rFonts w:ascii="Cambria Math" w:hAnsi="Cambria Math"/>
-                    </w:rPr>
-                  </m:ctrlPr>
-                </m:dPr>
-                <m:e>
-                  <m:m>
-                    <m:mPr>
-                      <m:plcHide m:val="1"/>
-                      <m:mcs>
-                        <m:mc>
-                          <m:mcPr>
-                            <m:count m:val="1"/>
-                            <m:mcJc m:val="center"/>
-                          </m:mcPr>
-                        </m:mc>
-                      </m:mcs>
-                      <m:ctrlPr>
-                        <w:rPr>
-                          <w:rFonts w:ascii="Cambria Math" w:hAnsi="Cambria Math"/>
-                        </w:rPr>
-                      </m:ctrlPr>
-                    </m:mPr>
-                    <m:mr>
-                      <m:e>
-                        <m:r>
-                          <w:rPr>
-                            <w:rFonts w:ascii="Cambria Math" w:hAnsi="Cambria Math"/>
-                          </w:rPr>
-                          <m:t>0</m:t>
-                        </m:r>
-                      </m:e>
-                    </m:mr>
-                    <m:mr>
-                      <m:e>
-                        <m:r>
-                          <w:rPr>
-                            <w:rFonts w:ascii="Cambria Math" w:hAnsi="Cambria Math"/>
-                          </w:rPr>
-                          <m:t>0</m:t>
-                        </m:r>
-                      </m:e>
-                    </m:mr>
-                  </m:m>
-                </m:e>
-              </m:d>
-              <m:r>
-                <m:rPr>
-                  <m:sty m:val="p"/>
-                </m:rPr>
-                <w:rPr>
-                  <w:rFonts w:ascii="Cambria Math" w:hAnsi="Cambria Math"/>
-                </w:rPr>
-                <m:t>,</m:t>
-              </m:r>
-              <m:sSub>
-                <m:sSubPr>
-                  <m:ctrlPr>
-                    <w:rPr>
-                      <w:rFonts w:ascii="Cambria Math" w:hAnsi="Cambria Math"/>
-                    </w:rPr>
-                  </m:ctrlPr>
-                </m:sSubPr>
-                <m:e>
-                  <m:r>
-                    <w:rPr>
-                      <w:rFonts w:ascii="Cambria Math" w:hAnsi="Cambria Math"/>
-                    </w:rPr>
-                    <m:t>Σ</m:t>
-                  </m:r>
-                </m:e>
-                <m:sub>
-                  <m:r>
-                    <w:rPr>
-                      <w:rFonts w:ascii="Cambria Math" w:hAnsi="Cambria Math"/>
-                    </w:rPr>
-                    <m:t>ε</m:t>
-                  </m:r>
-                </m:sub>
-              </m:sSub>
-            </m:e>
-          </m:d>
-        </m:oMath>
-      </m:oMathPara>
-    </w:p>
-    <w:p>
-      <w:pPr>
-        <w:pStyle w:val="FirstParagraph"/>
-      </w:pPr>
-      <w:r>
-        <w:t xml:space="preserve">The covariance matrix </w:t>
+        <w:t xml:space="preserve">where </w:t>
       </w:r>
       <m:oMath>
         <m:sSub>
@@ -2467,7 +1953,7 @@
               <w:rPr>
                 <w:rFonts w:ascii="Cambria Math" w:hAnsi="Cambria Math"/>
               </w:rPr>
-              <m:t>Σ</m:t>
+              <m:t>u</m:t>
             </m:r>
           </m:e>
           <m:sub>
@@ -2475,13 +1961,16 @@
               <w:rPr>
                 <w:rFonts w:ascii="Cambria Math" w:hAnsi="Cambria Math"/>
               </w:rPr>
-              <m:t>b</m:t>
+              <m:t>i</m:t>
             </m:r>
           </m:sub>
         </m:sSub>
       </m:oMath>
       <w:r>
-        <w:t xml:space="preserve"> captures among-female covariance, whereas </w:t>
+        <w:t xml:space="preserve"> </w:t>
+      </w:r>
+      <w:r>
+        <w:t xml:space="preserve">represents female-specific random intercepts (with an estimated correlation between traits), and </w:t>
       </w:r>
       <m:oMath>
         <m:sSub>
@@ -2497,7 +1986,7 @@
               <w:rPr>
                 <w:rFonts w:ascii="Cambria Math" w:hAnsi="Cambria Math"/>
               </w:rPr>
-              <m:t>Σ</m:t>
+              <m:t>ε</m:t>
             </m:r>
           </m:e>
           <m:sub>
@@ -2505,22 +1994,13 @@
               <w:rPr>
                 <w:rFonts w:ascii="Cambria Math" w:hAnsi="Cambria Math"/>
               </w:rPr>
-              <m:t>ε</m:t>
+              <m:t>ij</m:t>
             </m:r>
           </m:sub>
         </m:sSub>
       </m:oMath>
       <w:r>
-        <w:t xml:space="preserve"> estimates residual (within-female) covariance after accounting for female identity (</w:t>
-      </w:r>
-      <w:r>
-        <w:rPr>
-          <w:rStyle w:val="VerbatimChar"/>
-        </w:rPr>
-        <w:t>set_rescor(TRUE)</w:t>
-      </w:r>
-      <w:r>
-        <w:t>).</w:t>
+        <w:t xml:space="preserve"> represents residual errors (with an estimated residual correlation).</w:t>
       </w:r>
     </w:p>
     <w:p>
@@ -3485,10 +2965,7 @@
         </m:sSub>
       </m:oMath>
       <w:r>
-        <w:t xml:space="preserve"> </w:t>
-      </w:r>
-      <w:r>
-        <w:t xml:space="preserve">estimates the within-female (plastic) effect of egg number on egg size, whereas </w:t>
+        <w:t xml:space="preserve"> estimates the within-female (plastic) effect of egg number on egg size, whereas </w:t>
       </w:r>
       <m:oMath>
         <m:sSub>
@@ -4909,7 +4386,18 @@
         </m:sSub>
       </m:oMath>
       <w:r>
-        <w:t xml:space="preserve"> = -0.31, 95% CI [-0.55, -0.02]). Females that produced more eggs on average tended to lay smaller eggs. The multivariate Gaussian model partitioned covariation into among-female and residual components. After accounting for female identity, the residual (within-female) correlation between egg number and egg size was effectively zero and highly uncertain (</w:t>
+        <w:t xml:space="preserve"> = -0.31, 95% CI [-0.55, -0.02]; </w:t>
+      </w:r>
+      <w:hyperlink w:anchor="fig-one">
+        <w:r>
+          <w:rPr>
+            <w:rStyle w:val="Hyperlink"/>
+          </w:rPr>
+          <w:t>Figure 1</w:t>
+        </w:r>
+      </w:hyperlink>
+      <w:r>
+        <w:t>). Females that produced more eggs on average tended to lay smaller eggs. The multivariate Gaussian model partitioned covariation into among-female and residual components. After accounting for female identity, the residual (within-female) correlation between egg number and egg size was effectively zero and highly uncertain (</w:t>
       </w:r>
       <m:oMath>
         <m:sSub>
@@ -4951,7 +4439,18 @@
         </m:sSub>
       </m:oMath>
       <w:r>
-        <w:t xml:space="preserve"> = 0.0025, 95% CI [-0.86, 0.85]). Thus, apparent phenotypic independence masked a moderate negative association among females but no detectable clutch-level trade-off within females.</w:t>
+        <w:t xml:space="preserve"> = 0.0066, 95% CI [-0.20, 0.23]; </w:t>
+      </w:r>
+      <w:hyperlink w:anchor="fig-two">
+        <w:r>
+          <w:rPr>
+            <w:rStyle w:val="Hyperlink"/>
+          </w:rPr>
+          <w:t>Figure 2</w:t>
+        </w:r>
+      </w:hyperlink>
+      <w:r>
+        <w:t>). Thus, apparent phenotypic independence masked a moderate negative association among females but no detectable clutch-level trade-off within females.</w:t>
       </w:r>
     </w:p>
     <w:p>
@@ -5000,7 +4499,18 @@
         </m:sSub>
       </m:oMath>
       <w:r>
-        <w:t xml:space="preserve"> = 0.0028, 95% CrI [-0.0005, 0.0061]). On the natural scale, this corresponds to an increase of approximately 0.027 units in egg size for every additional 10 eggs within a female — an effect that was not credibly different from zero. In contrast, the between-female effect was negative (</w:t>
+        <w:t xml:space="preserve"> = 0.0028, 95% CrI [-0.0005, 0.0061]; </w:t>
+      </w:r>
+      <w:hyperlink w:anchor="fig-three">
+        <w:r>
+          <w:rPr>
+            <w:rStyle w:val="Hyperlink"/>
+          </w:rPr>
+          <w:t>Figure 3</w:t>
+        </w:r>
+      </w:hyperlink>
+      <w:r>
+        <w:t>). On the natural scale, this corresponds to an increase of approximately 0.027 units in egg size for every additional 10 eggs within a female — an effect that was not credibly different from zero. In contrast, the between-female effect was negative (</w:t>
       </w:r>
       <m:oMath>
         <m:sSub>
@@ -5030,7 +4540,18 @@
         </m:sSub>
       </m:oMath>
       <w:r>
-        <w:t xml:space="preserve"> = -0.0039, 95% CrI [-0.0076, -0.0001]). Females differing by 10 eggs in mean clutch size differed by approximately 0.038 units in egg size. Although the credible interval extended to zero, the posterior distribution was predominantly negative, consistent with a modest among-female trade-off.</w:t>
+        <w:t xml:space="preserve"> = -0.0039, 95% CrI [-0.0076, -0.0001]; </w:t>
+      </w:r>
+      <w:hyperlink w:anchor="fig-one">
+        <w:r>
+          <w:rPr>
+            <w:rStyle w:val="Hyperlink"/>
+          </w:rPr>
+          <w:t>Figure 1</w:t>
+        </w:r>
+      </w:hyperlink>
+      <w:r>
+        <w:t>). Females differing by 10 eggs in mean clutch size differed by approximately 0.038 units in egg size. Although the credible interval extended to zero, the posterior distribution was predominantly negative, consistent with a modest among-female trade-off.</w:t>
       </w:r>
     </w:p>
     <w:p>
@@ -5166,7 +4687,18 @@
         </m:sSub>
       </m:oMath>
       <w:r>
-        <w:t xml:space="preserve"> = -0.0041, 95% CrI [-0.0082, -0.0002]). Variation in within-female slopes was small (SD = 0.0046, 95% CrI [0.0003, 0.0110]), and the intercept–slope correlation was highly uncertain (</w:t>
+        <w:t xml:space="preserve"> = -0.0041, 95% CrI [-0.0082, -0.0002]; </w:t>
+      </w:r>
+      <w:hyperlink w:anchor="fig-three">
+        <w:r>
+          <w:rPr>
+            <w:rStyle w:val="Hyperlink"/>
+          </w:rPr>
+          <w:t>Figure 3</w:t>
+        </w:r>
+      </w:hyperlink>
+      <w:r>
+        <w:t>). Variation in within-female slopes was small (SD = 0.0046, 95% CrI [0.0003, 0.0110]), and the intercept–slope correlation was highly uncertain (</w:t>
       </w:r>
       <w:r>
         <w:rPr>
@@ -5234,7 +4766,10 @@
         <w:pStyle w:val="FirstParagraph"/>
       </w:pPr>
       <w:r>
-        <w:t>Summary Overall, egg size and egg number declined substantially between clutches. Persistent differences among females generated a moderate negative association between mean egg size and number, whereas there was no evidence for a consistent within-female trade-off once clutch order was accounted for. These results indicate that apparent number–size trade-offs arise primarily from stable among-female differences rather than dynamic allocation decisions within females.</w:t>
+        <w:t xml:space="preserve">Summary </w:t>
+      </w:r>
+      <w:r>
+        <w:t>Overall, egg size and egg number declined substantially between clutches. Persistent differences among females generated a moderate negative association between mean egg size and number, whereas there was no evidence for a consistent within-female trade-off once clutch order was accounted for. These results indicate that apparent number–size trade-offs arise primarily from stable among-female differences rather than dynamic allocation decisions within females.</w:t>
       </w:r>
     </w:p>
     <w:p>
@@ -5341,16 +4876,13 @@
         <w:t>F. auricularia</w:t>
       </w:r>
       <w:r>
-        <w:t xml:space="preserve"> (Koch and Meunier 2014)</w:t>
-      </w:r>
-      <w:r>
-        <w:t>. This latter population, however, is from a more temperate locale than Montreal, which experiences a milder climate and thus perhaps less intense selection on reduced development time. I did not find the predicted positive among-female correlation between clutch and egg size. Rather, the weak negative among-individual correlation between clutch and egg size suggests that variance in resource allocation may exceed variance in resource acquisition in this population of earwigs (see Careau and Wilson 2017). I</w:t>
-      </w:r>
-      <w:r>
-        <w:t>n other words, some female earwigs in my study population might prioritise investment in egg number versus egg size and vice versa. Taken together, my results resemble Careau and Wilson’s (2017) “sink or swim” scenario, which is generally reserved for performance trade-offs. That is, females in my population of earwigs might ultimately produce an among-female (albeit weak) trade-off due to differences among females in how they allocate resources to clutch and egg size, with some females prioritising egg num</w:t>
-      </w:r>
-      <w:r>
-        <w:t>ber over size, while also producing a positive residual correlation due to a combination of ovary (dis)function, and the equal apportionment of fewer resources to eggs. Further research is needed to identify the proximate mechanisms underlying the observed multilevel correlation patterns.</w:t>
+        <w:t xml:space="preserve"> (Koch and Meunier 2014). This latter population, however, is from a more temperate locale than Montreal, which experiences a milder climate and thus perhaps less intense selection on reduced development time. I did not find the predicted positive among-female correlation between clutch and egg size. Rather, the weak negative among-individual correlation between clutch and egg size suggests that variance in resou</w:t>
+      </w:r>
+      <w:r>
+        <w:t>rce allocation may exceed variance in resource acquisition in this population of earwigs (see Careau and Wilson 2017). In other words, some female earwigs in my study population might prioritise investment in egg number versus egg size and vice versa. Taken together, my results resemble Careau and Wilson’s (2017) “sink or swim” scenario, which is generally reserved for performance trade-offs. That is, females in my population of earwigs might ultimately produce an among-female (albeit weak) trade-off due to</w:t>
+      </w:r>
+      <w:r>
+        <w:t xml:space="preserve"> differences among females in how they allocate resources to clutch and egg size, with some females prioritising egg number over size, while also producing a positive residual correlation due to a combination of ovary (dis)function, and the equal apportionment of fewer resources to eggs. Further research is needed to identify the proximate mechanisms underlying the observed multilevel correlation patterns.</w:t>
       </w:r>
     </w:p>
     <w:p>
@@ -6088,7 +5620,7 @@
                 <w:noProof/>
               </w:rPr>
               <w:drawing>
-                <wp:inline distT="0" distB="0" distL="0" distR="0" wp14:anchorId="2BAD2D16" wp14:editId="2DA76A3A">
+                <wp:inline distT="0" distB="0" distL="0" distR="0" wp14:anchorId="21B07974" wp14:editId="0A300F6A">
                   <wp:extent cx="3810000" cy="2540000"/>
                   <wp:effectExtent l="0" t="0" r="0" b="0"/>
                   <wp:docPr id="88" name="Picture"/>
@@ -6097,7 +5629,7 @@
                     <a:graphicData uri="http://schemas.openxmlformats.org/drawingml/2006/picture">
                       <pic:pic xmlns:pic="http://schemas.openxmlformats.org/drawingml/2006/picture">
                         <pic:nvPicPr>
-                          <pic:cNvPr id="89" name="Picture" descr="Figure_1.jpg"/>
+                          <pic:cNvPr id="89" name="Picture" descr="figure_1.jpg"/>
                           <pic:cNvPicPr>
                             <a:picLocks noChangeAspect="1" noChangeArrowheads="1"/>
                           </pic:cNvPicPr>
@@ -6238,7 +5770,7 @@
               </w:rPr>
               <w:lastRenderedPageBreak/>
               <w:drawing>
-                <wp:inline distT="0" distB="0" distL="0" distR="0" wp14:anchorId="0AA3069E" wp14:editId="2B41A32E">
+                <wp:inline distT="0" distB="0" distL="0" distR="0" wp14:anchorId="70CC18CA" wp14:editId="60E001EE">
                   <wp:extent cx="3810000" cy="2540000"/>
                   <wp:effectExtent l="0" t="0" r="0" b="0"/>
                   <wp:docPr id="92" name="Picture"/>
@@ -6247,7 +5779,7 @@
                     <a:graphicData uri="http://schemas.openxmlformats.org/drawingml/2006/picture">
                       <pic:pic xmlns:pic="http://schemas.openxmlformats.org/drawingml/2006/picture">
                         <pic:nvPicPr>
-                          <pic:cNvPr id="93" name="Picture" descr="Figure_2.jpg"/>
+                          <pic:cNvPr id="93" name="Picture" descr="figure_2.jpg"/>
                           <pic:cNvPicPr>
                             <a:picLocks noChangeAspect="1" noChangeArrowheads="1"/>
                           </pic:cNvPicPr>
@@ -6286,23 +5818,143 @@
               <w:spacing w:before="200"/>
             </w:pPr>
             <w:r>
-              <w:t>Figure 2: Mean egg size plotted against within-female deviation in egg number (clutch size minus each female’s mean). Points represent individual broods, and thin gray lines connect successive broods from the same female. The solid black line shows the posterior mean population-level effect of within-female egg-number deviation estimated from the mixed-effects model. The shaded ribbon represents the 95% credible interval of the posterior expected value (random effects excluded). Positive values on the x-axi</w:t>
+              <w:t xml:space="preserve">Figure 2: Within-female residual relationship between egg number and egg size from a multivariate Bayesian model. Points show posterior mean residuals for egg number and mean egg size for each clutch (n=82), extracted from a multivariate Gaussian </w:t>
+            </w:r>
+            <w:r>
+              <w:rPr>
+                <w:i/>
+                <w:iCs/>
+              </w:rPr>
+              <w:t>brms</w:t>
+            </w:r>
+            <w:r>
+              <w:t xml:space="preserve"> model fitted with correlated residuals (</w:t>
+            </w:r>
+            <w:r>
+              <w:rPr>
+                <w:rStyle w:val="VerbatimChar"/>
+              </w:rPr>
+              <w:t>set_rescor(TRUE)</w:t>
+            </w:r>
+            <w:r>
+              <w:t xml:space="preserve">). Residuals therefore represent variation remaining after accounting for all fixed and random effects specified in </w:t>
+            </w:r>
+            <w:hyperlink w:anchor="eq-residual">
+              <w:r>
+                <w:rPr>
+                  <w:rStyle w:val="Hyperlink"/>
+                </w:rPr>
+                <w:t>Equation 2</w:t>
+              </w:r>
+            </w:hyperlink>
+            <w:r>
+              <w:t>, isolating within-female covariance between traits. The solid black line shows the linear regression fit to the residual values for visualization (0.0066). The shallow slope is consistent with the posterior residual correlation estimated by the model (mean and 95% credible interval reported in text), indicating little evidence for a within-female trade-off between egg number and egg size.</w:t>
+            </w:r>
+          </w:p>
+        </w:tc>
+        <w:bookmarkEnd w:id="68"/>
+      </w:tr>
+    </w:tbl>
+    <w:p>
+      <w:pPr>
+        <w:pStyle w:val="BodyText"/>
+      </w:pPr>
+      <w:r>
+        <w:t xml:space="preserve"> </w:t>
+      </w:r>
+    </w:p>
+    <w:tbl>
+      <w:tblPr>
+        <w:tblStyle w:val="Table"/>
+        <w:tblW w:w="5000" w:type="pct"/>
+        <w:tblLayout w:type="fixed"/>
+        <w:tblLook w:val="0000" w:firstRow="0" w:lastRow="0" w:firstColumn="0" w:lastColumn="0" w:noHBand="0" w:noVBand="0"/>
+      </w:tblPr>
+      <w:tblGrid>
+        <w:gridCol w:w="9620"/>
+      </w:tblGrid>
+      <w:tr>
+        <w:tc>
+          <w:tcPr>
+            <w:tcW w:w="7920" w:type="dxa"/>
+          </w:tcPr>
+          <w:p>
+            <w:pPr>
+              <w:pStyle w:val="Compact"/>
+              <w:jc w:val="center"/>
+            </w:pPr>
+            <w:bookmarkStart w:id="69" w:name="fig-three"/>
+            <w:r>
+              <w:rPr>
+                <w:noProof/>
+              </w:rPr>
+              <w:lastRenderedPageBreak/>
+              <w:drawing>
+                <wp:inline distT="0" distB="0" distL="0" distR="0" wp14:anchorId="0CB6EDBE" wp14:editId="60CB432D">
+                  <wp:extent cx="3810000" cy="2540000"/>
+                  <wp:effectExtent l="0" t="0" r="0" b="0"/>
+                  <wp:docPr id="96" name="Picture"/>
+                  <wp:cNvGraphicFramePr/>
+                  <a:graphic xmlns:a="http://schemas.openxmlformats.org/drawingml/2006/main">
+                    <a:graphicData uri="http://schemas.openxmlformats.org/drawingml/2006/picture">
+                      <pic:pic xmlns:pic="http://schemas.openxmlformats.org/drawingml/2006/picture">
+                        <pic:nvPicPr>
+                          <pic:cNvPr id="97" name="Picture" descr="figure_3.jpg"/>
+                          <pic:cNvPicPr>
+                            <a:picLocks noChangeAspect="1" noChangeArrowheads="1"/>
+                          </pic:cNvPicPr>
+                        </pic:nvPicPr>
+                        <pic:blipFill>
+                          <a:blip r:embed="rId10"/>
+                          <a:stretch>
+                            <a:fillRect/>
+                          </a:stretch>
+                        </pic:blipFill>
+                        <pic:spPr bwMode="auto">
+                          <a:xfrm>
+                            <a:off x="0" y="0"/>
+                            <a:ext cx="3810000" cy="2540000"/>
+                          </a:xfrm>
+                          <a:prstGeom prst="rect">
+                            <a:avLst/>
+                          </a:prstGeom>
+                          <a:noFill/>
+                          <a:ln w="9525">
+                            <a:noFill/>
+                            <a:headEnd/>
+                            <a:tailEnd/>
+                          </a:ln>
+                        </pic:spPr>
+                      </pic:pic>
+                    </a:graphicData>
+                  </a:graphic>
+                </wp:inline>
+              </w:drawing>
+            </w:r>
+          </w:p>
+          <w:p>
+            <w:pPr>
+              <w:pStyle w:val="ImageCaption"/>
+              <w:spacing w:before="200"/>
+            </w:pPr>
+            <w:r>
+              <w:t>Figure 3: Mean egg size plotted against within-female deviation in egg number (clutch size minus each female’s mean). Points represent individual broods, and thin gray lines connect successive broods from the same female. The solid black line shows the posterior mean population-level effect of within-female egg-number deviation estimated from the mixed-effects model. The shaded ribbon represents the 95% credible interval of the posterior expected value (random effects excluded). Positive values on the x-axi</w:t>
             </w:r>
             <w:r>
               <w:t>s indicate broods in which a female laid more eggs than her average, whereas negative values indicate broods with fewer eggs than her average. Note that second clutches (blue points) tend to negatively deviate from zero whereas first clutches (salmon points) tend to positively deviate from zero.The slope of the population-level line reflects the estimated within-female plastic response of egg size to changes in egg number 0.]</w:t>
             </w:r>
           </w:p>
         </w:tc>
-        <w:bookmarkEnd w:id="68"/>
+        <w:bookmarkEnd w:id="69"/>
       </w:tr>
       <w:bookmarkEnd w:id="22"/>
     </w:tbl>
     <w:p/>
     <w:sectPr>
-      <w:headerReference w:type="even" r:id="rId10"/>
-      <w:headerReference w:type="default" r:id="rId11"/>
-      <w:footerReference w:type="even" r:id="rId12"/>
-      <w:footerReference w:type="default" r:id="rId13"/>
+      <w:headerReference w:type="even" r:id="rId11"/>
+      <w:headerReference w:type="default" r:id="rId12"/>
+      <w:footerReference w:type="even" r:id="rId13"/>
+      <w:footerReference w:type="default" r:id="rId14"/>
       <w:pgSz w:w="12240" w:h="15840"/>
       <w:pgMar w:top="1531" w:right="1418" w:bottom="2024" w:left="1418" w:header="737" w:footer="737" w:gutter="0"/>
       <w:lnNumType w:countBy="1" w:restart="continuous"/>
@@ -6757,7 +6409,7 @@
   <w:abstractNum w:abstractNumId="10" w15:restartNumberingAfterBreak="0">
     <w:nsid w:val="0000A990"/>
     <w:multiLevelType w:val="multilevel"/>
-    <w:tmpl w:val="2EC0E438"/>
+    <w:tmpl w:val="805491B4"/>
     <w:lvl w:ilvl="0">
       <w:numFmt w:val="bullet"/>
       <w:lvlText w:val=" "/>
@@ -6834,7 +6486,7 @@
   <w:abstractNum w:abstractNumId="11" w15:restartNumberingAfterBreak="0">
     <w:nsid w:val="00A99411"/>
     <w:multiLevelType w:val="multilevel"/>
-    <w:tmpl w:val="BD32ABA6"/>
+    <w:tmpl w:val="59EE723E"/>
     <w:lvl w:ilvl="0">
       <w:start w:val="1"/>
       <w:numFmt w:val="decimal"/>
@@ -6920,7 +6572,7 @@
   <w:abstractNum w:abstractNumId="12" w15:restartNumberingAfterBreak="0">
     <w:nsid w:val="00A99412"/>
     <w:multiLevelType w:val="multilevel"/>
-    <w:tmpl w:val="61042C2C"/>
+    <w:tmpl w:val="07D82282"/>
     <w:lvl w:ilvl="0">
       <w:start w:val="2"/>
       <w:numFmt w:val="decimal"/>
@@ -7318,10 +6970,10 @@
   <w:num w:numId="13" w16cid:durableId="442194333">
     <w:abstractNumId w:val="14"/>
   </w:num>
-  <w:num w:numId="14" w16cid:durableId="268388866">
+  <w:num w:numId="14" w16cid:durableId="1965456144">
     <w:abstractNumId w:val="10"/>
   </w:num>
-  <w:num w:numId="15" w16cid:durableId="882715298">
+  <w:num w:numId="15" w16cid:durableId="713893338">
     <w:abstractNumId w:val="11"/>
     <w:lvlOverride w:ilvl="0">
       <w:startOverride w:val="1"/>
@@ -7351,7 +7003,7 @@
       <w:startOverride w:val="1"/>
     </w:lvlOverride>
   </w:num>
-  <w:num w:numId="16" w16cid:durableId="1629244222">
+  <w:num w:numId="16" w16cid:durableId="1151600759">
     <w:abstractNumId w:val="12"/>
     <w:lvlOverride w:ilvl="0">
       <w:startOverride w:val="2"/>

</xml_diff>

<commit_message>
Added single multivariate model to estiamte several parameters at once.
</commit_message>
<xml_diff>
--- a/2025_earwig_fecundity_revised.docx
+++ b/2025_earwig_fecundity_revised.docx
@@ -586,7 +586,7 @@
         <w:pStyle w:val="BodyText"/>
       </w:pPr>
       <w:r>
-        <w:t xml:space="preserve">I used two approaches to test the prediction that females will exhibit negative within-female and positive between-female covariance between egg number and size The raw phenotypic association between egg number and egg size was calculated using Pearson’s correlation coefficient across all observations. This estimate reflects the overall linear association between traits without accounting for repeated measures or hierarchical structure. To estimate among-female covariation, I calculated the Pearson correlation between female mean egg number and female mean egg size, averaging across broods. This approach isolates between-female covariance independent of within-female variation. To formally partition covariance into among-female and within-female components, I fitted a multivariate Gaussian mixed-effects model including egg size and egg number as joint responses. Female identity was included as a random intercept for both traits, and both female-level and residual correlations were estimated (</w:t>
+        <w:t xml:space="preserve">I used two approaches to test the prediction that females will exhibit negative within-female and positive between-female covariance between egg number and size. The raw phenotypic association between egg number and egg size was calculated using Pearson’s correlation coefficient across all observations. This estimate reflects the overall linear association between traits without accounting for repeated measures or hierarchical structure. To estimate among-female covariation, I calculated the Pearson correlation between female mean egg number and female mean egg size, averaging across broods. This approach isolates between-female covariance independent of within-female variation. To formally partition covariance into among-female and within-female components, I fitted a multivariate Gaussian mixed-effects model including egg size and egg number as joint responses. Female identity was included as a random intercept for both traits, and both female-level and residual correlations were estimated (</w:t>
       </w:r>
       <w:r>
         <w:rPr>
@@ -1302,6 +1302,34 @@
         <w:pStyle w:val="BodyText"/>
       </w:pPr>
       <w:r>
+        <w:t xml:space="preserve">Because both egg number and egg size declined across clutches, clutch order was included as an additional fixed effect to test whether it explained the weak positive within-female slope. When clutch order was accounted for, the within-female effect collapsed to zero (</w:t>
+      </w:r>
+      <m:oMath>
+        <m:sSub>
+          <m:e>
+            <m:r>
+              <m:t>β</m:t>
+            </m:r>
+          </m:e>
+          <m:sub>
+            <m:r>
+              <m:t>W</m:t>
+            </m:r>
+          </m:sub>
+        </m:sSub>
+      </m:oMath>
+      <w:r>
+        <w:t xml:space="preserve"> </w:t>
+      </w:r>
+      <w:r>
+        <w:t xml:space="preserve">= -0.0004, 95% CrI [-0.0045, 0.0035]). Thus, there was no evidence that females plastically traded egg number against egg size within clutches; the apparent association in the initial model was entirely explained by parallel declines from clutch one to clutch two.</w:t>
+      </w:r>
+    </w:p>
+    <w:p>
+      <w:pPr>
+        <w:pStyle w:val="BodyText"/>
+      </w:pPr>
+      <w:r>
         <w:t xml:space="preserve">Allowing within-female slopes to vary among females produced similar fixed-effect estimates (</w:t>
       </w:r>
       <m:oMath>
@@ -1375,34 +1403,6 @@
         <w:t xml:space="preserve">= 0.20, 95% CrI [-0.67, 0.85]), indicating no strong evidence that females differed substantially in plastic allocation patterns.</w:t>
       </w:r>
     </w:p>
-    <w:p>
-      <w:pPr>
-        <w:pStyle w:val="BodyText"/>
-      </w:pPr>
-      <w:r>
-        <w:t xml:space="preserve">Because both egg number and egg size declined across clutches, clutch order was included as an additional fixed effect to test whether it explained the weak positive within-female slope. When clutch order was accounted for, the within-female effect collapsed to zero (</w:t>
-      </w:r>
-      <m:oMath>
-        <m:sSub>
-          <m:e>
-            <m:r>
-              <m:t>β</m:t>
-            </m:r>
-          </m:e>
-          <m:sub>
-            <m:r>
-              <m:t>W</m:t>
-            </m:r>
-          </m:sub>
-        </m:sSub>
-      </m:oMath>
-      <w:r>
-        <w:t xml:space="preserve"> </w:t>
-      </w:r>
-      <w:r>
-        <w:t xml:space="preserve">= -0.0004, 95% CrI [-0.0045, 0.0035]). Thus, there was no evidence that females plastically traded egg number against egg size within clutches; the apparent association in the initial model was entirely explained by parallel declines from clutch one to clutch two.</w:t>
-      </w:r>
-    </w:p>
     <w:bookmarkStart w:id="27" w:name="Xa0713afe1a0937a4c359af3d72eeaa97e62c984"/>
     <w:p>
       <w:pPr>
@@ -1631,7 +1631,7 @@
         <w:t xml:space="preserve">(see Fox and Czesak 2000)</w:t>
       </w:r>
       <w:r>
-        <w:t xml:space="preserve">. Taken together, the absence of residual covariance, minimal variation in within-female slopes, near-zero repeatability of egg number, and increased within-clutch variance indicate that females do not plastically adjust egg size in response to clutch size. Instead, second clutches seem to be defined by physiological constraints, variable clutch sizes, and diminished control over egg construction.</w:t>
+        <w:t xml:space="preserve">. Taken together, the absence of residual covariance, minimal variation in within-female slopes, near-zero repeatability of egg number, and increased within-clutch variance indicate that females do not plastically adjust egg size in response to clutch size. Instead, second clutches seem to be defined by physiological or constraints (e.g. reduced ovariole number) and diminished control over egg construction (i.e. small resource pool).</w:t>
       </w:r>
     </w:p>
     <w:p>
@@ -3178,6 +3178,11 @@
         <w:docPartUnique/>
       </w:docPartObj>
     </w:sdtPr>
+    <w:sdtEndPr>
+      <w:rPr>
+        <w:rStyle w:val="PageNumber"/>
+      </w:rPr>
+    </w:sdtEndPr>
     <w:sdtContent>
       <w:p>
         <w:pPr>
@@ -3230,6 +3235,11 @@
         <w:docPartUnique/>
       </w:docPartObj>
     </w:sdtPr>
+    <w:sdtEndPr>
+      <w:rPr>
+        <w:rStyle w:val="PageNumber"/>
+      </w:rPr>
+    </w:sdtEndPr>
     <w:sdtContent>
       <w:p>
         <w:pPr>
@@ -3314,6 +3324,11 @@
         <w:docPartUnique/>
       </w:docPartObj>
     </w:sdtPr>
+    <w:sdtEndPr>
+      <w:rPr>
+        <w:rStyle w:val="PageNumber"/>
+      </w:rPr>
+    </w:sdtEndPr>
     <w:sdtContent>
       <w:p>
         <w:pPr>

</xml_diff>

<commit_message>
Revised submission to Current Zoology
</commit_message>
<xml_diff>
--- a/2025_earwig_fecundity_revised.docx
+++ b/2025_earwig_fecundity_revised.docx
@@ -6,13 +6,8 @@
       <w:pPr>
         <w:pStyle w:val="Title"/>
       </w:pPr>
-      <w:bookmarkStart w:id="0" w:name="OLE_LINK3"/>
-      <w:r>
-        <w:t>Disentangling within- and between-female egg size–number trade-offs in the European earwig</w:t>
-      </w:r>
-      <w:bookmarkEnd w:id="0"/>
-      <w:r>
-        <w:t>.</w:t>
+      <w:r>
+        <w:t>Disentangling within- and between-female egg size–number trade-offs in the European earwig.</w:t>
       </w:r>
     </w:p>
     <w:p>
@@ -72,7 +67,7 @@
       <w:r>
         <w:t xml:space="preserve"> Correspondence: </w:t>
       </w:r>
-      <w:hyperlink r:id="rId8">
+      <w:hyperlink r:id="rId7">
         <w:r>
           <w:rPr>
             <w:rStyle w:val="Hyperlink"/>
@@ -90,7 +85,7 @@
       <w:pPr>
         <w:pStyle w:val="Heading1"/>
       </w:pPr>
-      <w:bookmarkStart w:id="1" w:name="abstract"/>
+      <w:bookmarkStart w:id="0" w:name="abstract"/>
       <w:r>
         <w:lastRenderedPageBreak/>
         <w:t>Abstract</w:t>
@@ -100,7 +95,6 @@
       <w:pPr>
         <w:pStyle w:val="FirstParagraph"/>
       </w:pPr>
-      <w:bookmarkStart w:id="2" w:name="OLE_LINK4"/>
       <w:r>
         <w:t>Life-history theory predicts a trade-off between offspring size and number, yet empirical studies often fail to detect the expected negative association. This discrepancy may occur because phenotypic correlations confuse variation in resource acquisition with variation in allocation strategy. Using repeated measures of female European earwigs (</w:t>
       </w:r>
@@ -112,10 +106,9 @@
         <w:t>Forficula auricularia</w:t>
       </w:r>
       <w:r>
-        <w:t>), I partitioned covariance between egg size and egg number into among- and within-female components using Bayesian mixed models. The raw phenotypic correlation was near zero. However, females that produced more eggs on average laid smaller eggs, revealing a modest negative association among females that aligns with an allocation trade-off. In contrast, there was no detectable within-female covariance once clutch order was accounted for. Egg number repeatability was effectively zero, suggesting that clutch size varies mainly within rather than among females, while egg size was highly repeatable. Both egg number and egg size decreased in second clutches, and within-clutch egg-size variance increased, indicating a reproductive constraint (i.e., fewer functional ovarioles) under a possibly diminished resource state. Together, these findings demonstrate that the size–number trade-off is primarily expressed among females through consistent differences in allocation strategy, whereas clutch size itself remains flexible. By separating hierarchical sources of variation, this study shows that allocation trade-offs can remain hidden at the phenotypic level and that evolutionary constraints act through stable allocation rules rather than through flexible clutch-size adjustments.</w:t>
-      </w:r>
-    </w:p>
-    <w:bookmarkEnd w:id="2"/>
+        <w:t>), I partitioned covariance between egg size and egg number into among- and within-female components using Bayesian mixed models. The raw phenotypic correlation was near zero. However, females that produced more eggs on average laid smaller eggs, revealing a modest negative association among females that aligns with an allocation trade-off. In contrast, there was no detectable within-female covariance once clutch order was accounted for. Egg number repeatability was effectively zero, suggesting that clutch size varies mainly within rather than among females, while egg size was highly repeatable. Both egg number and egg size decreased in second clutches, and within-clutch egg-size variance increased, indicating a reproductive constraint (i.e., fewer functional ovarioles) under a possibly diminished resource state. Together, these findings demonstrate that the size–number trade-off appears to be expressed among females through consistent differences in allocation strategy, whereas clutch size itself remains flexible. By separating hierarchical sources of variation, this study shows that allocation trade-offs can remain hidden at the phenotypic level and that evolutionary constraints act through stable allocation rules rather than through flexible clutch-size adjustments.</w:t>
+      </w:r>
+    </w:p>
     <w:p>
       <w:r>
         <w:br w:type="page"/>
@@ -125,8 +118,8 @@
       <w:pPr>
         <w:pStyle w:val="Heading1"/>
       </w:pPr>
-      <w:bookmarkStart w:id="3" w:name="introduction"/>
-      <w:bookmarkEnd w:id="1"/>
+      <w:bookmarkStart w:id="1" w:name="introduction"/>
+      <w:bookmarkEnd w:id="0"/>
       <w:r>
         <w:lastRenderedPageBreak/>
         <w:t>Introduction</w:t>
@@ -157,7 +150,7 @@
         <w:pStyle w:val="BodyText"/>
       </w:pPr>
       <w:r>
-        <w:t>Crucially, this framework also predicts that traits involved in allocation trade-offs should show substantial repeatability. If females differ consistently in resource acquisition, egg size and egg number should exhibit among-individual variance across clutches. High repeatability would therefore indicate persistent differences in total reproductive investment among females, consistent with variation in acquisition. At the same time, detecting a negative within-individual covariance would indicate that, conditional on their resource pool, females trade off egg size against egg number across reproductive events. Thus, variance partitioning and repeatability are not merely statistical descriptors, but tests of the underlying acquisition–allocation structure predicted by life-history theory.</w:t>
+        <w:t>Crucially, this framework also predicts that traits involved in allocation trade-offs should show substantial repeatability. If females differ consistently in resource acquisition, egg size and egg number should exhibit among-individual variance across clutches. High repeatability would, therefore, indicate persistent differences in total reproductive investment among females, consistent with variation in acquisition. The marked increase in within-clutch egg size variance in second broods further supports a resource constraint interpretation. Under reduced resource availability, females may be less able to maintain uniform provisioning across all eggs, leading to greater heterogeneity in egg size within a clutch. Such increased variance is consistent with diminished allocation precision when reproductive resources are limited, rather than an adaptive diversification of offspring size.</w:t>
       </w:r>
     </w:p>
     <w:p>
@@ -165,7 +158,7 @@
         <w:pStyle w:val="BodyText"/>
       </w:pPr>
       <w:r>
-        <w:t xml:space="preserve">Despite the foundational importance of the size–number trade-off, empirical tests rarely partition covariance into within- and among-individual components to distinguish allocation from acquisition effects. Here, I address this gap using the European earwig, </w:t>
+        <w:t xml:space="preserve">Despite the foundational importance of the size–number trade-off, empirical tests rarely partition covariance into within- and among-individual components to distinguish allocation from acquisition effects. Here, Here, I address this gap using the European earwig, </w:t>
       </w:r>
       <w:r>
         <w:rPr>
@@ -175,11 +168,11 @@
         <w:t>Forficula auricularia</w:t>
       </w:r>
       <w:r>
-        <w:t xml:space="preserve">, a species that allows repeated measures of reproductive investment within females but whose pattern of allocation to egg number and size is unclear (Koch and Meunier, 2014). Female earwigs lay a clutch within a short temporal window in a subterranean burrow (Meunier, 2024) </w:t>
+        <w:t xml:space="preserve">, a species that allows repeated measures of reproductive investment in females but whose pattern of allocation between egg number and size remains unclear (Koch and Meunier, </w:t>
       </w:r>
       <w:r>
         <w:lastRenderedPageBreak/>
-        <w:t>and provide extended maternal care (Meunier, 2024; Staerkle and Kölliker, 2008). In Quebec populations, environmental constraints typically render females effectively semelparous (Tourneur, 2018), but under favourable laboratory conditions, they can produce a second clutch. This system, therefore, enables direct estimation of within-female covariance across successive reproductive bouts. I test three predictions derived from acquisition–allocation theory (Van Noordwijk and Jong, 1986; see also Reznick, Nunney, and Tessier, 2000). First, if variance in resource acquisition among females exceeds variance in allocation strategy, then egg size and egg number should exhibit substantial repeatability and a positive among-individual correlation, whereas the within-individual correlation should be negative, revealing a masked allocation trade-off. Second, if maternal fitness is maximised at a particular offspring size or number (Smith and Fretwell, 1974), then one trait should remain relatively invariant across clutches while the other adjusts between reproductive bouts (Winkler and Wallin, 1987). Third, if reproductive investment is structured differently across bouts, then variance in egg size may differ between first and second clutches at both the among-female and within-clutch levels (e.g. Hargitai et al., 2005), providing further insight into how selection shapes the distribution of maternal investment across reproductive events.</w:t>
+        <w:t>2014). Female earwigs lay a clutch within a short temporal window in a subterranean burrow (Meunier, 2024) and provide extended maternal care (Meunier, 2024; Staerkle and Kölliker, 2008). In Québec populations, environmental constraints typically render females effectively semelparous (Tourneur, 2018), but under favourable laboratory conditions, they can produce a second clutch. This system, therefore, enables direct estimation of within-female covariance across successive reproductive bouts. I test three predictions derived from acquisition–allocation theory (Van Noordwijk and Jong, 1986; see also Reznick, Nunney, and Tessier, 2000). First, if variance in resource acquisition among females exceeds variance in allocation strategy, then egg size and egg number should exhibit substantial repeatability and a positive among-individual correlation, whereas the within-individual correlation should be negative, revealing a masked allocation trade-off. Second, if maternal fitness is maximised at a particular offspring size or number (Smith and Fretwell, 1974), then one trait should remain relatively invariant across clutches while the other adjusts between reproductive bouts (Winkler and Wallin, 1987). Third, if reproductive investment is structured differently across bouts, then variance in egg size may differ between first and second clutches at both the among-female and within-clutch levels (e.g. Hargitai et al., 2005), providing further insight into how selection shapes the distribution of maternal investment across reproductive events.</w:t>
       </w:r>
     </w:p>
     <w:p>
@@ -187,19 +180,19 @@
         <w:pStyle w:val="BodyText"/>
       </w:pPr>
       <w:r>
-        <w:t xml:space="preserve">By separating among-female differences in total reproductive investment from within-female allocation decisions, this study tests a fundamental question in life-history theory: do apparent positive associations between egg size and number reflect relaxed constraints, or do allocation trade-offs persist but remain hidden within individuals? Demonstrating a negative within-female covariance despite positive population-level patterns would show that acquisition can mask, but not erase, the constraints imposed by finite resources. In this way, my study evaluates not only </w:t>
+        <w:t xml:space="preserve">By separating among-female differences in total reproductive investment from within-female allocation decisions, this study tests a fundamental question in life-history theory: do apparent positive associations between egg size and number reflect relaxed constraints, or do allocation trade-offs persist but remain hidden within individuals? Demonstrating a negative within-female covariance despite positive population-level patterns would show that acquisition can mask, but </w:t>
       </w:r>
       <w:r>
         <w:lastRenderedPageBreak/>
-        <w:t>the existence of a trade-off but also the hierarchical structure through which life-history constraints are expressed.</w:t>
+        <w:t>not erase, the constraints imposed by finite resources. In this way, my study evaluates not only the existence of a trade-off but also the hierarchical structure through which life-history constraints are expressed.</w:t>
       </w:r>
     </w:p>
     <w:p>
       <w:pPr>
         <w:pStyle w:val="Heading1"/>
       </w:pPr>
-      <w:bookmarkStart w:id="4" w:name="methods"/>
-      <w:bookmarkEnd w:id="3"/>
+      <w:bookmarkStart w:id="2" w:name="methods"/>
+      <w:bookmarkEnd w:id="1"/>
       <w:r>
         <w:t>Methods</w:t>
       </w:r>
@@ -217,7 +210,7 @@
         <w:pStyle w:val="BodyText"/>
       </w:pPr>
       <w:r>
-        <w:t>Females were checked daily for oviposition. When a female laid eggs, I recorded the date and collected all eggs from the sand and placed them on filter paper in a new Petri dish. The eggs were then photographed under a Leica S6D stereo microscope (Leica Microsystems Inc., Concord, ON, Canada) at 0.68x magnification using Enersight software (Leica Microsystems Inc., Concord, ON, Canada), which automatically adds a scale bar to the photo. Eggs were then discarded.</w:t>
+        <w:t>Females were checked daily for oviposition. When a female laid eggs, I recorded the date, collected all eggs from the sand, and placed them on filter paper in a new Petri dish. The eggs were then photographed under a Leica S6D stereo microscope (Leica Microsystems Inc., Concord, ON, Canada) at 0.68x magnification using Enersight software (Leica Microsystems Inc., Concord, ON, Canada), which automatically adds a scale bar to the photo. Eggs were then discarded.</w:t>
       </w:r>
     </w:p>
     <w:p>
@@ -225,18 +218,18 @@
         <w:pStyle w:val="BodyText"/>
       </w:pPr>
       <w:r>
-        <w:t xml:space="preserve">To stimulate females to lay a second clutch of eggs, I recreated a brief period of spring where they were allowed to accumulate resources for egg production and replenish their sperm stores. To achieve this, females that had recently oviposited were placed in a new Petri dish containing a cotton-plugged water vial, TetraMin Tropical fish flakes, and a shelter consisting of four 4 cm-long straws (Blowholes, Markham, Canada) glued together. These Petri dishes were placed in a 23 °C incubator with a 12L:12D light: dark cycle. Females were maintained under these </w:t>
+        <w:t xml:space="preserve">To stimulate females to lay a second clutch of eggs, I recreated a brief spring period during which they were allowed to accumulate resources for egg production and replenish their sperm stores. To achieve this, females that had recently oviposited were placed in a new Petri dish containing a cotton-plugged water vial, TetraMin Tropical fish flakes, and a shelter consisting of four 4 cm-long straws (Blowholes, Markham, Canada) glued together. These Petri dishes were placed in a </w:t>
       </w:r>
       <w:r>
         <w:lastRenderedPageBreak/>
-        <w:t>conditions for two weeks, at which time a haphazardly chosen stock male from our colony was placed with her. The pair was kept together for a week, after which a new stock male replaced the original male, and that pair was kept together for another week. Females were then transferred to the 10 °C incubator and treated as previously until they laid their second clutch, at which point their eggs were photographed. Females were euthanised by freezing after laying their second clutch, and their pronotum was photographed as described above. Because female fecundity is often related to body size in insects (Honek, 1993) and could thus possibly explain a positive among-female covariance between egg number and size, I measured two proxies of size, pronotum length and body mass. Females were weighed to the nearest 0.01 mg using a Sartorius Secura 224-1S analytical balance. Females were weighed three times, with each weighing bout separated by four days. I used Fiji image analysis software (Schindelin et al., 2012) to measure the length of the female pronotum to the nearest 0.001 mm three times, with each measurement separated by 4 days. I used the same procedure to measure the perimeter of each egg.</w:t>
+        <w:t>23 °C incubator with a 12L:12D light: dark cycle. Females were maintained under these conditions for two weeks, at which time a haphazardly chosen stock male from our colony was placed with her. The pair was kept together for a week, after which a new stock male replaced the original, and the new pair was kept together for another week. Females were then transferred to the 10 °C incubator and treated as previously until they laid their second clutch, at which point their eggs were photographed. Females were euthanised by freezing after laying their second clutch, and their pronotum was photographed as described above. Because female fecundity is often related to body size in insects (Honek, 1993) and could thus possibly explain a positive among-female covariance between egg number and size, I measured two proxies of size, pronotum length and body mass. Females were weighed to the nearest 0.01 mg using a Sartorius Secura 224-1S analytical balance. Females were weighed three times, with each weighing bout separated by four days. I used Fiji image analysis software (Schindelin et al., 2012) to measure the length of the female pronotum to the nearest 0.001 mm three times, with each measurement separated by 4 days. I used the same procedure to measure the perimeter of each egg.</w:t>
       </w:r>
     </w:p>
     <w:p>
       <w:pPr>
         <w:pStyle w:val="Heading3"/>
       </w:pPr>
-      <w:bookmarkStart w:id="5" w:name="statistical-analysis"/>
+      <w:bookmarkStart w:id="3" w:name="statistical-analysis"/>
       <w:r>
         <w:t>Statistical analysis</w:t>
       </w:r>
@@ -276,7 +269,11 @@
         <w:t>R</w:t>
       </w:r>
       <w:r>
-        <w:t xml:space="preserve"> [95% CI] = 0.99 [0.988, 0.996]); therefore, I used each female’s mean value for each trait where necessary. Because egg perimeter was highly repeatable in both clutches (first clutch: </w:t>
+        <w:t xml:space="preserve"> [95% CI] = 0.99 [0.988, 0.996]); therefore, I used each female’s mean value for each trait where necessary. Because egg perimeter was highly repeatable in both clutches (first </w:t>
+      </w:r>
+      <w:r>
+        <w:lastRenderedPageBreak/>
+        <w:t xml:space="preserve">clutch: </w:t>
       </w:r>
       <w:r>
         <w:rPr>
@@ -296,11 +293,7 @@
         <w:t>R</w:t>
       </w:r>
       <w:r>
-        <w:t xml:space="preserve"> [95% CI] = 0.93 [0.926, 0.937] ), I </w:t>
-      </w:r>
-      <w:r>
-        <w:lastRenderedPageBreak/>
-        <w:t>calculated each egg’s average perimeter and then used these values to calculate the mean egg size for each clutch for each female.</w:t>
+        <w:t xml:space="preserve"> [95% CI] = 0.93 [0.926, 0.937] ), I calculated each egg’s average perimeter and then used these values to calculate the mean egg size for each clutch for each female.</w:t>
       </w:r>
     </w:p>
     <w:p>
@@ -326,7 +319,7 @@
         <w:pStyle w:val="BodyText"/>
       </w:pPr>
       <w:r>
-        <w:t>I first quantified associations among reproductive traits using raw phenotypic correlations. Pearson correlation coefficients were calculated using individual-level trait values, thereby capturing total phenotypic covariation across all sources of variation. These correlations reflect the combined contribution of consistent differences among females, within-clutch variation, and residual effects. Consequently, raw phenotypic correlations provide a descriptive estimate of overall trait associations but do not distinguish between covariation arising from stable female differences and that arising from within-clutch processes.</w:t>
+        <w:t>I first quantified associations among reproductive traits using raw phenotypic correlations. Pearson correlation coefficients were calculated using individual-level trait values, thereby capturing total phenotypic covariation across all sources of variation. These correlations reflect the combined contribution of consistent differences among females, variation among clutches within females, and residual effects. Consequently, raw phenotypic correlations provide a descriptive estimate of overall trait associations but do not distinguish between covariation arising from stable female differences and that arising from within-female (i.e., among-clutch) processes.</w:t>
       </w:r>
     </w:p>
     <w:p>
@@ -334,11 +327,11 @@
         <w:pStyle w:val="BodyText"/>
       </w:pPr>
       <w:r>
-        <w:t xml:space="preserve">To distinguish covariance arising from within-female plasticity from covariance attributable to consistent among-female differences, I followed the within–between decomposition approach of van de Pol and Wright [(2009); see Supplementary Material for details]. Although mean-centering has been shown to impose assumptions about underlying biological processes (Westneat et al., 2020), these assumptions are appropriate here because the biological question </w:t>
+        <w:t xml:space="preserve">To distinguish covariance arising from within-female plasticity from covariance attributable to consistent among-female differences, I followed the within–between decomposition approach of van de Pol and Wright [(2009); see Supplementary Material for details]. This decomposition is </w:t>
       </w:r>
       <w:r>
         <w:lastRenderedPageBreak/>
-        <w:t>concerns how reproductive allocation varies within females across clutches versus how females differ consistently in allocation strategy. Egg number was decomposed into two components: a between-female component, defined as each female’s mean egg number across broods centered on the population mean, and a within-female component, defined as the deviation of each brood from that female’s own mean. These two predictors were included simultaneously in a Bayesian multivariate mixed-effects model in which egg number and mean egg size were modelled jointly. Egg number was modelled using a negative binomial distribution with a log link to account for overdispersion, whereas mean egg size was modelled assuming a Gaussian distribution with an identity link. Clutch (first vs. second clutch) was included as a fixed effect in both submodels. Female identity was included as a random intercept for both response variables. This structure allowed estimation of among-female variance in egg number, among-female variance in egg size, and the covariance (correlation) between female-level intercepts for the two traits.</w:t>
+        <w:t>necessary because residual covariance does not isolate within-individual effects and, in models with different response distributions, does not provide a directly interpretable estimate of within-female trade-offs. Although mean-centering has been shown to impose assumptions about underlying biological processes (Westneat et al., 2020), these assumptions are appropriate here because the biological question concerns how reproductive allocation varies within females across clutches versus how females differ consistently in allocation strategy. Egg number was decomposed into two components: a between-female component, defined as each female’s mean egg number across broods centered on the population mean, and a within-female component, defined as the deviation of each brood from that female’s own mean. Hereafter, we refer to “among-female” variation as differences between individuals and “within-female” variation as differences among clutches within individuals. These two predictors were included simultaneously in a Bayesian multivariate mixed-effects model in which egg number and mean egg size were modelled jointly. Egg number was modelled using a negative binomial distribution with a log link to account for overdispersion, whereas mean egg size was modelled assuming a Gaussian distribution with an identity link. Clutch (first vs. second clutch) was included as a fixed effect in both submodels. Female identity was included as a random intercept for both response variables. This structure allowed estimation of among-female variance in egg number, among-female variance in egg size, and the covariance (correlation) between female-level intercepts for the two traits.</w:t>
       </w:r>
     </w:p>
     <w:p>
@@ -346,11 +339,11 @@
         <w:pStyle w:val="BodyText"/>
       </w:pPr>
       <w:r>
-        <w:t xml:space="preserve">This multivariate framework partitions total phenotypic covariance into two components: covariance attributable to consistent differences among females is captured by the female-level random effects, whereas covariance arising from deviations within females across clutches is captured by the fixed within-female component of egg number. The fixed between-female component quantifies how mean egg size differs among females based on their average egg number, thereby estimating the among-female (strategic) association. In contrast, the fixed within-female component estimates whether egg size changes plastically when a female produces more or fewer eggs than her own mean. The correlation between female-level intercepts represents covariance in baseline trait values among females after accounting for all fixed effects. Thus, the between-female slope tests whether females diverge in their mean allocation strategy </w:t>
+        <w:t xml:space="preserve">This multivariate framework partitions total phenotypic covariance into components arising from consistent differences among females and from within-female deviations across clutches. Covariance attributable to consistent differences among females is captured by the female-level </w:t>
       </w:r>
       <w:r>
         <w:lastRenderedPageBreak/>
-        <w:t>(i.e., whether females that consistently produce more eggs also consistently produce smaller eggs). In contrast, the intercept correlation tests for latent covariance between baseline egg number and egg size after accounting for brood effects and the within–between decomposition, reflecting residual integration not explained by mean allocation differences. Continuous predictors were standardized prior to analysis. Standardized coefficients, therefore, represent the expected change in egg size, measured in standard deviation units, associated with a one standard deviation change in egg number at the relevant hierarchical level.</w:t>
+        <w:t>random effects, whereas covariance arising from within-female variation is captured by the fixed within-female component of egg number. The fixed between-female component estimates how mean egg size varies with mean egg number across females, thereby capturing systematic (i.e., explained) differences in allocation strategy among females. In contrast, the fixed within-female component tests whether egg size changes plastically when a female produces more or fewer eggs than her own mean. The correlation between female-level intercepts represents residual (latent) covariance among baseline trait values that is not explained by the fixed effects, including the between-female allocation relationship. Thus, the between-female slope tests whether females diverge in their mean allocation strategy (i.e., whether females that consistently produce more eggs also produce smaller eggs), whereas the intercept correlation quantifies any remaining covariance between egg number and egg size after accounting for these effects. Continuous predictors were standardized prior to analysis, such that standardized coefficients represent the expected change in egg size (in standard deviation units) associated with a one standard deviation change in egg number at the relevant hierarchical level.</w:t>
       </w:r>
     </w:p>
     <w:p>
@@ -366,6 +359,7 @@
         <w:pStyle w:val="BodyText"/>
       </w:pPr>
       <w:r>
+        <w:lastRenderedPageBreak/>
         <w:t>Repeatability was calculated on the observation scale for both traits. For egg size (Gaussian model):</w:t>
       </w:r>
     </w:p>
@@ -517,7 +511,6 @@
         <w:pStyle w:val="FirstParagraph"/>
       </w:pPr>
       <w:r>
-        <w:lastRenderedPageBreak/>
         <w:t xml:space="preserve">where </w:t>
       </w:r>
       <m:oMath>
@@ -586,7 +579,7 @@
         <w:pStyle w:val="BodyText"/>
       </w:pPr>
       <w:r>
-        <w:t xml:space="preserve">For egg number, which was modelled using a negative binomial distribution, the variance depends on both the mean and the dispersion (shape) parameter. Under the negative binomial parameterization used in </w:t>
+        <w:t xml:space="preserve">For egg number, which was modelled using a negative binomial distribution with a log link, the variance depends on both the expected mean and the dispersion (shape) parameter. Under the negative binomial parameterization used in </w:t>
       </w:r>
       <w:r>
         <w:rPr>
@@ -596,7 +589,7 @@
         <w:t>brms</w:t>
       </w:r>
       <w:r>
-        <w:t>, the observation-level variance is given by:</w:t>
+        <w:t>, the observation-level (distribution-specific) variance is given by:</w:t>
       </w:r>
     </w:p>
     <w:p>
@@ -732,7 +725,204 @@
         </m:r>
       </m:oMath>
       <w:r>
-        <w:t xml:space="preserve"> is the dispersion (shape) parameter. Observation-scale repeatability for egg number was therefore calculated as:</w:t>
+        <w:t xml:space="preserve"> is the dispersion (shape) parameter. Because the model includes a log link, the among-female variance estimated from the random intercept is expressed on the latent (log) scale and must be transformed to the observation scale before calculating repeatability. Following Nakagawa et al. (2017), the among-female variance on the observation scale was therefore calculated as:</w:t>
+      </w:r>
+    </w:p>
+    <w:p>
+      <w:pPr>
+        <w:pStyle w:val="BodyText"/>
+      </w:pPr>
+      <m:oMathPara>
+        <m:oMathParaPr>
+          <m:jc m:val="center"/>
+        </m:oMathParaPr>
+        <m:oMath>
+          <m:sSubSup>
+            <m:sSubSupPr>
+              <m:ctrlPr>
+                <w:rPr>
+                  <w:rFonts w:ascii="Cambria Math" w:hAnsi="Cambria Math"/>
+                </w:rPr>
+              </m:ctrlPr>
+            </m:sSubSupPr>
+            <m:e>
+              <m:r>
+                <w:rPr>
+                  <w:rFonts w:ascii="Cambria Math" w:hAnsi="Cambria Math"/>
+                </w:rPr>
+                <m:t>V</m:t>
+              </m:r>
+            </m:e>
+            <m:sub>
+              <m:r>
+                <w:rPr>
+                  <w:rFonts w:ascii="Cambria Math" w:hAnsi="Cambria Math"/>
+                </w:rPr>
+                <m:t>F</m:t>
+              </m:r>
+            </m:sub>
+            <m:sup>
+              <m:r>
+                <m:rPr>
+                  <m:nor/>
+                </m:rPr>
+                <m:t>obs</m:t>
+              </m:r>
+            </m:sup>
+          </m:sSubSup>
+          <m:r>
+            <m:rPr>
+              <m:sty m:val="p"/>
+            </m:rPr>
+            <w:rPr>
+              <w:rFonts w:ascii="Cambria Math" w:hAnsi="Cambria Math"/>
+            </w:rPr>
+            <m:t>=</m:t>
+          </m:r>
+          <m:sSup>
+            <m:sSupPr>
+              <m:ctrlPr>
+                <w:rPr>
+                  <w:rFonts w:ascii="Cambria Math" w:hAnsi="Cambria Math"/>
+                </w:rPr>
+              </m:ctrlPr>
+            </m:sSupPr>
+            <m:e>
+              <m:r>
+                <w:rPr>
+                  <w:rFonts w:ascii="Cambria Math" w:hAnsi="Cambria Math"/>
+                </w:rPr>
+                <m:t>μ</m:t>
+              </m:r>
+            </m:e>
+            <m:sup>
+              <m:r>
+                <w:rPr>
+                  <w:rFonts w:ascii="Cambria Math" w:hAnsi="Cambria Math"/>
+                </w:rPr>
+                <m:t>2</m:t>
+              </m:r>
+            </m:sup>
+          </m:sSup>
+          <m:d>
+            <m:dPr>
+              <m:ctrlPr>
+                <w:rPr>
+                  <w:rFonts w:ascii="Cambria Math" w:hAnsi="Cambria Math"/>
+                </w:rPr>
+              </m:ctrlPr>
+            </m:dPr>
+            <m:e>
+              <m:r>
+                <m:rPr>
+                  <m:sty m:val="p"/>
+                </m:rPr>
+                <w:rPr>
+                  <w:rFonts w:ascii="Cambria Math" w:hAnsi="Cambria Math"/>
+                </w:rPr>
+                <m:t>exp</m:t>
+              </m:r>
+              <m:d>
+                <m:dPr>
+                  <m:ctrlPr>
+                    <w:rPr>
+                      <w:rFonts w:ascii="Cambria Math" w:hAnsi="Cambria Math"/>
+                    </w:rPr>
+                  </m:ctrlPr>
+                </m:dPr>
+                <m:e>
+                  <m:sSup>
+                    <m:sSupPr>
+                      <m:ctrlPr>
+                        <w:rPr>
+                          <w:rFonts w:ascii="Cambria Math" w:hAnsi="Cambria Math"/>
+                        </w:rPr>
+                      </m:ctrlPr>
+                    </m:sSupPr>
+                    <m:e>
+                      <m:r>
+                        <w:rPr>
+                          <w:rFonts w:ascii="Cambria Math" w:hAnsi="Cambria Math"/>
+                        </w:rPr>
+                        <m:t>σ</m:t>
+                      </m:r>
+                    </m:e>
+                    <m:sup>
+                      <m:r>
+                        <w:rPr>
+                          <w:rFonts w:ascii="Cambria Math" w:hAnsi="Cambria Math"/>
+                        </w:rPr>
+                        <m:t>2</m:t>
+                      </m:r>
+                    </m:sup>
+                  </m:sSup>
+                </m:e>
+              </m:d>
+              <m:r>
+                <m:rPr>
+                  <m:sty m:val="p"/>
+                </m:rPr>
+                <w:rPr>
+                  <w:rFonts w:ascii="Cambria Math" w:hAnsi="Cambria Math"/>
+                </w:rPr>
+                <m:t>-</m:t>
+              </m:r>
+              <m:r>
+                <w:rPr>
+                  <w:rFonts w:ascii="Cambria Math" w:hAnsi="Cambria Math"/>
+                </w:rPr>
+                <m:t>1</m:t>
+              </m:r>
+            </m:e>
+          </m:d>
+        </m:oMath>
+      </m:oMathPara>
+    </w:p>
+    <w:p>
+      <w:pPr>
+        <w:pStyle w:val="FirstParagraph"/>
+      </w:pPr>
+      <w:r>
+        <w:t xml:space="preserve">where </w:t>
+      </w:r>
+      <m:oMath>
+        <m:sSup>
+          <m:sSupPr>
+            <m:ctrlPr>
+              <w:rPr>
+                <w:rFonts w:ascii="Cambria Math" w:hAnsi="Cambria Math"/>
+              </w:rPr>
+            </m:ctrlPr>
+          </m:sSupPr>
+          <m:e>
+            <m:r>
+              <w:rPr>
+                <w:rFonts w:ascii="Cambria Math" w:hAnsi="Cambria Math"/>
+              </w:rPr>
+              <m:t>σ</m:t>
+            </m:r>
+          </m:e>
+          <m:sup>
+            <m:r>
+              <w:rPr>
+                <w:rFonts w:ascii="Cambria Math" w:hAnsi="Cambria Math"/>
+              </w:rPr>
+              <m:t>2</m:t>
+            </m:r>
+          </m:sup>
+        </m:sSup>
+      </m:oMath>
+      <w:r>
+        <w:t xml:space="preserve"> is the variance of the random intercept on the latent scale.</w:t>
+      </w:r>
+    </w:p>
+    <w:p>
+      <w:pPr>
+        <w:pStyle w:val="BodyText"/>
+      </w:pPr>
+      <w:r>
+        <w:lastRenderedPageBreak/>
+        <w:t>Observation-scale repeatability for egg number was then calculated as:</w:t>
       </w:r>
     </w:p>
     <w:p>
@@ -787,14 +977,14 @@
               </m:ctrlPr>
             </m:fPr>
             <m:num>
-              <m:sSub>
-                <m:sSubPr>
+              <m:sSubSup>
+                <m:sSubSupPr>
                   <m:ctrlPr>
                     <w:rPr>
                       <w:rFonts w:ascii="Cambria Math" w:hAnsi="Cambria Math"/>
                     </w:rPr>
                   </m:ctrlPr>
-                </m:sSubPr>
+                </m:sSubSupPr>
                 <m:e>
                   <m:r>
                     <w:rPr>
@@ -811,17 +1001,25 @@
                     <m:t>F</m:t>
                   </m:r>
                 </m:sub>
-              </m:sSub>
+                <m:sup>
+                  <m:r>
+                    <m:rPr>
+                      <m:nor/>
+                    </m:rPr>
+                    <m:t>obs</m:t>
+                  </m:r>
+                </m:sup>
+              </m:sSubSup>
             </m:num>
             <m:den>
-              <m:sSub>
-                <m:sSubPr>
+              <m:sSubSup>
+                <m:sSubSupPr>
                   <m:ctrlPr>
                     <w:rPr>
                       <w:rFonts w:ascii="Cambria Math" w:hAnsi="Cambria Math"/>
                     </w:rPr>
                   </m:ctrlPr>
-                </m:sSubPr>
+                </m:sSubSupPr>
                 <m:e>
                   <m:r>
                     <w:rPr>
@@ -838,7 +1036,15 @@
                     <m:t>F</m:t>
                   </m:r>
                 </m:sub>
-              </m:sSub>
+                <m:sup>
+                  <m:r>
+                    <m:rPr>
+                      <m:nor/>
+                    </m:rPr>
+                    <m:t>obs</m:t>
+                  </m:r>
+                </m:sup>
+              </m:sSubSup>
               <m:r>
                 <m:rPr>
                   <m:sty m:val="p"/>
@@ -928,37 +1134,7 @@
         <w:pStyle w:val="FirstParagraph"/>
       </w:pPr>
       <w:r>
-        <w:t xml:space="preserve">where </w:t>
-      </w:r>
-      <m:oMath>
-        <m:sSub>
-          <m:sSubPr>
-            <m:ctrlPr>
-              <w:rPr>
-                <w:rFonts w:ascii="Cambria Math" w:hAnsi="Cambria Math"/>
-              </w:rPr>
-            </m:ctrlPr>
-          </m:sSubPr>
-          <m:e>
-            <m:r>
-              <w:rPr>
-                <w:rFonts w:ascii="Cambria Math" w:hAnsi="Cambria Math"/>
-              </w:rPr>
-              <m:t>V</m:t>
-            </m:r>
-          </m:e>
-          <m:sub>
-            <m:r>
-              <w:rPr>
-                <w:rFonts w:ascii="Cambria Math" w:hAnsi="Cambria Math"/>
-              </w:rPr>
-              <m:t>F</m:t>
-            </m:r>
-          </m:sub>
-        </m:sSub>
-      </m:oMath>
-      <w:r>
-        <w:t xml:space="preserve"> is the among-female variance estimated from the random intercept. The distribution-specific variance term </w:t>
+        <w:t xml:space="preserve">Both the transformed among-female variance and the distribution-specific variance were computed for each posterior draw using the corresponding posterior samples of </w:t>
       </w:r>
       <m:oMath>
         <m:r>
@@ -967,15 +1143,11 @@
           </w:rPr>
           <m:t>μ</m:t>
         </m:r>
-        <m:r>
-          <m:rPr>
-            <m:sty m:val="p"/>
-          </m:rPr>
-          <w:rPr>
-            <w:rFonts w:ascii="Cambria Math" w:hAnsi="Cambria Math"/>
-          </w:rPr>
-          <m:t>+</m:t>
-        </m:r>
+      </m:oMath>
+      <w:r>
+        <w:t xml:space="preserve">, </w:t>
+      </w:r>
+      <m:oMath>
         <m:sSup>
           <m:sSupPr>
             <m:ctrlPr>
@@ -989,7 +1161,7 @@
               <w:rPr>
                 <w:rFonts w:ascii="Cambria Math" w:hAnsi="Cambria Math"/>
               </w:rPr>
-              <m:t>μ</m:t>
+              <m:t>σ</m:t>
             </m:r>
           </m:e>
           <m:sup>
@@ -1001,35 +1173,9 @@
             </m:r>
           </m:sup>
         </m:sSup>
-        <m:r>
-          <m:rPr>
-            <m:sty m:val="p"/>
-          </m:rPr>
-          <w:rPr>
-            <w:rFonts w:ascii="Cambria Math" w:hAnsi="Cambria Math"/>
-          </w:rPr>
-          <m:t>/</m:t>
-        </m:r>
-        <m:r>
-          <w:rPr>
-            <w:rFonts w:ascii="Cambria Math" w:hAnsi="Cambria Math"/>
-          </w:rPr>
-          <m:t>θ</m:t>
-        </m:r>
       </m:oMath>
       <w:r>
-        <w:t xml:space="preserve"> was calculated for each posterior draw using the corresponding posterior samples of </w:t>
-      </w:r>
-      <m:oMath>
-        <m:r>
-          <w:rPr>
-            <w:rFonts w:ascii="Cambria Math" w:hAnsi="Cambria Math"/>
-          </w:rPr>
-          <m:t>μ</m:t>
-        </m:r>
-      </m:oMath>
-      <w:r>
-        <w:t xml:space="preserve"> and </w:t>
+        <w:t xml:space="preserve">, and </w:t>
       </w:r>
       <m:oMath>
         <m:r>
@@ -1040,19 +1186,27 @@
         </m:r>
       </m:oMath>
       <w:r>
-        <w:t xml:space="preserve">, thereby generating a posterior distribution of repeatability. Repeatability for non-Gaussian traits was calculated following the framework of Nakagawa and Schielzeth (2010) and the extensions for generalized linear mixed models described by Nakagawa et al. (2017). Because distribution-specific variance can contribute substantially to total phenotypic variance in negative binomial models, repeatability estimates for count data are often lower than those obtained under Gaussian assumptions, even when among-individual variance is present (Nakagawa, Johnson, and Schielzeth, 2017; Nakagawa and Schielzeth, 2010). </w:t>
+        <w:t>. To account for variation in expected values across observations, these quantities were first calculated at the observation level and then averaged within each posterior draw. This procedure yielded a posterior distribution of repeatability that fully propagates uncertainty from all variance components.</w:t>
+      </w:r>
+    </w:p>
+    <w:p>
+      <w:pPr>
+        <w:pStyle w:val="BodyText"/>
+      </w:pPr>
+      <w:r>
+        <w:t>Repeatability for non-Gaussian traits was calculated following the framework of Nakagawa and Schielzeth (2010) and its extensions for generalized linear mixed models (Nakagawa, Johnson, and Schielzeth, 2017). Because distribution-specific variance can contribute substantially to total phenotypic variance in negative binomial models, repeatability estimates for count data are often lower than those obtained under Gaussian assumptions, even when among-individual variance is present (Nakagawa, Johnson, and Schielzeth, 2017; Nakagawa and Schielzeth, 2010). By calculating repeatability on the observation scale, these estimates represent the proportion of total phenotypic variance in observed egg number attributable to consistent differences among females.</w:t>
+      </w:r>
+    </w:p>
+    <w:p>
+      <w:pPr>
+        <w:pStyle w:val="BodyText"/>
+      </w:pPr>
+      <w:r>
+        <w:t xml:space="preserve">I used weakly informative priors to constrain parameters to biologically realistic ranges while allowing the data to drive inference. Regression coefficients were assigned normal priors centered at zero (Normal(0, 0.5–1)), reflecting the expectation that clutch effects on egg traits </w:t>
       </w:r>
       <w:r>
         <w:lastRenderedPageBreak/>
-        <w:t>By calculating repeatability on the observation scale for both traits, these estimates represent the proportion of total phenotypic variance in the observed trait attributable to consistent differences among females (Nakagawa and Schielzeth, 2010). Derived repeatability values were calculated for each posterior draw to propagate uncertainty from all variance components (Villemereuil, Gimenez, and Doligez, 2013).</w:t>
-      </w:r>
-    </w:p>
-    <w:p>
-      <w:pPr>
-        <w:pStyle w:val="BodyText"/>
-      </w:pPr>
-      <w:r>
-        <w:t xml:space="preserve">I used weakly informative priors to constrain parameters to biologically realistic ranges while allowing the data to drive inference. Regression coefficients were assigned normal priors centered at zero (Normal(0, 0.5–1)), reflecting the expectation that clutch effects on egg traits would be moderate in magnitude. Intercepts were given normal priors scaled to each trait (egg number: Normal(0, 5); mean egg size: Normal(3.5, 1); standardized egg size: Normal(0, 0.5)). Among-female variation was assigned exponential priors (Exponential(1–2)), which favour small but non-zero individual differences. Residual variance (Gaussian models) and the negative binomial dispersion parameter were given Exponential(1) priors. Correlations among female-level random effects were regularized using an LKJ(2) prior to avoid overestimating trait associations. Posterior distributions were obtained using six Markov chains with 4,000 iterations per chain, including 1,000 warm-up iterations, and convergence was assessed using </w:t>
+        <w:t xml:space="preserve">would be moderate in magnitude. Intercepts were given normal priors scaled to each trait (egg number: Normal(0, 5); mean egg size: Normal(3.5, 1); standardized egg size: Normal(0, 0.5)). Among-female variation was assigned exponential priors (Exponential(1–2)), which favour small but non-zero individual differences. Residual variance (Gaussian models) and the negative binomial dispersion parameter were given Exponential(1) priors. Correlations among female-level random effects were regularized using an LKJ(2) prior to avoid overestimating trait associations. Posterior distributions were obtained using six Markov chains each with 4,000 iterations, including 1,000 warm-up iterations, and convergence was assessed using </w:t>
       </w:r>
       <m:oMath>
         <m:acc>
@@ -1101,11 +1255,10 @@
       <w:pPr>
         <w:pStyle w:val="Heading1"/>
       </w:pPr>
-      <w:bookmarkStart w:id="6" w:name="results"/>
-      <w:bookmarkEnd w:id="4"/>
-      <w:bookmarkEnd w:id="5"/>
-      <w:r>
-        <w:lastRenderedPageBreak/>
+      <w:bookmarkStart w:id="4" w:name="results"/>
+      <w:bookmarkEnd w:id="2"/>
+      <w:bookmarkEnd w:id="3"/>
+      <w:r>
         <w:t>Results</w:t>
       </w:r>
     </w:p>
@@ -1113,7 +1266,7 @@
       <w:pPr>
         <w:pStyle w:val="Heading3"/>
       </w:pPr>
-      <w:bookmarkStart w:id="7" w:name="between--and-within-female-associations"/>
+      <w:bookmarkStart w:id="5" w:name="between--and-within-female-associations"/>
       <w:r>
         <w:t>Between- and within-female associations</w:t>
       </w:r>
@@ -1275,7 +1428,11 @@
         </w:r>
       </w:hyperlink>
       <w:r>
-        <w:t>; Supplementary Table 1), corresponding to an approximate 34% reduction on the natural scale (</w:t>
+        <w:t xml:space="preserve">; Supplementary Table 1), corresponding to an approximate 34% reduction on the natural </w:t>
+      </w:r>
+      <w:r>
+        <w:lastRenderedPageBreak/>
+        <w:t>scale (</w:t>
       </w:r>
       <m:oMath>
         <m:sSup>
@@ -1389,7 +1546,7 @@
         </m:sSub>
       </m:oMath>
       <w:r>
-        <w:t xml:space="preserve"> = -0.01, 95% CrI (-0.06, 0.05), indicating that females did not systematically adjust egg size when producing more or fewer eggs relative to their own mean. In contrast, the between-female component revealed a negative association between egg size and mean female egg number (</w:t>
+        <w:t xml:space="preserve"> = -0.01, 95% CrI (-0.06, 0.05), indicating that females did not systematically adjust egg size when producing more or fewer eggs relative to their own mean. By comparison, the among-female association (captured by the fixed between-female slope) revealed a negative relationship between egg size and mean female egg number (</w:t>
       </w:r>
       <m:oMath>
         <m:sSub>
@@ -1430,11 +1587,7 @@
         </w:r>
       </w:hyperlink>
       <w:r>
-        <w:t xml:space="preserve"> b). The posterior distribution of the among-female slope was centered on negative values, suggesting weak evidence for divergence in allocation strategy among females. The correlation between female-level intercepts for egg number and egg size was highly uncertain (median = -0.02, 95% CrI: -0.81, 0.82), indicating limited information for estimating latent covariance with only two broods per female. With only </w:t>
-      </w:r>
-      <w:r>
-        <w:lastRenderedPageBreak/>
-        <w:t>two repeated measures per female, intercept correlations are weakly identifiable and should be interpreted cautiously.</w:t>
+        <w:t xml:space="preserve"> b). The posterior distribution of the among-female slope was centered on negative values, suggesting weak evidence for divergence in mean allocation strategy among females. The correlation between female-level intercepts for egg number and egg size was highly uncertain (median = -0.02, 95% CrI: -0.81, 0.82), indicating limited information for estimating latent covariance with only two broods per female. With only two repeated measures per female, intercept correlations are weakly identifiable and should be interpreted cautiously.</w:t>
       </w:r>
     </w:p>
     <w:p>
@@ -1512,9 +1665,10 @@
       <w:pPr>
         <w:pStyle w:val="Heading3"/>
       </w:pPr>
-      <w:bookmarkStart w:id="8" w:name="Xa0713afe1a0937a4c359af3d72eeaa97e62c984"/>
-      <w:bookmarkEnd w:id="7"/>
-      <w:r>
+      <w:bookmarkStart w:id="6" w:name="Xa0713afe1a0937a4c359af3d72eeaa97e62c984"/>
+      <w:bookmarkEnd w:id="5"/>
+      <w:r>
+        <w:lastRenderedPageBreak/>
         <w:t>Egg size variation between females and within clutches</w:t>
       </w:r>
     </w:p>
@@ -1541,10 +1695,9 @@
       <w:pPr>
         <w:pStyle w:val="Heading3"/>
       </w:pPr>
-      <w:bookmarkStart w:id="9" w:name="egg-number-and-egg-size-repeatability"/>
-      <w:bookmarkEnd w:id="8"/>
-      <w:r>
-        <w:lastRenderedPageBreak/>
+      <w:bookmarkStart w:id="7" w:name="egg-number-and-egg-size-repeatability"/>
+      <w:bookmarkEnd w:id="6"/>
+      <w:r>
         <w:t>Egg number and egg size repeatability</w:t>
       </w:r>
     </w:p>
@@ -1575,7 +1728,7 @@
           <w:rPr>
             <w:rFonts w:ascii="Cambria Math" w:hAnsi="Cambria Math"/>
           </w:rPr>
-          <m:t>2.97</m:t>
+          <m:t>4.86</m:t>
         </m:r>
         <m:r>
           <m:rPr>
@@ -1616,7 +1769,7 @@
               <w:rPr>
                 <w:rFonts w:ascii="Cambria Math" w:hAnsi="Cambria Math"/>
               </w:rPr>
-              <m:t>5</m:t>
+              <m:t>2</m:t>
             </m:r>
           </m:sup>
         </m:sSup>
@@ -1642,13 +1795,13 @@
           <w:rPr>
             <w:rFonts w:ascii="Cambria Math" w:hAnsi="Cambria Math"/>
           </w:rPr>
-          <m:t>%</m:t>
+          <m:t>% CrI</m:t>
         </m:r>
         <m:r>
           <w:rPr>
             <w:rFonts w:ascii="Cambria Math" w:hAnsi="Cambria Math"/>
           </w:rPr>
-          <m:t>CI</m:t>
+          <m:t xml:space="preserve"> </m:t>
         </m:r>
         <m:d>
           <m:dPr>
@@ -1665,7 +1818,7 @@
               <w:rPr>
                 <w:rFonts w:ascii="Cambria Math" w:hAnsi="Cambria Math"/>
               </w:rPr>
-              <m:t>2.01</m:t>
+              <m:t>3.80</m:t>
             </m:r>
             <m:r>
               <m:rPr>
@@ -1706,7 +1859,7 @@
                   <w:rPr>
                     <w:rFonts w:ascii="Cambria Math" w:hAnsi="Cambria Math"/>
                   </w:rPr>
-                  <m:t>8</m:t>
+                  <m:t>5</m:t>
                 </m:r>
               </m:sup>
             </m:sSup>
@@ -1723,7 +1876,7 @@
               <w:rPr>
                 <w:rFonts w:ascii="Cambria Math" w:hAnsi="Cambria Math"/>
               </w:rPr>
-              <m:t>1.61</m:t>
+              <m:t>2.43</m:t>
             </m:r>
             <m:r>
               <m:rPr>
@@ -1764,7 +1917,7 @@
                   <w:rPr>
                     <w:rFonts w:ascii="Cambria Math" w:hAnsi="Cambria Math"/>
                   </w:rPr>
-                  <m:t>4</m:t>
+                  <m:t>1</m:t>
                 </m:r>
               </m:sup>
             </m:sSup>
@@ -1780,84 +1933,150 @@
         <w:pStyle w:val="BodyText"/>
       </w:pPr>
       <w:r>
-        <w:t xml:space="preserve">In contrast, egg size showed moderate repeatability on the observation scale. Among-female variance (SD = 0.082, 95% </w:t>
-      </w:r>
-      <w:proofErr w:type="spellStart"/>
-      <w:r>
-        <w:t>CrI</w:t>
-      </w:r>
-      <w:proofErr w:type="spellEnd"/>
-      <w:r>
-        <w:t xml:space="preserve"> [0.006, 0.155]</w:t>
-      </w:r>
-      <w:r>
-        <w:t xml:space="preserve">) </w:t>
-      </w:r>
-      <w:r>
-        <w:t xml:space="preserve">was substantial relative to residual variance (SD = 0.191, 95% </w:t>
-      </w:r>
-      <w:proofErr w:type="spellStart"/>
-      <w:r>
-        <w:t>CrI</w:t>
-      </w:r>
-      <w:proofErr w:type="spellEnd"/>
-      <w:r>
-        <w:t xml:space="preserve"> [0.155, 0.235]</w:t>
-      </w:r>
-      <w:r>
-        <w:t xml:space="preserve">; see </w:t>
-      </w:r>
-      <w:r>
-        <w:t xml:space="preserve">Supplementary Table </w:t>
-      </w:r>
-      <w:r>
-        <w:t>1</w:t>
-      </w:r>
-      <w:r>
-        <w:t>)</w:t>
-      </w:r>
-      <w:r>
-        <w:t>. Using clutch-specific values (Supplementary Table 2)</w:t>
-      </w:r>
-      <w:r>
-        <w:t xml:space="preserve"> yield</w:t>
-      </w:r>
-      <w:r>
-        <w:t>s</w:t>
-      </w:r>
-      <w:r>
-        <w:t xml:space="preserve"> R = 0.</w:t>
-      </w:r>
-      <w:r>
-        <w:t>78</w:t>
-      </w:r>
-      <w:r>
-        <w:t xml:space="preserve"> (95% CrI: 0.53, 0.73) in first broods and R = 0.</w:t>
-      </w:r>
-      <w:r>
-        <w:t xml:space="preserve">63 </w:t>
-      </w:r>
-      <w:r>
-        <w:t xml:space="preserve">(95% </w:t>
-      </w:r>
-      <w:proofErr w:type="spellStart"/>
-      <w:r>
-        <w:t>CrI</w:t>
-      </w:r>
-      <w:proofErr w:type="spellEnd"/>
-      <w:r>
-        <w:t>: 0.70, 0.84) in second broods. These results indicate that females differed consistently in their mean egg size across broods, whereas clutch size was largely context-dependent.</w:t>
+        <w:t xml:space="preserve">In contrast, egg size showed moderate repeatability on the observation scale. Among-female variance (SD = 0.082, 95% CrI [0.006, 0.155]; Supplementary Table 1) was substantial relative to residual variance (SD = 0.191, 95% CrI [0.155, 0.235]), yielding </w:t>
+      </w:r>
+      <w:r>
+        <w:rPr>
+          <w:i/>
+          <w:iCs/>
+        </w:rPr>
+        <w:t>R</w:t>
+      </w:r>
+      <w:r>
+        <w:t xml:space="preserve"> = 0.78 (95% CrI: 0.70, </w:t>
+      </w:r>
+      <w:r>
+        <w:lastRenderedPageBreak/>
+        <w:t xml:space="preserve">0.84) in first broods and </w:t>
+      </w:r>
+      <w:r>
+        <w:rPr>
+          <w:i/>
+          <w:iCs/>
+        </w:rPr>
+        <w:t>R</w:t>
+      </w:r>
+      <w:r>
+        <w:t xml:space="preserve"> = 0.63 (95% CrI: 0.53, 0.73) in second broods. These results indicate that females differed consistently in their mean egg size across broods, whereas clutch size was largely context-dependent.</w:t>
       </w:r>
     </w:p>
     <w:p>
       <w:pPr>
         <w:pStyle w:val="Heading1"/>
       </w:pPr>
-      <w:bookmarkStart w:id="10" w:name="discussion"/>
-      <w:bookmarkEnd w:id="6"/>
+      <w:bookmarkStart w:id="8" w:name="discussion"/>
+      <w:bookmarkEnd w:id="4"/>
+      <w:bookmarkEnd w:id="7"/>
+      <w:r>
+        <w:t>Discussion</w:t>
+      </w:r>
+    </w:p>
+    <w:p>
+      <w:pPr>
+        <w:pStyle w:val="FirstParagraph"/>
+      </w:pPr>
+      <w:r>
+        <w:t>Life-history theory predicts a trade-off between offspring size and number because both traits draw from a finite pool of reproductive resources (Lack, 1947; Roff, 1992; Smith and Fretwell, 1974; Stearns, 1992). Yet, as emphasised by van Noordwijk and de Jong (1992), phenotypic correlations need not directly reveal allocation trade-offs, because variation in resource acquisition can obscure underlying allocation rules (Careau and Wilson, 2017; Johnson and Nassrullah, 2024). This acquisition–allocation framework has become central to interpreting life-history covariance (Houle, 1991; Reznick, Nunney, and Tessier, 2000). By partitioning covariance into within- and among-female components, my results show that the size–number trade-off in this population of earwigs is modestly expressed among females but absent within them, illustrating how hierarchical structure shapes the detectability of life-history trade-offs (Careau and Wilson, 2017; Dingemanse and Dochtermann, 2013; Pol and Wright, 2009; Westneat et al., 2020).</w:t>
+      </w:r>
+    </w:p>
+    <w:p>
+      <w:pPr>
+        <w:pStyle w:val="BodyText"/>
+      </w:pPr>
+      <w:r>
+        <w:t xml:space="preserve">At the phenotypic level, egg size and egg number were uncorrelated in my earwig population, consistent with Koch and Meunier (2014). Under the framework of van Noordwijk and de Jong (1986), such phenotypic independence is expected when variation in resource acquisition obscures underlying allocation trade-offs. After hierarchical decomposition, however, a weak negative association emerged at the among-female level: females that produced more eggs on </w:t>
+      </w:r>
+      <w:r>
+        <w:lastRenderedPageBreak/>
+        <w:t>average tended to lay slightly smaller eggs. This pattern is captured by the fixed between-female slope and reflects differences among females in their mean allocation strategy. In contrast, the correlation between female-level intercepts—representing residual (latent) covariance after accounting for this allocation relationship—was highly uncertain and overlapped zero, indicating little evidence for additional integration between traits beyond that explained by differences in mean allocation strategy (Roff and Fairbairn, 2007; Stearns, 1989).</w:t>
+      </w:r>
+    </w:p>
+    <w:p>
+      <w:pPr>
+        <w:pStyle w:val="BodyText"/>
+      </w:pPr>
+      <w:r>
+        <w:t>In contrast, there was no evidence for a within-female plastic trade-off. Although each female contributed only two broods, the posterior distribution of the within-female slope was tightly centered on zero, suggesting that any within-female effect, if present, is small. Females did not reduce egg size when producing more eggs than their own average; instead, egg number and egg size shifted together across broods. This pattern is consistent with state-dependent life-history models in which allocation rules remain relatively stable while total resource state fluctuates across reproductive bouts (Houston and McNamara, 1999; McNamara and Houston, 1996). Rather than dynamically reallocating resources between offspring size and number, females appear to exhibit clutch-level shifts driven by overall energetic state.</w:t>
+      </w:r>
+    </w:p>
+    <w:p>
+      <w:pPr>
+        <w:pStyle w:val="BodyText"/>
+      </w:pPr>
+      <w:r>
+        <w:t xml:space="preserve">Notably, egg number was not correlated with female structural size or body condition (i.e. scaled mass), indicating that persistent differences in morphology do not explain clutch-size variation. If stable acquisition differences were driving among-female variation, we would expect egg number to show repeatability and to covary with these morphological size/condition indicators. The absence of such patterns weakens the interpretation that persistent acquisition differences—at least as reflected by morphology—underlie among-female differences in reproductive output. </w:t>
+      </w:r>
+      <w:r>
+        <w:lastRenderedPageBreak/>
+        <w:t>Instead, clutch size appears predominantly state-sensitive and influenced by clutch-level constraints.</w:t>
+      </w:r>
+    </w:p>
+    <w:p>
+      <w:pPr>
+        <w:pStyle w:val="BodyText"/>
+      </w:pPr>
+      <w:r>
+        <w:t>This interpretation also helps explain the pronounced decline in second clutches. That second clutches comprised both fewer and smaller eggs is consistent with previous work in North American and European populations (Koch and Meunier, 2014; Tourneur and Gingras, 1992). Tourneur and Gingras (1992) proposed that some ovarioles become non-functional after the first clutch, thereby reducing egg production capacity. Structural limitation could therefore contribute to smaller second clutches. However, structural reduction alone cannot explain the simultaneous decline in egg size. Under a strict allocation trade-off, a reduction in egg number would be expected to lead to compensatory increases in egg size if total resources remain constant. Instead, both traits declined, indicating that females likely entered the second reproductive bout with diminished resource reserves in addition to any physiological constraint. In the wild, females accumulate resources for months before producing their first clutch, whereas in the laboratory, they had only a brief interval (approx. one month) to replenish reserves before producing the second. Late reproduction, therefore, likely reflects both reduced energetic state and structural limitation.</w:t>
+      </w:r>
+    </w:p>
+    <w:p>
+      <w:pPr>
+        <w:pStyle w:val="BodyText"/>
+      </w:pPr>
+      <w:r>
+        <w:t xml:space="preserve">The hierarchical variance structure supports a constraint-based interpretation of clutch-size variation. Egg size exhibited moderate repeatability across broods, indicating stable differences among females in mean per-offspring investment. In contrast, egg number showed extremely low repeatability, with most of the variance arising from brood effects and distribution-level variation rather than from persistent female differences. The absence of any association between egg number and female structural size or condition, together with the near-zero repeatability of clutch </w:t>
+      </w:r>
+      <w:r>
+        <w:lastRenderedPageBreak/>
+        <w:t>size, suggests that variation in egg number is not driven by stable differences in resource acquisition but instead reflects transient physiological state or clutch-level constraint. Thus, clutch size appears primarily state-sensitive, whereas egg size reflects a more stable allocation strategy (Houston and McNamara, 1999; McNamara and Houston, 1996). At the same time, within-clutch variance increased substantially in second broods, indicating reduced developmental precision under diminished resource availability. Structural and energetic constraints, therefore, appear to reduce total reproductive output while leaving mean allocation rules largely intact (Ricklefs and Wikelski, 2002; Zera and Harshman, 2001).</w:t>
+      </w:r>
+    </w:p>
+    <w:p>
+      <w:pPr>
+        <w:pStyle w:val="BodyText"/>
+      </w:pPr>
+      <w:r>
+        <w:t>These patterns have broader implications for phenotypic integration and evolutionary potential. Repeatability places an upper bound on heritability (Falconer and MacKay, 1996; Lessells and Boag, 1987; Nakagawa and Schielzeth, 2013; Nakagawa and Schielzeth, 2010; but see Dohm, 2002). The moderate repeatability of egg size suggests that selection could act on persistent differences in mean provisioning, whereas the extremely low repeatability of egg number implies that clutch size may respond primarily to short-term environmental or physiological conditions (i.e. reduced ovariole function). The weak intercept correlation further indicates that egg size and egg number are only loosely integrated, consistent with models in which traits differ in their sensitivity to resource state versus allocation strategy (Houle, 1991). In this system, per-offspring investment appears more evolutionarily stable than the total number of offspring.</w:t>
+      </w:r>
+    </w:p>
+    <w:p>
+      <w:pPr>
+        <w:pStyle w:val="BodyText"/>
+      </w:pPr>
+      <w:r>
+        <w:t xml:space="preserve">Viewed hierarchically, my results illustrate a broader conceptual point: life-history trade-offs may operate primarily through stable differences in allocation rules among individuals, while short-term variation reflects state-dependent constraint. Without decomposing within- and among-individual covariance, the modest among-female trade-off suggested here would have </w:t>
+      </w:r>
+      <w:r>
+        <w:lastRenderedPageBreak/>
+        <w:t>remained obscured. More generally, the evolutionary consequences of trade-offs depend not only on their sign but on their hierarchical expression and repeatability. A trade-off that reflects consistent among-individual differences in a repeatable trait is more likely to shape evolutionary responses than one arising primarily from transient, plastic variation within individuals. Future work measuring resource acquisition directly, experimentally manipulating body condition, or estimating genetic correlations between egg size and egg number will help determine whether the allocation divergence observed here reflects adaptive differentiation in allocation strategy or condition-dependent constraint (Lande, 1980; Roff, 1992).</w:t>
+      </w:r>
+    </w:p>
+    <w:p>
+      <w:pPr>
+        <w:pStyle w:val="Heading1"/>
+      </w:pPr>
+      <w:bookmarkStart w:id="9" w:name="data-availability"/>
+      <w:bookmarkEnd w:id="8"/>
+      <w:r>
+        <w:t>Data availability</w:t>
+      </w:r>
+    </w:p>
+    <w:p>
+      <w:pPr>
+        <w:pStyle w:val="FirstParagraph"/>
+      </w:pPr>
+      <w:r>
+        <w:t>Data are available through the OSF repository at 10.17605/OSF.IO/KWCS8.</w:t>
+      </w:r>
+    </w:p>
+    <w:p>
+      <w:pPr>
+        <w:pStyle w:val="Heading1"/>
+      </w:pPr>
+      <w:bookmarkStart w:id="10" w:name="author-contributions"/>
       <w:bookmarkEnd w:id="9"/>
       <w:r>
-        <w:t>Discussion</w:t>
+        <w:t>Author contributions</w:t>
       </w:r>
     </w:p>
     <w:p>
@@ -1865,193 +2084,75 @@
         <w:pStyle w:val="FirstParagraph"/>
       </w:pPr>
       <w:r>
-        <w:t>Life-history theory predicts a trade-off between offspring size and number because both traits draw from a finite pool of reproductive resources (Lack, 1947; Roff, 1992; Smith and Fretwell, 1974; Stearns, 1992). Yet, as emphasised by van Noordwijk and de Jong (1992), phenotypic correlations need not directly reveal allocation trade-offs, because variation in resource acquisition can obscure underlying allocation rules (Careau and Wilson, 2017; Johnson and Nassrullah, 2024). This acquisition–allocation framework has become central to interpreting life-</w:t>
-      </w:r>
+        <w:t>CDK collected and analyzed the data, and wrote the manuscript.</w:t>
+      </w:r>
+    </w:p>
+    <w:p>
+      <w:pPr>
+        <w:pStyle w:val="Heading1"/>
+      </w:pPr>
+      <w:bookmarkStart w:id="11" w:name="funding"/>
+      <w:bookmarkEnd w:id="10"/>
+      <w:r>
+        <w:t>Funding</w:t>
+      </w:r>
+    </w:p>
+    <w:p>
+      <w:pPr>
+        <w:pStyle w:val="FirstParagraph"/>
+      </w:pPr>
+      <w:r>
+        <w:t>The study was funded by a Discovery Grant from the Natural Sciences and Engineering Research Council of Canada (NSERC).</w:t>
+      </w:r>
+    </w:p>
+    <w:p>
+      <w:pPr>
+        <w:pStyle w:val="Heading1"/>
+      </w:pPr>
+      <w:bookmarkStart w:id="12" w:name="conflict-of-interest"/>
+      <w:bookmarkEnd w:id="11"/>
+      <w:r>
+        <w:t>Conflict of Interest</w:t>
+      </w:r>
+    </w:p>
+    <w:p>
+      <w:pPr>
+        <w:pStyle w:val="FirstParagraph"/>
+      </w:pPr>
+      <w:r>
+        <w:t>I declare no conflict of interest.</w:t>
+      </w:r>
+    </w:p>
+    <w:p>
+      <w:pPr>
+        <w:pStyle w:val="Heading1"/>
+      </w:pPr>
+      <w:bookmarkStart w:id="13" w:name="acknowledgements"/>
+      <w:bookmarkEnd w:id="12"/>
       <w:r>
         <w:lastRenderedPageBreak/>
-        <w:t>history covariance (Houle, 1991; Reznick, Nunney, and Tessier, 2000). By partitioning covariance into within- and among-female components, my results show that the size–number trade-off in this population of earwigs is modestly expressed among females but absent within them, illustrating how hierarchical structure shapes the detectability of life-history trade-offs (Careau and Wilson, 2017; Dingemanse and Dochtermann, 2013; Pol and Wright, 2009; Westneat et al., 2020).</w:t>
-      </w:r>
-    </w:p>
-    <w:p>
-      <w:pPr>
-        <w:pStyle w:val="BodyText"/>
-      </w:pPr>
-      <w:r>
-        <w:t>At the phenotypic level, egg size and egg number were uncorrelated in my earwig population, consistent with Koch and Meunier (2014). Under the framework of van Noordwijk and de Jong (1986), such phenotypic independence is expected when variation in resource acquisition obscures underlying allocation trade-offs. After hierarchical decomposition, however, a weak negative association emerged at the among-female level: females that produced more eggs on average tended to lay slightly smaller eggs. This pattern corresponds to the estimated correlation between female-specific intercepts in the multivariate model and suggests modest divergence in average allocation strategy among females. Nevertheless, the credible interval surrounding this intercept correlation overlapped zero, indicating considerable uncertainty in the strength of among-female covariance. Thus, rather than forming a tightly integrated life-history syndrome, egg size and number appear to vary along a shallow axis of allocation divergence embedded within substantial variation in resource acquisition (Roff and Fairbairn, 2007; Stearns, 1989).</w:t>
-      </w:r>
-    </w:p>
-    <w:p>
-      <w:pPr>
-        <w:pStyle w:val="BodyText"/>
-      </w:pPr>
-      <w:r>
-        <w:t xml:space="preserve">In contrast, there was no evidence for a within-female plastic trade-off. Although each female contributed only two broods, the posterior distribution of the within-female slope was tightly centered on zero, suggesting that </w:t>
-      </w:r>
-      <w:r>
-        <w:rPr>
-          <w:rFonts w:ascii="Helvetica" w:hAnsi="Helvetica" w:cs="Helvetica"/>
-          <w:color w:val="000000"/>
-        </w:rPr>
-        <w:t>any within-female effect, if present, is small</w:t>
-      </w:r>
-      <w:r>
-        <w:t xml:space="preserve">. Females did not reduce egg size when producing more eggs than their own average; instead, egg number and </w:t>
-      </w:r>
-      <w:r>
-        <w:lastRenderedPageBreak/>
-        <w:t>egg size shifted together across broods. This pattern is consistent with state-dependent life-history models in which allocation rules remain relatively stable while total resource state fluctuates across reproductive bouts (Houston and McNamara, 1999; McNamara and Houston, 1996). Rather than dynamically reallocating resources between offspring size and number, females appear to exhibit clutch-level shifts driven by overall energetic state.</w:t>
-      </w:r>
-    </w:p>
-    <w:p>
-      <w:pPr>
-        <w:pStyle w:val="BodyText"/>
-      </w:pPr>
-      <w:r>
-        <w:t>Notably, egg number was not correlated with female structural size or body condition (i.e. scaled mass), indicating that persistent differences in morphology do not explain clutch-size variation. If stable acquisition differences were driving among-female variation, we would expect egg number to show repeatability and to covary with these morphological size/condition indicators. The absence of such patterns weakens the interpretation that persistent acquisition differences—at least as reflected by morphology—underlie among-female differences in reproductive output. Instead, clutch size appears predominantly state-sensitive and influenced by clutch-level constraints.</w:t>
-      </w:r>
-    </w:p>
-    <w:p>
-      <w:pPr>
-        <w:pStyle w:val="BodyText"/>
-      </w:pPr>
-      <w:r>
-        <w:t xml:space="preserve">This interpretation also helps explain the pronounced decline in second clutches. That second clutches comprised both fewer and smaller eggs is consistent with previous work in North American and European populations (Koch and Meunier, 2014; Tourneur and Gingras, 1992). Tourneur and Gingras (1992) proposed that some ovarioles become non-functional after the first clutch, thereby reducing egg production capacity. Structural limitation could therefore contribute to smaller second clutches. However, structural reduction alone cannot explain the simultaneous decline in egg size. Under a strict allocation trade-off, a reduction in egg number would be expected to lead to compensatory increases in egg size if total resources remain constant. Instead, both traits declined, indicating that females likely entered the second reproductive bout with </w:t>
-      </w:r>
-      <w:r>
-        <w:lastRenderedPageBreak/>
-        <w:t>diminished resource reserves in addition to any physiological constraint. In the wild, females accumulate resources for months before producing their first clutch, whereas in the laboratory, they had only a brief interval (approx. one month) to replenish reserves before producing the second. Late reproduction, therefore, likely reflects both reduced energetic state and structural limitation.</w:t>
-      </w:r>
-    </w:p>
-    <w:p>
-      <w:pPr>
-        <w:pStyle w:val="BodyText"/>
-      </w:pPr>
-      <w:r>
-        <w:t>The hierarchical variance structure supports a constraint-based interpretation of clutch-size variation. Egg size exhibited moderate repeatability across broods, indicating stable differences among females in mean per-offspring investment. In contrast, egg number showed extremely low repeatability, with most variance arising from brood effects and distribution-level variance rather than persistent female differences. The absence of any association between egg number and female structural size or condition, together with the near-zero repeatability of clutch size, suggests that variation in egg number is not driven by stable differences in resource acquisition but instead reflects transient physiological state or clutch-level constraint. Thus, clutch size appears primarily state-sensitive, whereas egg size reflects a more stable allocation strategy (Houston and McNamara, 1999; McNamara and Houston, 1996). At the same time, within-clutch variance increased substantially in second broods, indicating reduced developmental precision under diminished resource availability. Structural and energetic constraints, therefore, appear to reduce total reproductive output while leaving mean allocation rules largely intact (Ricklefs and Wikelski, 2002; Zera and Harshman, 2001).</w:t>
-      </w:r>
-    </w:p>
-    <w:p>
-      <w:pPr>
-        <w:pStyle w:val="BodyText"/>
-      </w:pPr>
-      <w:r>
-        <w:t xml:space="preserve">These patterns have broader implications for phenotypic integration and evolutionary potential. Repeatability places an upper bound on heritability (Falconer and MacKay, 1996; Lessells and Boag, 1987; Nakagawa and Schielzeth, 2013; Nakagawa and Schielzeth, 2010; but see Dohm, </w:t>
-      </w:r>
-      <w:r>
-        <w:lastRenderedPageBreak/>
-        <w:t>2002). The moderate repeatability of egg size suggests that selection could act on persistent differences in mean provisioning, whereas the extremely low repeatability of egg number implies that clutch size may respond primarily to short-term environmental or physiological conditions (i.e. reduced ovariole function). The weak intercept correlation further indicates that egg size and egg number are only loosely integrated, consistent with models in which traits differ in their sensitivity to resource state versus allocation strategy (Houle, 1991). In this system, per-offspring investment appears more evolutionarily stable than total offspring number.</w:t>
-      </w:r>
-    </w:p>
-    <w:p>
-      <w:pPr>
-        <w:pStyle w:val="BodyText"/>
-      </w:pPr>
-      <w:r>
-        <w:t>Viewed hierarchically, my results illustrate a broader conceptual point: life-history trade-offs may operate primarily through stable differences in allocation rules among individuals, while short-term variation reflects state-dependent constraint. Without decomposing within- and among-individual covariance, the modest among-female trade-off detected here would have remained obscured. More generally, the evolutionary consequences of trade-offs depend not only on their sign but on their hierarchical expression and repeatability. A trade-off that reflects consistent among-individual differences in a repeatable trait is more likely to shape evolutionary responses than one arising primarily from transient, plastic variation within individuals. Future work measuring resource acquisition directly, experimentally manipulating body condition, or estimating genetic correlations between egg size and egg number will help determine whether the allocation divergence observed here reflects adaptive differentiation in allocation strategy or condition-dependent constraint (Lande, 1980; Roff, 1992).</w:t>
+        <w:t>Acknowledgements</w:t>
+      </w:r>
+    </w:p>
+    <w:p>
+      <w:pPr>
+        <w:pStyle w:val="FirstParagraph"/>
+      </w:pPr>
+      <w:r>
+        <w:t>I thank Andréanne Nault and Clara Smythe for assistance in animal care and data collection. I also thank Denis Réale, Pierre-Olivier Montiglio, and two anonymous reviewers for their discussion and feedback.</w:t>
+      </w:r>
+    </w:p>
+    <w:p>
+      <w:r>
+        <w:br w:type="page"/>
       </w:r>
     </w:p>
     <w:p>
       <w:pPr>
         <w:pStyle w:val="Heading1"/>
       </w:pPr>
-      <w:bookmarkStart w:id="11" w:name="data-availability"/>
-      <w:bookmarkEnd w:id="10"/>
-      <w:r>
-        <w:t>Data availability</w:t>
-      </w:r>
-    </w:p>
-    <w:p>
-      <w:pPr>
-        <w:pStyle w:val="FirstParagraph"/>
-      </w:pPr>
-      <w:r>
-        <w:t>Data are available through the OSF repository at 10.17605/OSF.IO/KWCS8.</w:t>
-      </w:r>
-    </w:p>
-    <w:p>
-      <w:pPr>
-        <w:pStyle w:val="Heading1"/>
-      </w:pPr>
-      <w:bookmarkStart w:id="12" w:name="author-contributions"/>
-      <w:bookmarkEnd w:id="11"/>
-      <w:r>
-        <w:lastRenderedPageBreak/>
-        <w:t>Author contributions</w:t>
-      </w:r>
-    </w:p>
-    <w:p>
-      <w:pPr>
-        <w:pStyle w:val="FirstParagraph"/>
-      </w:pPr>
-      <w:r>
-        <w:t>CDK collected and analyzed the data, and wrote the manuscript.</w:t>
-      </w:r>
-    </w:p>
-    <w:p>
-      <w:pPr>
-        <w:pStyle w:val="Heading1"/>
-      </w:pPr>
-      <w:bookmarkStart w:id="13" w:name="funding"/>
-      <w:bookmarkEnd w:id="12"/>
-      <w:r>
-        <w:t>Funding</w:t>
-      </w:r>
-    </w:p>
-    <w:p>
-      <w:pPr>
-        <w:pStyle w:val="FirstParagraph"/>
-      </w:pPr>
-      <w:r>
-        <w:t>The study was funded by a Discovery Grant from the Natural Sciences and Engineering Research Council of Canada (NSERC).</w:t>
-      </w:r>
-    </w:p>
-    <w:p>
-      <w:pPr>
-        <w:pStyle w:val="Heading1"/>
-      </w:pPr>
-      <w:bookmarkStart w:id="14" w:name="conflict-of-interest"/>
+      <w:bookmarkStart w:id="14" w:name="references"/>
       <w:bookmarkEnd w:id="13"/>
-      <w:r>
-        <w:t>Conflict of Interest</w:t>
-      </w:r>
-    </w:p>
-    <w:p>
-      <w:pPr>
-        <w:pStyle w:val="FirstParagraph"/>
-      </w:pPr>
-      <w:r>
-        <w:t>I declare no conflict of interest.</w:t>
-      </w:r>
-    </w:p>
-    <w:p>
-      <w:pPr>
-        <w:pStyle w:val="Heading1"/>
-      </w:pPr>
-      <w:bookmarkStart w:id="15" w:name="acknowledgements"/>
-      <w:bookmarkEnd w:id="14"/>
-      <w:r>
-        <w:t>Acknowledgements</w:t>
-      </w:r>
-    </w:p>
-    <w:p>
-      <w:pPr>
-        <w:pStyle w:val="FirstParagraph"/>
-      </w:pPr>
-      <w:r>
-        <w:t>I thank Andréanne Nault and Clara Smythe for assistance in animal care and data collection. I also thank Denis Réale and Pierre-Olivier Montiglio for their discussion and feedback.</w:t>
-      </w:r>
-    </w:p>
-    <w:p>
-      <w:r>
-        <w:br w:type="page"/>
-      </w:r>
-    </w:p>
-    <w:p>
-      <w:pPr>
-        <w:pStyle w:val="Heading1"/>
-      </w:pPr>
-      <w:bookmarkStart w:id="16" w:name="references"/>
-      <w:bookmarkEnd w:id="15"/>
       <w:r>
         <w:lastRenderedPageBreak/>
         <w:t>References</w:t>
@@ -2061,8 +2162,8 @@
       <w:pPr>
         <w:pStyle w:val="Bibliography"/>
       </w:pPr>
-      <w:bookmarkStart w:id="17" w:name="ref-bernardo1996"/>
-      <w:bookmarkStart w:id="18" w:name="refs"/>
+      <w:bookmarkStart w:id="15" w:name="ref-bernardo1996"/>
+      <w:bookmarkStart w:id="16" w:name="refs"/>
       <w:r>
         <w:t xml:space="preserve">Bernardo, J., 1996. The particular maternal effect of propagule size, especially egg size: Patterns, models, quality of evidence and interpretations. </w:t>
       </w:r>
@@ -2091,8 +2192,8 @@
       <w:pPr>
         <w:pStyle w:val="Bibliography"/>
       </w:pPr>
-      <w:bookmarkStart w:id="19" w:name="ref-careau2017"/>
-      <w:bookmarkEnd w:id="17"/>
+      <w:bookmarkStart w:id="17" w:name="ref-careau2017"/>
+      <w:bookmarkEnd w:id="15"/>
       <w:r>
         <w:t xml:space="preserve">Careau, V., Wilson, R., 2017. Of uberfleas and krakens: Detecting trade-offs using mixed models. </w:t>
       </w:r>
@@ -2121,8 +2222,8 @@
       <w:pPr>
         <w:pStyle w:val="Bibliography"/>
       </w:pPr>
-      <w:bookmarkStart w:id="20" w:name="ref-clutton-brock1991"/>
-      <w:bookmarkEnd w:id="19"/>
+      <w:bookmarkStart w:id="18" w:name="ref-clutton-brock1991"/>
+      <w:bookmarkEnd w:id="17"/>
       <w:r>
         <w:t>Clutton-Brock, T.H., 1991. The Evolution of Parental Care. Princeton University Press.</w:t>
       </w:r>
@@ -2131,8 +2232,8 @@
       <w:pPr>
         <w:pStyle w:val="Bibliography"/>
       </w:pPr>
-      <w:bookmarkStart w:id="21" w:name="ref-dejong1992"/>
-      <w:bookmarkEnd w:id="20"/>
+      <w:bookmarkStart w:id="19" w:name="ref-dejong1992"/>
+      <w:bookmarkEnd w:id="18"/>
       <w:r>
         <w:t xml:space="preserve">De Jong, G., Van Noordwijk, A., 1992. Acquisition and allocation of resources: Genetic (co) variances, selection, and life histories. </w:t>
       </w:r>
@@ -2161,8 +2262,8 @@
       <w:pPr>
         <w:pStyle w:val="Bibliography"/>
       </w:pPr>
-      <w:bookmarkStart w:id="22" w:name="ref-dingemanse2013"/>
-      <w:bookmarkEnd w:id="21"/>
+      <w:bookmarkStart w:id="20" w:name="ref-dingemanse2013"/>
+      <w:bookmarkEnd w:id="19"/>
       <w:r>
         <w:t xml:space="preserve">Dingemanse, N., Dochtermann, N., 2013. Quantifying individual variation in behaviour: Mixed-effect modelling approaches. </w:t>
       </w:r>
@@ -2191,8 +2292,8 @@
       <w:pPr>
         <w:pStyle w:val="Bibliography"/>
       </w:pPr>
-      <w:bookmarkStart w:id="23" w:name="ref-dohm2002"/>
-      <w:bookmarkEnd w:id="22"/>
+      <w:bookmarkStart w:id="21" w:name="ref-dohm2002"/>
+      <w:bookmarkEnd w:id="20"/>
       <w:r>
         <w:t xml:space="preserve">Dohm, M.R., 2002. Repeatability estimates do not always set an upper limit to heritability. </w:t>
       </w:r>
@@ -2221,8 +2322,8 @@
       <w:pPr>
         <w:pStyle w:val="Bibliography"/>
       </w:pPr>
-      <w:bookmarkStart w:id="24" w:name="ref-falconer1996"/>
-      <w:bookmarkEnd w:id="23"/>
+      <w:bookmarkStart w:id="22" w:name="ref-falconer1996"/>
+      <w:bookmarkEnd w:id="21"/>
       <w:r>
         <w:t>Falconer, D.S., MacKay, T.F.C., 1996. An Introduction Quantitative Genetics. Pearson Education Limited, Essex, England.</w:t>
       </w:r>
@@ -2231,8 +2332,8 @@
       <w:pPr>
         <w:pStyle w:val="Bibliography"/>
       </w:pPr>
-      <w:bookmarkStart w:id="25" w:name="ref-fox2000"/>
-      <w:bookmarkEnd w:id="24"/>
+      <w:bookmarkStart w:id="23" w:name="ref-fox2000"/>
+      <w:bookmarkEnd w:id="22"/>
       <w:r>
         <w:t xml:space="preserve">Fox, C.W., Czesak, M.E., 2000. Evolutionary ecology of progeny size in arthropods. </w:t>
       </w:r>
@@ -2261,8 +2362,8 @@
       <w:pPr>
         <w:pStyle w:val="Bibliography"/>
       </w:pPr>
-      <w:bookmarkStart w:id="26" w:name="ref-hargitai2005"/>
-      <w:bookmarkEnd w:id="25"/>
+      <w:bookmarkStart w:id="24" w:name="ref-hargitai2005"/>
+      <w:bookmarkEnd w:id="23"/>
       <w:r>
         <w:t xml:space="preserve">Hargitai, R., Török, J., Tóth, L., Hegyi, G., Rosivall, B., Szigeti, B., Szöllősi, E., 2005. Effects of environmental conditions and parental quality on inter-and intraclutch egg-size variation in the collared flycatcher (ficedula albicollis). </w:t>
       </w:r>
@@ -2291,8 +2392,8 @@
       <w:pPr>
         <w:pStyle w:val="Bibliography"/>
       </w:pPr>
-      <w:bookmarkStart w:id="27" w:name="ref-honek1993"/>
-      <w:bookmarkEnd w:id="26"/>
+      <w:bookmarkStart w:id="25" w:name="ref-honek1993"/>
+      <w:bookmarkEnd w:id="24"/>
       <w:r>
         <w:t xml:space="preserve">Honek, A., 1993. Intraspecific variation in body size and fecundity in insects: A general relationship. </w:t>
       </w:r>
@@ -2311,8 +2412,8 @@
       <w:pPr>
         <w:pStyle w:val="Bibliography"/>
       </w:pPr>
-      <w:bookmarkStart w:id="28" w:name="ref-houle1991"/>
-      <w:bookmarkEnd w:id="27"/>
+      <w:bookmarkStart w:id="26" w:name="ref-houle1991"/>
+      <w:bookmarkEnd w:id="25"/>
       <w:r>
         <w:t xml:space="preserve">Houle, D., 1991. Genetic covariance of fitness correlates: What genetic correlations are made of and why it matters. </w:t>
       </w:r>
@@ -2341,8 +2442,8 @@
       <w:pPr>
         <w:pStyle w:val="Bibliography"/>
       </w:pPr>
-      <w:bookmarkStart w:id="29" w:name="ref-houston1999"/>
-      <w:bookmarkEnd w:id="28"/>
+      <w:bookmarkStart w:id="27" w:name="ref-houston1999"/>
+      <w:bookmarkEnd w:id="26"/>
       <w:r>
         <w:t>Houston, A.I., McNamara, J.M., 1999. Models of adaptive behaviour: An approach based on state. Cambridge University Press.</w:t>
       </w:r>
@@ -2351,8 +2452,8 @@
       <w:pPr>
         <w:pStyle w:val="Bibliography"/>
       </w:pPr>
-      <w:bookmarkStart w:id="30" w:name="ref-johnson2024"/>
-      <w:bookmarkEnd w:id="29"/>
+      <w:bookmarkStart w:id="28" w:name="ref-johnson2024"/>
+      <w:bookmarkEnd w:id="27"/>
       <w:r>
         <w:t xml:space="preserve">Johnson, M.T.J., Nassrullah, Z., 2024. The improbability of detecting trade-offs and some practical solutions. </w:t>
       </w:r>
@@ -2381,8 +2482,8 @@
       <w:pPr>
         <w:pStyle w:val="Bibliography"/>
       </w:pPr>
-      <w:bookmarkStart w:id="31" w:name="ref-kay2020"/>
-      <w:bookmarkEnd w:id="30"/>
+      <w:bookmarkStart w:id="29" w:name="ref-kay2020"/>
+      <w:bookmarkEnd w:id="28"/>
       <w:r>
         <w:t xml:space="preserve">Kay, M., 2020. tidybayes: Tidy Data and Geoms for Bayesian Models [WWW Document]. </w:t>
       </w:r>
@@ -2396,7 +2497,7 @@
       <w:r>
         <w:t xml:space="preserve">. URL </w:t>
       </w:r>
-      <w:hyperlink r:id="rId9">
+      <w:hyperlink r:id="rId8">
         <w:r>
           <w:rPr>
             <w:rStyle w:val="Hyperlink"/>
@@ -2409,8 +2510,8 @@
       <w:pPr>
         <w:pStyle w:val="Bibliography"/>
       </w:pPr>
-      <w:bookmarkStart w:id="32" w:name="ref-kelly2014"/>
-      <w:bookmarkEnd w:id="31"/>
+      <w:bookmarkStart w:id="30" w:name="ref-kelly2014"/>
+      <w:bookmarkEnd w:id="29"/>
       <w:r>
         <w:t xml:space="preserve">Kelly, C.D., Tawes, B., Worthington, A., 2014. Evaluating indices of body condition in two cricket species. </w:t>
       </w:r>
@@ -2439,8 +2540,8 @@
       <w:pPr>
         <w:pStyle w:val="Bibliography"/>
       </w:pPr>
-      <w:bookmarkStart w:id="33" w:name="ref-koch2014"/>
-      <w:bookmarkEnd w:id="32"/>
+      <w:bookmarkStart w:id="31" w:name="ref-koch2014"/>
+      <w:bookmarkEnd w:id="30"/>
       <w:r>
         <w:lastRenderedPageBreak/>
         <w:t xml:space="preserve">Koch, L.K., Meunier, J., 2014. Mother and offspring fitness in an insect with maternal care: Phenotypic trade-offs between egg number, egg mass and egg care. </w:t>
@@ -2470,8 +2571,8 @@
       <w:pPr>
         <w:pStyle w:val="Bibliography"/>
       </w:pPr>
-      <w:bookmarkStart w:id="34" w:name="ref-lack1947"/>
-      <w:bookmarkEnd w:id="33"/>
+      <w:bookmarkStart w:id="32" w:name="ref-lack1947"/>
+      <w:bookmarkEnd w:id="31"/>
       <w:r>
         <w:t>Lack, D., 1947. The significance of clutch-size in the partridge (</w:t>
       </w:r>
@@ -2500,8 +2601,8 @@
       <w:pPr>
         <w:pStyle w:val="Bibliography"/>
       </w:pPr>
-      <w:bookmarkStart w:id="35" w:name="ref-lande1980a"/>
-      <w:bookmarkEnd w:id="34"/>
+      <w:bookmarkStart w:id="33" w:name="ref-lande1980a"/>
+      <w:bookmarkEnd w:id="32"/>
       <w:r>
         <w:t xml:space="preserve">Lande, R., 1980. The genetic covariance between characters maintained by pleiotropic mutations. </w:t>
       </w:r>
@@ -2530,8 +2631,8 @@
       <w:pPr>
         <w:pStyle w:val="Bibliography"/>
       </w:pPr>
-      <w:bookmarkStart w:id="36" w:name="ref-lessells1987"/>
-      <w:bookmarkEnd w:id="35"/>
+      <w:bookmarkStart w:id="34" w:name="ref-lessells1987"/>
+      <w:bookmarkEnd w:id="33"/>
       <w:r>
         <w:t xml:space="preserve">Lessells, C., Boag, P.T., 1987. Unrepeatable repeatabilities: A common mistake. </w:t>
       </w:r>
@@ -2560,8 +2661,8 @@
       <w:pPr>
         <w:pStyle w:val="Bibliography"/>
       </w:pPr>
-      <w:bookmarkStart w:id="37" w:name="ref-mcnamara1996"/>
-      <w:bookmarkEnd w:id="36"/>
+      <w:bookmarkStart w:id="35" w:name="ref-mcnamara1996"/>
+      <w:bookmarkEnd w:id="34"/>
       <w:r>
         <w:t xml:space="preserve">McNamara, J.M., Houston, A.I., 1996. State-dependent life histories. </w:t>
       </w:r>
@@ -2590,8 +2691,8 @@
       <w:pPr>
         <w:pStyle w:val="Bibliography"/>
       </w:pPr>
-      <w:bookmarkStart w:id="38" w:name="ref-meunier2024"/>
-      <w:bookmarkEnd w:id="37"/>
+      <w:bookmarkStart w:id="36" w:name="ref-meunier2024"/>
+      <w:bookmarkEnd w:id="35"/>
       <w:r>
         <w:t xml:space="preserve">Meunier, J., 2024. The biology and social life of earwigs (dermaptera). </w:t>
       </w:r>
@@ -2620,8 +2721,8 @@
       <w:pPr>
         <w:pStyle w:val="Bibliography"/>
       </w:pPr>
-      <w:bookmarkStart w:id="39" w:name="ref-nakagawa2017"/>
-      <w:bookmarkEnd w:id="38"/>
+      <w:bookmarkStart w:id="37" w:name="ref-nakagawa2017"/>
+      <w:bookmarkEnd w:id="36"/>
       <w:r>
         <w:t>Nakagawa, S., Johnson, P.C.D., Schielzeth, H., 2017. The coefficient of determination r</w:t>
       </w:r>
@@ -2659,8 +2760,8 @@
       <w:pPr>
         <w:pStyle w:val="Bibliography"/>
       </w:pPr>
-      <w:bookmarkStart w:id="40" w:name="ref-nakagawa2013"/>
-      <w:bookmarkEnd w:id="39"/>
+      <w:bookmarkStart w:id="38" w:name="ref-nakagawa2013"/>
+      <w:bookmarkEnd w:id="37"/>
       <w:r>
         <w:t xml:space="preserve">Nakagawa, S., Schielzeth, H., 2013. A general and simple method for obtaining R2 from generalized linear mixed‐effects models. </w:t>
       </w:r>
@@ -2689,8 +2790,8 @@
       <w:pPr>
         <w:pStyle w:val="Bibliography"/>
       </w:pPr>
-      <w:bookmarkStart w:id="41" w:name="ref-nakagawa2010"/>
-      <w:bookmarkEnd w:id="40"/>
+      <w:bookmarkStart w:id="39" w:name="ref-nakagawa2010"/>
+      <w:bookmarkEnd w:id="38"/>
       <w:r>
         <w:t xml:space="preserve">Nakagawa, S., Schielzeth, H., 2010. Repeatability for gaussian and non-gaussian data: A practical guide for biologists. </w:t>
       </w:r>
@@ -2719,8 +2820,8 @@
       <w:pPr>
         <w:pStyle w:val="Bibliography"/>
       </w:pPr>
-      <w:bookmarkStart w:id="42" w:name="ref-parker1982"/>
-      <w:bookmarkEnd w:id="41"/>
+      <w:bookmarkStart w:id="40" w:name="ref-parker1982"/>
+      <w:bookmarkEnd w:id="39"/>
       <w:r>
         <w:t xml:space="preserve">Parker, G.A., 1982. Why are there so many tiny sperm? Sperm competition and the maintenance of two sexes. </w:t>
       </w:r>
@@ -2749,8 +2850,8 @@
       <w:pPr>
         <w:pStyle w:val="Bibliography"/>
       </w:pPr>
-      <w:bookmarkStart w:id="43" w:name="ref-peig2010"/>
-      <w:bookmarkEnd w:id="42"/>
+      <w:bookmarkStart w:id="41" w:name="ref-peig2010"/>
+      <w:bookmarkEnd w:id="40"/>
       <w:r>
         <w:t xml:space="preserve">Peig, J., Green, A.J., 2010. The paradigm of body condition: A critical reappraisal of current methods based on mass and length. </w:t>
       </w:r>
@@ -2779,8 +2880,8 @@
       <w:pPr>
         <w:pStyle w:val="Bibliography"/>
       </w:pPr>
-      <w:bookmarkStart w:id="44" w:name="ref-peig2009"/>
-      <w:bookmarkEnd w:id="43"/>
+      <w:bookmarkStart w:id="42" w:name="ref-peig2009"/>
+      <w:bookmarkEnd w:id="41"/>
       <w:r>
         <w:t xml:space="preserve">Peig, J., Green, A.J., 2009. New perspectives for estimating body condition from mass/length data: The scaled mass index as an alternative method. </w:t>
       </w:r>
@@ -2809,8 +2910,8 @@
       <w:pPr>
         <w:pStyle w:val="Bibliography"/>
       </w:pPr>
-      <w:bookmarkStart w:id="45" w:name="ref-vandepol2009"/>
-      <w:bookmarkEnd w:id="44"/>
+      <w:bookmarkStart w:id="43" w:name="ref-vandepol2009"/>
+      <w:bookmarkEnd w:id="42"/>
       <w:r>
         <w:t xml:space="preserve">Pol, M. van de, Wright, J., 2009. A simple method for distinguishing within- versus between-subject effects using mixed models. </w:t>
       </w:r>
@@ -2839,8 +2940,8 @@
       <w:pPr>
         <w:pStyle w:val="Bibliography"/>
       </w:pPr>
-      <w:bookmarkStart w:id="46" w:name="ref-r2013"/>
-      <w:bookmarkEnd w:id="45"/>
+      <w:bookmarkStart w:id="44" w:name="ref-r2013"/>
+      <w:bookmarkEnd w:id="43"/>
       <w:r>
         <w:t>R Core Team, 2025. R: A language and environment for statistical computing.</w:t>
       </w:r>
@@ -2849,8 +2950,8 @@
       <w:pPr>
         <w:pStyle w:val="Bibliography"/>
       </w:pPr>
-      <w:bookmarkStart w:id="47" w:name="ref-reznick2000"/>
-      <w:bookmarkEnd w:id="46"/>
+      <w:bookmarkStart w:id="45" w:name="ref-reznick2000"/>
+      <w:bookmarkEnd w:id="44"/>
       <w:r>
         <w:t xml:space="preserve">Reznick, D., Nunney, L., Tessier, A., 2000. Big houses, big cars, superfleas and the costs of reproduction. </w:t>
       </w:r>
@@ -2879,8 +2980,8 @@
       <w:pPr>
         <w:pStyle w:val="Bibliography"/>
       </w:pPr>
-      <w:bookmarkStart w:id="48" w:name="ref-ricklefs2002"/>
-      <w:bookmarkEnd w:id="47"/>
+      <w:bookmarkStart w:id="46" w:name="ref-ricklefs2002"/>
+      <w:bookmarkEnd w:id="45"/>
       <w:r>
         <w:t xml:space="preserve">Ricklefs, R.E., Wikelski, M., 2002. The physiology/life-history nexus. </w:t>
       </w:r>
@@ -2909,8 +3010,8 @@
       <w:pPr>
         <w:pStyle w:val="Bibliography"/>
       </w:pPr>
-      <w:bookmarkStart w:id="49" w:name="ref-roff1992a"/>
-      <w:bookmarkEnd w:id="48"/>
+      <w:bookmarkStart w:id="47" w:name="ref-roff1992a"/>
+      <w:bookmarkEnd w:id="46"/>
       <w:r>
         <w:lastRenderedPageBreak/>
         <w:t>Roff, D., 1992. Evolution of Life Histories: Theory and Analysis. Chapman &amp; Hall, Inc., New York, NY.</w:t>
@@ -2920,8 +3021,8 @@
       <w:pPr>
         <w:pStyle w:val="Bibliography"/>
       </w:pPr>
-      <w:bookmarkStart w:id="50" w:name="ref-roff2007a"/>
-      <w:bookmarkEnd w:id="49"/>
+      <w:bookmarkStart w:id="48" w:name="ref-roff2007a"/>
+      <w:bookmarkEnd w:id="47"/>
       <w:r>
         <w:t xml:space="preserve">Roff, D.A., Fairbairn, D.J., 2007. The evolution of trade-offs: Where are we? </w:t>
       </w:r>
@@ -2950,8 +3051,8 @@
       <w:pPr>
         <w:pStyle w:val="Bibliography"/>
       </w:pPr>
-      <w:bookmarkStart w:id="51" w:name="ref-schindelin2012"/>
-      <w:bookmarkEnd w:id="50"/>
+      <w:bookmarkStart w:id="49" w:name="ref-schindelin2012"/>
+      <w:bookmarkEnd w:id="48"/>
       <w:r>
         <w:t xml:space="preserve">Schindelin, J., Arganda-Carreras, I., Frise, E., Kaynig, V., Longair, M., Pietzsch, T., Preibisch, S., Rueden, C., Saalfeld, S., Schmid, B., Tinevez, J.-Y., White, D.J., Hartenstein, V., Eliceiri, K., Tomancak, P., Cardona, A., 2012. Fiji: An open-source platform for biological-image analysis. </w:t>
       </w:r>
@@ -2980,8 +3081,8 @@
       <w:pPr>
         <w:pStyle w:val="Bibliography"/>
       </w:pPr>
-      <w:bookmarkStart w:id="52" w:name="ref-simpson1951"/>
-      <w:bookmarkEnd w:id="51"/>
+      <w:bookmarkStart w:id="50" w:name="ref-simpson1951"/>
+      <w:bookmarkEnd w:id="49"/>
       <w:r>
         <w:t xml:space="preserve">Simpson, E.H., 1951. The interpretation of interaction in contingency tables. </w:t>
       </w:r>
@@ -3010,8 +3111,8 @@
       <w:pPr>
         <w:pStyle w:val="Bibliography"/>
       </w:pPr>
-      <w:bookmarkStart w:id="53" w:name="ref-smith1974"/>
-      <w:bookmarkEnd w:id="52"/>
+      <w:bookmarkStart w:id="51" w:name="ref-smith1974"/>
+      <w:bookmarkEnd w:id="50"/>
       <w:r>
         <w:t xml:space="preserve">Smith, C.C., Fretwell, S.D., 1974. The optimal balance between size and number of offspring. </w:t>
       </w:r>
@@ -3040,8 +3141,8 @@
       <w:pPr>
         <w:pStyle w:val="Bibliography"/>
       </w:pPr>
-      <w:bookmarkStart w:id="54" w:name="ref-staerkle2008"/>
-      <w:bookmarkEnd w:id="53"/>
+      <w:bookmarkStart w:id="52" w:name="ref-staerkle2008"/>
+      <w:bookmarkEnd w:id="51"/>
       <w:r>
         <w:t>Staerkle, M., Kölliker, M., 2008. Maternal food regurgitation to nymphs in earwigs (</w:t>
       </w:r>
@@ -3080,8 +3181,8 @@
       <w:pPr>
         <w:pStyle w:val="Bibliography"/>
       </w:pPr>
-      <w:bookmarkStart w:id="55" w:name="ref-stearns1992"/>
-      <w:bookmarkEnd w:id="54"/>
+      <w:bookmarkStart w:id="53" w:name="ref-stearns1992"/>
+      <w:bookmarkEnd w:id="52"/>
       <w:r>
         <w:t>Stearns, S.C., 1992. The Evolution of Life Histories. Oxford University Press.</w:t>
       </w:r>
@@ -3090,8 +3191,8 @@
       <w:pPr>
         <w:pStyle w:val="Bibliography"/>
       </w:pPr>
-      <w:bookmarkStart w:id="56" w:name="ref-stearns1989"/>
-      <w:bookmarkEnd w:id="55"/>
+      <w:bookmarkStart w:id="54" w:name="ref-stearns1989"/>
+      <w:bookmarkEnd w:id="53"/>
       <w:r>
         <w:t xml:space="preserve">Stearns, S.C., 1989. Trade-offs in life-history evolution. </w:t>
       </w:r>
@@ -3120,8 +3221,8 @@
       <w:pPr>
         <w:pStyle w:val="Bibliography"/>
       </w:pPr>
-      <w:bookmarkStart w:id="57" w:name="ref-stoffel2017"/>
-      <w:bookmarkEnd w:id="56"/>
+      <w:bookmarkStart w:id="55" w:name="ref-stoffel2017"/>
+      <w:bookmarkEnd w:id="54"/>
       <w:r>
         <w:t xml:space="preserve">Stoffel, M.A., Nakagawa, S., Schielzeth, H., 2017. RptR: Repeatability estimation and variance decomposition by generalized linear mixed‐effects models. </w:t>
       </w:r>
@@ -3150,8 +3251,8 @@
       <w:pPr>
         <w:pStyle w:val="Bibliography"/>
       </w:pPr>
-      <w:bookmarkStart w:id="58" w:name="ref-tourneur2018"/>
-      <w:bookmarkEnd w:id="57"/>
+      <w:bookmarkStart w:id="56" w:name="ref-tourneur2018"/>
+      <w:bookmarkEnd w:id="55"/>
       <w:r>
         <w:t xml:space="preserve">Tourneur, J.-C., 2018. Factors affecting the egg-laying pattern of </w:t>
       </w:r>
@@ -3190,8 +3291,8 @@
       <w:pPr>
         <w:pStyle w:val="Bibliography"/>
       </w:pPr>
-      <w:bookmarkStart w:id="59" w:name="ref-tourneur1992"/>
-      <w:bookmarkEnd w:id="58"/>
+      <w:bookmarkStart w:id="57" w:name="ref-tourneur1992"/>
+      <w:bookmarkEnd w:id="56"/>
       <w:r>
         <w:t xml:space="preserve">Tourneur, J.-C., Gingras, J., 1992. Egg laying in a northeastern North American (montréal, québec) population of </w:t>
       </w:r>
@@ -3230,8 +3331,8 @@
       <w:pPr>
         <w:pStyle w:val="Bibliography"/>
       </w:pPr>
-      <w:bookmarkStart w:id="60" w:name="ref-vannoordwijk1986"/>
-      <w:bookmarkEnd w:id="59"/>
+      <w:bookmarkStart w:id="58" w:name="ref-vannoordwijk1986"/>
+      <w:bookmarkEnd w:id="57"/>
       <w:r>
         <w:t xml:space="preserve">Van Noordwijk, A.J., Jong, G. de, 1986. Acquisition and allocation of resources: Their influence on variation in life history tactics. </w:t>
       </w:r>
@@ -3260,17 +3361,17 @@
       <w:pPr>
         <w:pStyle w:val="Bibliography"/>
       </w:pPr>
-      <w:bookmarkStart w:id="61" w:name="ref-devillemereuil2013"/>
-      <w:bookmarkEnd w:id="60"/>
-      <w:r>
-        <w:t xml:space="preserve">Villemereuil, P. de, Gimenez, O., Doligez, B., 2013. Comparing parent–offspring regression with frequentist and bayesian animal models to estimate heritability in wild populations: A simulation study for gaussian and binary traits. </w:t>
+      <w:bookmarkStart w:id="59" w:name="ref-westneat2020"/>
+      <w:bookmarkEnd w:id="58"/>
+      <w:r>
+        <w:t xml:space="preserve">Westneat, D.F., Araya-Ajoy, Y.G., Allegue, H., Class, B., Dingemanse, N., Dochtermann, N.A., Garamszegi, L.Z., Martin, J.G.A., Nakagawa, S., Réale, D., Schielzeth, H., 2020. Collision between biological process and statistical analysis revealed by mean centring. </w:t>
       </w:r>
       <w:r>
         <w:rPr>
           <w:i/>
           <w:iCs/>
         </w:rPr>
-        <w:t>Methods Ecol Evol</w:t>
+        <w:t>J Anim Ecol</w:t>
       </w:r>
       <w:r>
         <w:t xml:space="preserve"> </w:t>
@@ -3280,27 +3381,38 @@
           <w:b/>
           <w:bCs/>
         </w:rPr>
-        <w:t>4</w:t>
-      </w:r>
-      <w:r>
-        <w:t>, 260–275.</w:t>
+        <w:t>89</w:t>
+      </w:r>
+      <w:r>
+        <w:t>, 2813–2824.</w:t>
       </w:r>
     </w:p>
     <w:p>
       <w:pPr>
         <w:pStyle w:val="Bibliography"/>
       </w:pPr>
-      <w:bookmarkStart w:id="62" w:name="ref-westneat2020"/>
-      <w:bookmarkEnd w:id="61"/>
-      <w:r>
-        <w:t xml:space="preserve">Westneat, D.F., Araya-Ajoy, Y.G., Allegue, H., Class, B., Dingemanse, N., Dochtermann, N.A., Garamszegi, L.Z., Martin, J.G.A., Nakagawa, S., Réale, D., Schielzeth, H., 2020. Collision between biological process and statistical analysis revealed by mean centring. </w:t>
+      <w:bookmarkStart w:id="60" w:name="ref-wickham2016"/>
+      <w:bookmarkEnd w:id="59"/>
+      <w:r>
+        <w:t>Wickham, H., 2016. ggplot2: Elegant graphics for data analysis. Springer, New York.</w:t>
+      </w:r>
+    </w:p>
+    <w:p>
+      <w:pPr>
+        <w:pStyle w:val="Bibliography"/>
+      </w:pPr>
+      <w:bookmarkStart w:id="61" w:name="ref-winkler1987"/>
+      <w:bookmarkEnd w:id="60"/>
+      <w:r>
+        <w:lastRenderedPageBreak/>
+        <w:t xml:space="preserve">Winkler, D.W., Wallin, K., 1987. Offspring size and number: A life history model linking effort per offspring and total effort. </w:t>
       </w:r>
       <w:r>
         <w:rPr>
           <w:i/>
           <w:iCs/>
         </w:rPr>
-        <w:t>J Anim Ecol</w:t>
+        <w:t>Am Nat</w:t>
       </w:r>
       <w:r>
         <w:t xml:space="preserve"> </w:t>
@@ -3310,38 +3422,27 @@
           <w:b/>
           <w:bCs/>
         </w:rPr>
-        <w:t>89</w:t>
-      </w:r>
-      <w:r>
-        <w:t>, 2813–2824.</w:t>
+        <w:t>129</w:t>
+      </w:r>
+      <w:r>
+        <w:t>, 708–720.</w:t>
       </w:r>
     </w:p>
     <w:p>
       <w:pPr>
         <w:pStyle w:val="Bibliography"/>
       </w:pPr>
-      <w:bookmarkStart w:id="63" w:name="ref-wickham2016"/>
-      <w:bookmarkEnd w:id="62"/>
-      <w:r>
-        <w:lastRenderedPageBreak/>
-        <w:t>Wickham, H., 2016. ggplot2: Elegant graphics for data analysis. Springer, New York.</w:t>
-      </w:r>
-    </w:p>
-    <w:p>
-      <w:pPr>
-        <w:pStyle w:val="Bibliography"/>
-      </w:pPr>
-      <w:bookmarkStart w:id="64" w:name="ref-winkler1987"/>
-      <w:bookmarkEnd w:id="63"/>
-      <w:r>
-        <w:t xml:space="preserve">Winkler, D.W., Wallin, K., 1987. Offspring size and number: A life history model linking effort per offspring and total effort. </w:t>
+      <w:bookmarkStart w:id="62" w:name="ref-zera2001a"/>
+      <w:bookmarkEnd w:id="61"/>
+      <w:r>
+        <w:t xml:space="preserve">Zera, A.J., Harshman, L.G., 2001. The physiology of life history trade-offs in animals. </w:t>
       </w:r>
       <w:r>
         <w:rPr>
           <w:i/>
           <w:iCs/>
         </w:rPr>
-        <w:t>Am Nat</w:t>
+        <w:t>Annu Rev Ecol Syst</w:t>
       </w:r>
       <w:r>
         <w:t xml:space="preserve"> </w:t>
@@ -3351,120 +3452,19 @@
           <w:b/>
           <w:bCs/>
         </w:rPr>
-        <w:t>129</w:t>
-      </w:r>
-      <w:r>
-        <w:t>, 708–720.</w:t>
-      </w:r>
-    </w:p>
-    <w:p>
-      <w:pPr>
-        <w:pStyle w:val="Bibliography"/>
-      </w:pPr>
-      <w:bookmarkStart w:id="65" w:name="ref-zera2001a"/>
-      <w:bookmarkEnd w:id="64"/>
-      <w:r>
-        <w:t xml:space="preserve">Zera, A.J., Harshman, L.G., 2001. The physiology of life history trade-offs in animals. </w:t>
-      </w:r>
-      <w:r>
-        <w:rPr>
-          <w:i/>
-          <w:iCs/>
-        </w:rPr>
-        <w:t>Annu Rev Ecol Syst</w:t>
-      </w:r>
-      <w:r>
-        <w:t xml:space="preserve"> </w:t>
-      </w:r>
-      <w:r>
-        <w:rPr>
-          <w:b/>
-          <w:bCs/>
-        </w:rPr>
         <w:t>32</w:t>
       </w:r>
       <w:r>
         <w:t>, 95–126.</w:t>
       </w:r>
     </w:p>
-    <w:bookmarkEnd w:id="18"/>
-    <w:bookmarkEnd w:id="65"/>
+    <w:bookmarkEnd w:id="16"/>
+    <w:bookmarkEnd w:id="62"/>
     <w:p>
       <w:pPr>
         <w:pStyle w:val="BodyText"/>
       </w:pPr>
-    </w:p>
-    <w:p>
-      <w:pPr>
-        <w:pStyle w:val="BodyText"/>
-      </w:pPr>
-    </w:p>
-    <w:p>
-      <w:pPr>
-        <w:pStyle w:val="BodyText"/>
-      </w:pPr>
-    </w:p>
-    <w:p>
-      <w:pPr>
-        <w:pStyle w:val="BodyText"/>
-      </w:pPr>
-    </w:p>
-    <w:p>
-      <w:pPr>
-        <w:pStyle w:val="BodyText"/>
-      </w:pPr>
-    </w:p>
-    <w:p>
-      <w:pPr>
-        <w:pStyle w:val="BodyText"/>
-      </w:pPr>
-    </w:p>
-    <w:p>
-      <w:pPr>
-        <w:pStyle w:val="BodyText"/>
-      </w:pPr>
-    </w:p>
-    <w:p>
-      <w:pPr>
-        <w:pStyle w:val="BodyText"/>
-      </w:pPr>
-    </w:p>
-    <w:p>
-      <w:pPr>
-        <w:pStyle w:val="BodyText"/>
-      </w:pPr>
-    </w:p>
-    <w:p>
-      <w:pPr>
-        <w:pStyle w:val="BodyText"/>
-      </w:pPr>
-    </w:p>
-    <w:p>
-      <w:pPr>
-        <w:pStyle w:val="BodyText"/>
-      </w:pPr>
-    </w:p>
-    <w:p>
-      <w:pPr>
-        <w:pStyle w:val="BodyText"/>
-      </w:pPr>
-    </w:p>
-    <w:p>
-      <w:pPr>
-        <w:pStyle w:val="BodyText"/>
-      </w:pPr>
-    </w:p>
-    <w:p>
-      <w:pPr>
-        <w:pStyle w:val="BodyText"/>
-      </w:pPr>
-    </w:p>
-    <w:p>
-      <w:pPr>
-        <w:pStyle w:val="BodyText"/>
-      </w:pPr>
-      <w:r>
-        <w:lastRenderedPageBreak/>
+      <w:r>
         <w:t>##Figures</w:t>
       </w:r>
     </w:p>
@@ -3476,7 +3476,7 @@
         <w:tblLook w:val="0000" w:firstRow="0" w:lastRow="0" w:firstColumn="0" w:lastColumn="0" w:noHBand="0" w:noVBand="0"/>
       </w:tblPr>
       <w:tblGrid>
-        <w:gridCol w:w="9620"/>
+        <w:gridCol w:w="9404"/>
       </w:tblGrid>
       <w:tr>
         <w:tc>
@@ -3488,28 +3488,28 @@
               <w:pStyle w:val="Compact"/>
               <w:jc w:val="center"/>
             </w:pPr>
-            <w:bookmarkStart w:id="66" w:name="fig-one"/>
+            <w:bookmarkStart w:id="63" w:name="fig-one"/>
             <w:r>
               <w:rPr>
                 <w:noProof/>
               </w:rPr>
               <w:drawing>
-                <wp:inline distT="0" distB="0" distL="0" distR="0" wp14:anchorId="374B616A" wp14:editId="61E4EB1C">
+                <wp:inline distT="0" distB="0" distL="0" distR="0" wp14:anchorId="688994A5" wp14:editId="01186160">
                   <wp:extent cx="3810000" cy="2540000"/>
                   <wp:effectExtent l="0" t="0" r="0" b="0"/>
-                  <wp:docPr id="86" name="Picture"/>
+                  <wp:docPr id="85" name="Picture"/>
                   <wp:cNvGraphicFramePr/>
                   <a:graphic xmlns:a="http://schemas.openxmlformats.org/drawingml/2006/main">
                     <a:graphicData uri="http://schemas.openxmlformats.org/drawingml/2006/picture">
                       <pic:pic xmlns:pic="http://schemas.openxmlformats.org/drawingml/2006/picture">
                         <pic:nvPicPr>
-                          <pic:cNvPr id="87" name="Picture" descr="figure_1.jpg"/>
+                          <pic:cNvPr id="86" name="Picture" descr="figure_1.jpg"/>
                           <pic:cNvPicPr>
                             <a:picLocks noChangeAspect="1" noChangeArrowheads="1"/>
                           </pic:cNvPicPr>
                         </pic:nvPicPr>
                         <pic:blipFill>
-                          <a:blip r:embed="rId10"/>
+                          <a:blip r:embed="rId9"/>
                           <a:stretch>
                             <a:fillRect/>
                           </a:stretch>
@@ -3572,7 +3572,7 @@
               </m:sSub>
             </m:oMath>
             <w:r>
-              <w:t xml:space="preserve"> = -0.01, 95% CrI (-0.06, 0.05). (b) Between-female (strategic) relationship based on female means across broods plotted against standardized between-female deviation in egg number. The black line represents the Bayesian population-level between-female slope (</w:t>
+              <w:t xml:space="preserve"> = -0.01, 95% CrI (-0.06, 0.05). (b) Between-female relationship (i.e., differences in mean allocation strategy) based on female means across broods plotted against standardized between-female deviation in egg number. The black line represents the Bayesian population-level between-female slope (</w:t>
             </w:r>
             <m:oMath>
               <m:sSub>
@@ -3606,7 +3606,7 @@
             </w:r>
           </w:p>
         </w:tc>
-        <w:bookmarkEnd w:id="66"/>
+        <w:bookmarkEnd w:id="63"/>
       </w:tr>
     </w:tbl>
     <w:p>
@@ -3625,7 +3625,7 @@
         <w:tblLook w:val="0000" w:firstRow="0" w:lastRow="0" w:firstColumn="0" w:lastColumn="0" w:noHBand="0" w:noVBand="0"/>
       </w:tblPr>
       <w:tblGrid>
-        <w:gridCol w:w="9620"/>
+        <w:gridCol w:w="9404"/>
       </w:tblGrid>
       <w:tr>
         <w:tc>
@@ -3637,29 +3637,29 @@
               <w:pStyle w:val="Compact"/>
               <w:jc w:val="center"/>
             </w:pPr>
-            <w:bookmarkStart w:id="67" w:name="fig-two"/>
+            <w:bookmarkStart w:id="64" w:name="fig-two"/>
             <w:r>
               <w:rPr>
                 <w:noProof/>
               </w:rPr>
               <w:lastRenderedPageBreak/>
               <w:drawing>
-                <wp:inline distT="0" distB="0" distL="0" distR="0" wp14:anchorId="261C7594" wp14:editId="2CD77187">
+                <wp:inline distT="0" distB="0" distL="0" distR="0" wp14:anchorId="1F5C54C7" wp14:editId="342D12EA">
                   <wp:extent cx="3810000" cy="2540000"/>
                   <wp:effectExtent l="0" t="0" r="0" b="0"/>
-                  <wp:docPr id="90" name="Picture"/>
+                  <wp:docPr id="89" name="Picture"/>
                   <wp:cNvGraphicFramePr/>
                   <a:graphic xmlns:a="http://schemas.openxmlformats.org/drawingml/2006/main">
                     <a:graphicData uri="http://schemas.openxmlformats.org/drawingml/2006/picture">
                       <pic:pic xmlns:pic="http://schemas.openxmlformats.org/drawingml/2006/picture">
                         <pic:nvPicPr>
-                          <pic:cNvPr id="91" name="Picture" descr="figure_2.jpg"/>
+                          <pic:cNvPr id="90" name="Picture" descr="figure_2.jpg"/>
                           <pic:cNvPicPr>
                             <a:picLocks noChangeAspect="1" noChangeArrowheads="1"/>
                           </pic:cNvPicPr>
                         </pic:nvPicPr>
                         <pic:blipFill>
-                          <a:blip r:embed="rId11"/>
+                          <a:blip r:embed="rId10"/>
                           <a:stretch>
                             <a:fillRect/>
                           </a:stretch>
@@ -3691,23 +3691,32 @@
               <w:pStyle w:val="ImageCaption"/>
               <w:spacing w:before="200"/>
             </w:pPr>
-            <w:bookmarkStart w:id="68" w:name="OLE_LINK5"/>
             <w:r>
-              <w:t>Figure 2: Clutch-specific variance components of egg size. (a) Between-female variance in egg size for first and second clutches, estimated from a hierarchical Bayesian model with clutch-specific female effects. (b) Within-clutch (egg-to-egg) variance for first and second clutches. Grey points represent posterior draws, black points indicate posterior medians, and vertical lines denote 95% credible intervals. Between-female variance did not differ clearly between clutches, whereas within-clutch variance was greater in second clutches.</w:t>
+              <w:t xml:space="preserve">Figure 2: </w:t>
             </w:r>
-            <w:bookmarkEnd w:id="68"/>
+            <w:bookmarkStart w:id="65" w:name="OLE_LINK2"/>
+            <w:r>
+              <w:t xml:space="preserve">Clutch-specific variance components of egg size. (a) Between-female variance in egg size for first and second clutches, estimated from a hierarchical Bayesian model with clutch-specific female effects. (b) Within-clutch (egg-to-egg) variance for first and second clutches. </w:t>
+            </w:r>
+            <w:r>
+              <w:t>Orange</w:t>
+            </w:r>
+            <w:r>
+              <w:t xml:space="preserve"> points represent posterior draws, black points indicate posterior medians, and vertical lines denote 95% credible intervals. Between-female variance did not differ clearly between clutches, whereas within-clutch variance was greater in second clutches.</w:t>
+            </w:r>
+            <w:bookmarkEnd w:id="65"/>
           </w:p>
         </w:tc>
-        <w:bookmarkEnd w:id="67"/>
+        <w:bookmarkEnd w:id="64"/>
       </w:tr>
-      <w:bookmarkEnd w:id="16"/>
+      <w:bookmarkEnd w:id="14"/>
     </w:tbl>
     <w:p/>
     <w:sectPr>
-      <w:headerReference w:type="even" r:id="rId12"/>
-      <w:headerReference w:type="default" r:id="rId13"/>
-      <w:footerReference w:type="even" r:id="rId14"/>
-      <w:footerReference w:type="default" r:id="rId15"/>
+      <w:headerReference w:type="even" r:id="rId11"/>
+      <w:headerReference w:type="default" r:id="rId12"/>
+      <w:footerReference w:type="even" r:id="rId13"/>
+      <w:footerReference w:type="default" r:id="rId14"/>
       <w:pgSz w:w="12240" w:h="15840"/>
       <w:pgMar w:top="1531" w:right="1418" w:bottom="2024" w:left="1418" w:header="737" w:footer="737" w:gutter="0"/>
       <w:lnNumType w:countBy="1" w:restart="continuous"/>
@@ -4147,7 +4156,7 @@
   <w:abstractNum w:abstractNumId="10" w15:restartNumberingAfterBreak="0">
     <w:nsid w:val="0000A990"/>
     <w:multiLevelType w:val="multilevel"/>
-    <w:tmpl w:val="996EB288"/>
+    <w:tmpl w:val="CD024254"/>
     <w:lvl w:ilvl="0">
       <w:numFmt w:val="bullet"/>
       <w:lvlText w:val=" "/>
@@ -4536,7 +4545,7 @@
   <w:num w:numId="13" w16cid:durableId="442194333">
     <w:abstractNumId w:val="12"/>
   </w:num>
-  <w:num w:numId="14" w16cid:durableId="967587572">
+  <w:num w:numId="14" w16cid:durableId="2123646826">
     <w:abstractNumId w:val="10"/>
   </w:num>
 </w:numbering>
@@ -6241,16 +6250,4 @@
   </a:objectDefaults>
   <a:extraClrSchemeLst/>
 </a:theme>
-</file>
-
-<file path=customXml/item1.xml><?xml version="1.0" encoding="utf-8"?>
-<b:Sources xmlns:b="http://schemas.openxmlformats.org/officeDocument/2006/bibliography" xmlns="http://schemas.openxmlformats.org/officeDocument/2006/bibliography" SelectedStyle="/APASixthEditionOfficeOnline.xsl" StyleName="APA" Version="6"/>
-</file>
-
-<file path=customXml/itemProps1.xml><?xml version="1.0" encoding="utf-8"?>
-<ds:datastoreItem xmlns:ds="http://schemas.openxmlformats.org/officeDocument/2006/customXml" ds:itemID="{7A7E888E-DECB-BC42-AF66-830CA51AE268}">
-  <ds:schemaRefs>
-    <ds:schemaRef ds:uri="http://schemas.openxmlformats.org/officeDocument/2006/bibliography"/>
-  </ds:schemaRefs>
-</ds:datastoreItem>
 </file>
</xml_diff>

<commit_message>
Re-submission of revision after meeting submission requirements of Current Zoology.
</commit_message>
<xml_diff>
--- a/2025_earwig_fecundity_revised.docx
+++ b/2025_earwig_fecundity_revised.docx
@@ -158,7 +158,7 @@
         <w:pStyle w:val="BodyText"/>
       </w:pPr>
       <w:r>
-        <w:t xml:space="preserve">Despite the foundational importance of the size–number trade-off, empirical tests rarely partition covariance into within- and among-individual components to distinguish allocation from acquisition effects. Here, Here, I address this gap using the European earwig, </w:t>
+        <w:t xml:space="preserve">Despite the foundational importance of the size–number trade-off, empirical tests rarely partition covariance into within- and among-individual components to distinguish allocation from acquisition effects. Here, I address this gap using the European earwig, </w:t>
       </w:r>
       <w:r>
         <w:rPr>
@@ -168,11 +168,11 @@
         <w:t>Forficula auricularia</w:t>
       </w:r>
       <w:r>
-        <w:t xml:space="preserve">, a species that allows repeated measures of reproductive investment in females but whose pattern of allocation between egg number and size remains unclear (Koch and Meunier, </w:t>
+        <w:t xml:space="preserve">, a species that allows repeated measures of reproductive investment within females but whose pattern of allocation to egg number and size is unclear (Koch and Meunier, 2014). Female </w:t>
       </w:r>
       <w:r>
         <w:lastRenderedPageBreak/>
-        <w:t>2014). Female earwigs lay a clutch within a short temporal window in a subterranean burrow (Meunier, 2024) and provide extended maternal care (Meunier, 2024; Staerkle and Kölliker, 2008). In Québec populations, environmental constraints typically render females effectively semelparous (Tourneur, 2018), but under favourable laboratory conditions, they can produce a second clutch. This system, therefore, enables direct estimation of within-female covariance across successive reproductive bouts. I test three predictions derived from acquisition–allocation theory (Van Noordwijk and Jong, 1986; see also Reznick, Nunney, and Tessier, 2000). First, if variance in resource acquisition among females exceeds variance in allocation strategy, then egg size and egg number should exhibit substantial repeatability and a positive among-individual correlation, whereas the within-individual correlation should be negative, revealing a masked allocation trade-off. Second, if maternal fitness is maximised at a particular offspring size or number (Smith and Fretwell, 1974), then one trait should remain relatively invariant across clutches while the other adjusts between reproductive bouts (Winkler and Wallin, 1987). Third, if reproductive investment is structured differently across bouts, then variance in egg size may differ between first and second clutches at both the among-female and within-clutch levels (e.g. Hargitai et al., 2005), providing further insight into how selection shapes the distribution of maternal investment across reproductive events.</w:t>
+        <w:t>earwigs lay a clutch within a short temporal window in a subterranean burrow (Meunier, 2024) and provide extended maternal care (Meunier, 2024; Staerkle and Kölliker, 2008). In Quebec populations, environmental constraints typically render females effectively semelparous (Tourneur, 2018), but under favourable laboratory conditions, they can produce a second clutch. This system, therefore, enables direct estimation of within-female covariance across successive reproductive bouts. I test three predictions derived from acquisition–allocation theory (Van Noordwijk and Jong, 1986; see also Reznick, Nunney, and Tessier, 2000). First, if variance in resource acquisition among females exceeds variance in allocation strategy, then egg size and egg number should exhibit substantial repeatability and a positive among-individual correlation, whereas the within-individual correlation should be negative, revealing a masked allocation trade-off. Second, if maternal fitness is maximised at a particular offspring size or number (Smith and Fretwell, 1974), then one trait should remain relatively invariant across clutches while the other adjusts between reproductive bouts (Winkler and Wallin, 1987). Third, if reproductive investment is structured differently across bouts, then variance in egg size may differ between first and second clutches at both the among-female and within-clutch levels (e.g. Hargitai et al., 2005), providing further insight into how selection shapes the distribution of maternal investment across reproductive events.</w:t>
       </w:r>
     </w:p>
     <w:p>
@@ -210,7 +210,7 @@
         <w:pStyle w:val="BodyText"/>
       </w:pPr>
       <w:r>
-        <w:t>Females were checked daily for oviposition. When a female laid eggs, I recorded the date, collected all eggs from the sand, and placed them on filter paper in a new Petri dish. The eggs were then photographed under a Leica S6D stereo microscope (Leica Microsystems Inc., Concord, ON, Canada) at 0.68x magnification using Enersight software (Leica Microsystems Inc., Concord, ON, Canada), which automatically adds a scale bar to the photo. Eggs were then discarded.</w:t>
+        <w:t>Females were checked daily for oviposition. When a female laid eggs, I recorded the date and collected all eggs from the sand and placed them on filter paper in a new Petri dish. The eggs were then photographed under a Leica S6D stereo microscope (Leica Microsystems Inc., Concord, ON, Canada) at 0.68x magnification using Enersight software (Leica Microsystems Inc., Concord, ON, Canada), which automatically adds a scale bar to the photo. Eggs were then discarded.</w:t>
       </w:r>
     </w:p>
     <w:p>
@@ -218,11 +218,11 @@
         <w:pStyle w:val="BodyText"/>
       </w:pPr>
       <w:r>
-        <w:t xml:space="preserve">To stimulate females to lay a second clutch of eggs, I recreated a brief spring period during which they were allowed to accumulate resources for egg production and replenish their sperm stores. To achieve this, females that had recently oviposited were placed in a new Petri dish containing a cotton-plugged water vial, TetraMin Tropical fish flakes, and a shelter consisting of four 4 cm-long straws (Blowholes, Markham, Canada) glued together. These Petri dishes were placed in a </w:t>
+        <w:t xml:space="preserve">To stimulate females to lay a second clutch of eggs, I recreated a brief period of spring where they were allowed to accumulate resources for egg production and replenish their sperm stores. To achieve this, females that had recently oviposited were placed in a new Petri dish containing a cotton-plugged water vial, TetraMin Tropical fish flakes, and a shelter consisting of four 4 cm-long straws (Blowholes, Markham, Canada) glued together. These Petri dishes were placed in a </w:t>
       </w:r>
       <w:r>
         <w:lastRenderedPageBreak/>
-        <w:t>23 °C incubator with a 12L:12D light: dark cycle. Females were maintained under these conditions for two weeks, at which time a haphazardly chosen stock male from our colony was placed with her. The pair was kept together for a week, after which a new stock male replaced the original, and the new pair was kept together for another week. Females were then transferred to the 10 °C incubator and treated as previously until they laid their second clutch, at which point their eggs were photographed. Females were euthanised by freezing after laying their second clutch, and their pronotum was photographed as described above. Because female fecundity is often related to body size in insects (Honek, 1993) and could thus possibly explain a positive among-female covariance between egg number and size, I measured two proxies of size, pronotum length and body mass. Females were weighed to the nearest 0.01 mg using a Sartorius Secura 224-1S analytical balance. Females were weighed three times, with each weighing bout separated by four days. I used Fiji image analysis software (Schindelin et al., 2012) to measure the length of the female pronotum to the nearest 0.001 mm three times, with each measurement separated by 4 days. I used the same procedure to measure the perimeter of each egg.</w:t>
+        <w:t>23 °C incubator with a 12L:12D light: dark cycle. Females were maintained under these conditions for two weeks, at which time a haphazardly chosen stock male from our colony was placed with her. The pair was kept together for a week, after which a new stock male replaced the original male, and that pair was kept together for another week. Females were then transferred to the 10 °C incubator and treated as previously until they laid their second clutch, at which point their eggs were photographed. Females were euthanised by freezing after laying their second clutch, and their pronotum was photographed as described above. Because female fecundity is often related to body size in insects (Honek, 1993) and could thus possibly explain a positive among-female covariance between egg number and size, I measured two proxies of size, pronotum length and body mass. Females were weighed to the nearest 0.01 mg using a Sartorius Secura 224-1S analytical balance. Females were weighed three times, with each weighing bout separated by four days. I used Fiji image analysis software (Schindelin et al., 2012) to measure the length of the female pronotum to the nearest 0.001 mm three times, with each measurement separated by 4 days. I used the same procedure to measure the perimeter of each egg.</w:t>
       </w:r>
     </w:p>
     <w:p>
@@ -343,7 +343,7 @@
       </w:r>
       <w:r>
         <w:lastRenderedPageBreak/>
-        <w:t>random effects, whereas covariance arising from within-female variation is captured by the fixed within-female component of egg number. The fixed between-female component estimates how mean egg size varies with mean egg number across females, thereby capturing systematic (i.e., explained) differences in allocation strategy among females. In contrast, the fixed within-female component tests whether egg size changes plastically when a female produces more or fewer eggs than her own mean. The correlation between female-level intercepts represents residual (latent) covariance among baseline trait values that is not explained by the fixed effects, including the between-female allocation relationship. Thus, the between-female slope tests whether females diverge in their mean allocation strategy (i.e., whether females that consistently produce more eggs also produce smaller eggs), whereas the intercept correlation quantifies any remaining covariance between egg number and egg size after accounting for these effects. Continuous predictors were standardized prior to analysis, such that standardized coefficients represent the expected change in egg size (in standard deviation units) associated with a one standard deviation change in egg number at the relevant hierarchical level.</w:t>
+        <w:t>random effects, whereas covariance arising from within-female variation is captured by the fixed within-female component of egg number. The fixed between-female component estimates how mean egg size varies with mean egg number across females, and thus captures systematic (i.e., explained) differences in allocation strategy among females. In contrast, the fixed within-female component tests whether egg size changes plastically when a female produces more or fewer eggs than her own mean. The correlation between female-level intercepts represents residual (latent) covariance among baseline trait values that is not explained by the fixed effects, including the between-female allocation relationship. Thus, the between-female slope tests whether females diverge in their mean allocation strategy (i.e., whether females that consistently produce more eggs also produce smaller eggs), whereas the intercept correlation quantifies any remaining covariance between egg number and egg size after accounting for these effects. Continuous predictors were standardized prior to analysis, such that standardized coefficients represent the expected change in egg size (in standard deviation units) associated with a one standard deviation change in egg number at the relevant hierarchical level.</w:t>
       </w:r>
     </w:p>
     <w:p>
@@ -1206,7 +1206,7 @@
       </w:r>
       <w:r>
         <w:lastRenderedPageBreak/>
-        <w:t xml:space="preserve">would be moderate in magnitude. Intercepts were given normal priors scaled to each trait (egg number: Normal(0, 5); mean egg size: Normal(3.5, 1); standardized egg size: Normal(0, 0.5)). Among-female variation was assigned exponential priors (Exponential(1–2)), which favour small but non-zero individual differences. Residual variance (Gaussian models) and the negative binomial dispersion parameter were given Exponential(1) priors. Correlations among female-level random effects were regularized using an LKJ(2) prior to avoid overestimating trait associations. Posterior distributions were obtained using six Markov chains each with 4,000 iterations, including 1,000 warm-up iterations, and convergence was assessed using </w:t>
+        <w:t xml:space="preserve">would be moderate in magnitude. Intercepts were given normal priors scaled to each trait (egg number: Normal(0, 5); mean egg size: Normal(3.5, 1); standardized egg size: Normal(0, 0.5)). Among-female variation was assigned exponential priors (Exponential(1–2)), which favour small but non-zero individual differences. Residual variance (Gaussian models) and the negative binomial dispersion parameter were given Exponential(1) priors. Correlations among female-level random effects were regularized using an LKJ(2) prior to avoid overestimating trait associations. Posterior distributions were obtained using six Markov chains with 4,000 iterations per chain, including 1,000 warm-up iterations, and convergence was assessed using </w:t>
       </w:r>
       <m:oMath>
         <m:acc>
@@ -1795,7 +1795,25 @@
           <w:rPr>
             <w:rFonts w:ascii="Cambria Math" w:hAnsi="Cambria Math"/>
           </w:rPr>
-          <m:t>% CrI</m:t>
+          <m:t>%</m:t>
+        </m:r>
+        <m:r>
+          <m:rPr>
+            <m:sty m:val="p"/>
+          </m:rPr>
+          <w:rPr>
+            <w:rFonts w:ascii="Cambria Math" w:hAnsi="Cambria Math"/>
+          </w:rPr>
+          <m:t xml:space="preserve"> </m:t>
+        </m:r>
+        <m:r>
+          <m:rPr>
+            <m:sty m:val="p"/>
+          </m:rPr>
+          <w:rPr>
+            <w:rFonts w:ascii="Cambria Math" w:hAnsi="Cambria Math"/>
+          </w:rPr>
+          <m:t>CrI</m:t>
         </m:r>
         <m:r>
           <w:rPr>
@@ -1976,7 +1994,7 @@
         <w:pStyle w:val="FirstParagraph"/>
       </w:pPr>
       <w:r>
-        <w:t>Life-history theory predicts a trade-off between offspring size and number because both traits draw from a finite pool of reproductive resources (Lack, 1947; Roff, 1992; Smith and Fretwell, 1974; Stearns, 1992). Yet, as emphasised by van Noordwijk and de Jong (1992), phenotypic correlations need not directly reveal allocation trade-offs, because variation in resource acquisition can obscure underlying allocation rules (Careau and Wilson, 2017; Johnson and Nassrullah, 2024). This acquisition–allocation framework has become central to interpreting life-history covariance (Houle, 1991; Reznick, Nunney, and Tessier, 2000). By partitioning covariance into within- and among-female components, my results show that the size–number trade-off in this population of earwigs is modestly expressed among females but absent within them, illustrating how hierarchical structure shapes the detectability of life-history trade-offs (Careau and Wilson, 2017; Dingemanse and Dochtermann, 2013; Pol and Wright, 2009; Westneat et al., 2020).</w:t>
+        <w:t>Life-history theory predicts a trade-off between offspring size and number because both traits draw from a finite pool of reproductive resources (Lack, 1947; Roff, 1992; Smith and Fretwell, 1974; Stearns, 1992). Yet, as emphasised by van Noordwijk and de Jong (1992), phenotypic correlations need not directly reveal allocation trade-offs, because variation in resource acquisition can obscure underlying allocation rules (Careau and Wilson, 2017; Johnson and Nassrullah, 2024). This acquisition–allocation framework has become central to interpreting life-history covariance (Houle, 1991; Reznick, Nunney, and Tessier, 2000). By partitioning covariance into within- and among-female components, my results show that the size–number trade-off in this population of earwigs is at most weakly expressed among females and absent within them, illustrating how hierarchical structure shapes the detectability of life-history trade-offs (Careau and Wilson, 2017; Dingemanse and Dochtermann, 2013; Pol and Wright, 2009; Westneat et al., 2020).</w:t>
       </w:r>
     </w:p>
     <w:p>
@@ -1984,11 +2002,11 @@
         <w:pStyle w:val="BodyText"/>
       </w:pPr>
       <w:r>
-        <w:t xml:space="preserve">At the phenotypic level, egg size and egg number were uncorrelated in my earwig population, consistent with Koch and Meunier (2014). Under the framework of van Noordwijk and de Jong (1986), such phenotypic independence is expected when variation in resource acquisition obscures underlying allocation trade-offs. After hierarchical decomposition, however, a weak negative association emerged at the among-female level: females that produced more eggs on </w:t>
+        <w:t xml:space="preserve">At the phenotypic level, egg size and egg number were uncorrelated in my earwig population, consistent with Koch and Meunier (2014). Under the framework of van Noordwijk and de Jong (1986), such phenotypic independence is expected when variation in resource acquisition obscures underlying allocation trade-offs. After hierarchical decomposition, a weak negative association emerged at the among-female level: females that produced more eggs on average </w:t>
       </w:r>
       <w:r>
         <w:lastRenderedPageBreak/>
-        <w:t>average tended to lay slightly smaller eggs. This pattern is captured by the fixed between-female slope and reflects differences among females in their mean allocation strategy. In contrast, the correlation between female-level intercepts—representing residual (latent) covariance after accounting for this allocation relationship—was highly uncertain and overlapped zero, indicating little evidence for additional integration between traits beyond that explained by differences in mean allocation strategy (Roff and Fairbairn, 2007; Stearns, 1989).</w:t>
+        <w:t>tended to lay slightly smaller eggs. This pattern is captured by the fixed between-female slope and reflects systematic differences among females in their mean allocation strategy. In contrast, the correlation between female-level intercepts—representing residual (latent) covariance after accounting for this allocation relationship—was highly uncertain and overlapped zero, indicating little evidence for additional integration between traits beyond that explained by differences in mean allocation strategy (Roff and Fairbairn, 2007; Stearns, 1989).</w:t>
       </w:r>
     </w:p>
     <w:p>
@@ -1996,7 +2014,7 @@
         <w:pStyle w:val="BodyText"/>
       </w:pPr>
       <w:r>
-        <w:t>In contrast, there was no evidence for a within-female plastic trade-off. Although each female contributed only two broods, the posterior distribution of the within-female slope was tightly centered on zero, suggesting that any within-female effect, if present, is small. Females did not reduce egg size when producing more eggs than their own average; instead, egg number and egg size shifted together across broods. This pattern is consistent with state-dependent life-history models in which allocation rules remain relatively stable while total resource state fluctuates across reproductive bouts (Houston and McNamara, 1999; McNamara and Houston, 1996). Rather than dynamically reallocating resources between offspring size and number, females appear to exhibit clutch-level shifts driven by overall energetic state.</w:t>
+        <w:t>Crucially, these results must be interpreted in light of the variance structure of egg number. Egg number exhibited near-zero repeatability, indicating that there is very little residual among-female variation in clutch size once distribution-level variance is taken into account. At first glance, this may appear inconsistent with the presence of an among-female association. However, repeatability and the between-female slope quantify different components of variation. Repeatability reflects the proportion of unexplained (random-effect) variance attributable to consistent differences among females, whereas the between-female slope represents a systematic (fixed-effect) relationship among female means. Thus, even when residual among-female variance is very small, it is still possible to detect a weak association among female means. In this case, the near-zero repeatability indicates that clutch size does not vary consistently among females, while the between-female slope suggests only minor differences in average reproductive output that covary weakly with egg size. Taken together, these results indicate that the apparent among-female trade-off is weak and arises from small differences in female means rather than from substantial or repeatable variation in clutch size. Accordingly, there is limited evidence for stable divergence in allocation strategy among females.</w:t>
       </w:r>
     </w:p>
     <w:p>
@@ -2004,11 +2022,8 @@
         <w:pStyle w:val="BodyText"/>
       </w:pPr>
       <w:r>
-        <w:t xml:space="preserve">Notably, egg number was not correlated with female structural size or body condition (i.e. scaled mass), indicating that persistent differences in morphology do not explain clutch-size variation. If stable acquisition differences were driving among-female variation, we would expect egg number to show repeatability and to covary with these morphological size/condition indicators. The absence of such patterns weakens the interpretation that persistent acquisition differences—at least as reflected by morphology—underlie among-female differences in reproductive output. </w:t>
-      </w:r>
-      <w:r>
         <w:lastRenderedPageBreak/>
-        <w:t>Instead, clutch size appears predominantly state-sensitive and influenced by clutch-level constraints.</w:t>
+        <w:t>In contrast, there was no evidence for a within-female plastic trade-off. Although each female contributed only two broods, the posterior distribution of the within-female slope was tightly centered on zero, suggesting that any within-female effect, if present, is small. Females did not reduce egg size when producing more eggs than their own average; instead, egg number and egg size shifted together across broods. This pattern is consistent with state-dependent life-history models in which allocation rules remain relatively stable while total resource state fluctuates across reproductive bouts (Houston and McNamara, 1999; McNamara and Houston, 1996). Rather than dynamically reallocating resources between offspring size and number, females appear to exhibit clutch-level shifts driven by overall energetic state. Together, these results suggest that clutch size is primarily state-dependent and influenced by transient physiological or structural constraints, whereas egg size reflects a more stable component of reproductive allocation.</w:t>
       </w:r>
     </w:p>
     <w:p>
@@ -2016,7 +2031,7 @@
         <w:pStyle w:val="BodyText"/>
       </w:pPr>
       <w:r>
-        <w:t>This interpretation also helps explain the pronounced decline in second clutches. That second clutches comprised both fewer and smaller eggs is consistent with previous work in North American and European populations (Koch and Meunier, 2014; Tourneur and Gingras, 1992). Tourneur and Gingras (1992) proposed that some ovarioles become non-functional after the first clutch, thereby reducing egg production capacity. Structural limitation could therefore contribute to smaller second clutches. However, structural reduction alone cannot explain the simultaneous decline in egg size. Under a strict allocation trade-off, a reduction in egg number would be expected to lead to compensatory increases in egg size if total resources remain constant. Instead, both traits declined, indicating that females likely entered the second reproductive bout with diminished resource reserves in addition to any physiological constraint. In the wild, females accumulate resources for months before producing their first clutch, whereas in the laboratory, they had only a brief interval (approx. one month) to replenish reserves before producing the second. Late reproduction, therefore, likely reflects both reduced energetic state and structural limitation.</w:t>
+        <w:t>Notably, egg number was not correlated with female structural size or body condition (i.e. scaled mass), indicating that persistent differences in morphology do not explain clutch-size variation. If stable acquisition differences were driving among-female variation, we would expect egg number to show repeatability and to covary with these morphological size/condition indicators. The absence of such patterns weakens the interpretation that persistent acquisition differences—at least as reflected by morphology—underlie among-female differences in reproductive output. Instead, clutch size appears predominantly state-sensitive and influenced by clutch-level constraints.</w:t>
       </w:r>
     </w:p>
     <w:p>
@@ -2024,11 +2039,11 @@
         <w:pStyle w:val="BodyText"/>
       </w:pPr>
       <w:r>
-        <w:t xml:space="preserve">The hierarchical variance structure supports a constraint-based interpretation of clutch-size variation. Egg size exhibited moderate repeatability across broods, indicating stable differences among females in mean per-offspring investment. In contrast, egg number showed extremely low repeatability, with most of the variance arising from brood effects and distribution-level variation rather than from persistent female differences. The absence of any association between egg number and female structural size or condition, together with the near-zero repeatability of clutch </w:t>
+        <w:t xml:space="preserve">This interpretation also helps explain the pronounced decline in second clutches. That second clutches comprised both fewer and smaller eggs is consistent with previous work in North </w:t>
       </w:r>
       <w:r>
         <w:lastRenderedPageBreak/>
-        <w:t>size, suggests that variation in egg number is not driven by stable differences in resource acquisition but instead reflects transient physiological state or clutch-level constraint. Thus, clutch size appears primarily state-sensitive, whereas egg size reflects a more stable allocation strategy (Houston and McNamara, 1999; McNamara and Houston, 1996). At the same time, within-clutch variance increased substantially in second broods, indicating reduced developmental precision under diminished resource availability. Structural and energetic constraints, therefore, appear to reduce total reproductive output while leaving mean allocation rules largely intact (Ricklefs and Wikelski, 2002; Zera and Harshman, 2001).</w:t>
+        <w:t>American and European populations (Koch and Meunier, 2014; Tourneur and Gingras, 1992). Tourneur and Gingras (1992) proposed that some ovarioles become non-functional after the first clutch, thereby reducing egg production capacity. Structural limitation could therefore contribute to smaller second clutches. However, structural reduction alone cannot explain the simultaneous decline in egg size. Under a strict allocation trade-off, a reduction in egg number would be expected to lead to compensatory increases in egg size if total resources remain constant. Instead, both traits declined, indicating that females likely entered the second reproductive bout with diminished resource reserves in addition to any physiological constraint. In the wild, females accumulate resources for months before producing their first clutch, whereas in the laboratory, they had only a brief interval (approx. one month) to replenish reserves before producing the second. Late reproduction, therefore, likely reflects both reduced energetic state and structural limitation.</w:t>
       </w:r>
     </w:p>
     <w:p>
@@ -2036,7 +2051,11 @@
         <w:pStyle w:val="BodyText"/>
       </w:pPr>
       <w:r>
-        <w:t>These patterns have broader implications for phenotypic integration and evolutionary potential. Repeatability places an upper bound on heritability (Falconer and MacKay, 1996; Lessells and Boag, 1987; Nakagawa and Schielzeth, 2013; Nakagawa and Schielzeth, 2010; but see Dohm, 2002). The moderate repeatability of egg size suggests that selection could act on persistent differences in mean provisioning, whereas the extremely low repeatability of egg number implies that clutch size may respond primarily to short-term environmental or physiological conditions (i.e. reduced ovariole function). The weak intercept correlation further indicates that egg size and egg number are only loosely integrated, consistent with models in which traits differ in their sensitivity to resource state versus allocation strategy (Houle, 1991). In this system, per-offspring investment appears more evolutionarily stable than the total number of offspring.</w:t>
+        <w:t xml:space="preserve">The hierarchical variance structure supports a constraint-based interpretation of clutch-size variation. Egg size exhibited moderate repeatability across broods, indicating stable differences among females in mean per-offspring investment. In contrast, egg number showed extremely low repeatability, with most variance arising from brood effects and distribution-level variance rather than persistent female differences. The absence of any association between egg number and female structural size or condition, together with the near-zero repeatability of clutch size, suggests that variation in egg number is not driven by stable differences in resource acquisition but instead reflects transient physiological state or clutch-level constraint. Thus, clutch size appears primarily state-sensitive, whereas egg size reflects a more stable allocation strategy (Houston and McNamara, 1999; McNamara and Houston, 1996). At the same time, within-clutch </w:t>
+      </w:r>
+      <w:r>
+        <w:lastRenderedPageBreak/>
+        <w:t>variance increased substantially in second broods, indicating reduced developmental precision under diminished resource availability. Structural and energetic constraints, therefore, appear to reduce total reproductive output while leaving mean allocation rules largely intact (Ricklefs and Wikelski, 2002; Zera and Harshman, 2001). These patterns have broader implications for phenotypic integration and evolutionary potential. Repeatability places an upper bound on heritability (Falconer and MacKay, 1996; Lessells and Boag, 1987; Nakagawa and Schielzeth, 2013; Nakagawa and Schielzeth, 2010; but see Dohm, 2002). The moderate repeatability of egg size suggests that selection could act on persistent differences in mean provisioning, whereas the extremely low repeatability of egg number implies that clutch size may respond primarily to short-term environmental or physiological conditions (i.e. reduced ovariole function). The weak intercept correlation further indicates that egg size and egg number are only loosely integrated, consistent with models in which traits differ in their sensitivity to resource state versus allocation strategy (Houle, 1991). In this system, per-offspring investment appears more evolutionarily stable than total offspring number.</w:t>
       </w:r>
     </w:p>
     <w:p>
@@ -2044,20 +2063,74 @@
         <w:pStyle w:val="BodyText"/>
       </w:pPr>
       <w:r>
-        <w:t xml:space="preserve">Viewed hierarchically, my results illustrate a broader conceptual point: life-history trade-offs may operate primarily through stable differences in allocation rules among individuals, while short-term variation reflects state-dependent constraint. Without decomposing within- and among-individual covariance, the modest among-female trade-off suggested here would have </w:t>
+        <w:t xml:space="preserve">Viewed hierarchically, my results illustrate a broader conceptual point: life-history trade-offs may operate primarily through systematic differences in mean allocation among individuals, while most short-term variation reflects state-dependent constraint. However, when among-individual variance in one trait is minimal—as is the case for egg number here—such trade-offs will necessarily be weak and difficult to detect. Without decomposing within- and among-individual covariance, even this modest pattern would have remained obscured. More generally, the evolutionary consequences of trade-offs depend not only on their sign but on their hierarchical expression and repeatability. A trade-off that reflects consistent among-individual </w:t>
       </w:r>
       <w:r>
         <w:lastRenderedPageBreak/>
-        <w:t>remained obscured. More generally, the evolutionary consequences of trade-offs depend not only on their sign but on their hierarchical expression and repeatability. A trade-off that reflects consistent among-individual differences in a repeatable trait is more likely to shape evolutionary responses than one arising primarily from transient, plastic variation within individuals. Future work measuring resource acquisition directly, experimentally manipulating body condition, or estimating genetic correlations between egg size and egg number will help determine whether the allocation divergence observed here reflects adaptive differentiation in allocation strategy or condition-dependent constraint (Lande, 1980; Roff, 1992).</w:t>
+        <w:t>differences in a repeatable trait is more likely to shape evolutionary responses than one arising primarily from transient, plastic variation within individuals. Future work measuring resource acquisition directly, experimentally manipulating body condition, or estimating genetic correlations between egg size and egg number will help determine whether the limited allocation divergence observed here reflects adaptive differentiation or condition-dependent constraint (Lande, 1980; Roff, 1992).</w:t>
       </w:r>
     </w:p>
     <w:p>
       <w:pPr>
         <w:pStyle w:val="Heading1"/>
       </w:pPr>
-      <w:bookmarkStart w:id="9" w:name="data-availability"/>
+      <w:bookmarkStart w:id="9" w:name="acknowledgements"/>
       <w:bookmarkEnd w:id="8"/>
       <w:r>
+        <w:t>Acknowledgements</w:t>
+      </w:r>
+    </w:p>
+    <w:p>
+      <w:pPr>
+        <w:pStyle w:val="FirstParagraph"/>
+      </w:pPr>
+      <w:r>
+        <w:t>I thank Andréanne Nault and Clara Smythe for assistance in animal care and data collection. I also thank Denis Réale, Pierre-Olivier Montiglio, and two anonymous reviewers for their discussion and feedback.</w:t>
+      </w:r>
+    </w:p>
+    <w:p>
+      <w:pPr>
+        <w:pStyle w:val="Heading1"/>
+      </w:pPr>
+      <w:bookmarkStart w:id="10" w:name="funding"/>
+      <w:bookmarkEnd w:id="9"/>
+      <w:r>
+        <w:t>Funding</w:t>
+      </w:r>
+    </w:p>
+    <w:p>
+      <w:pPr>
+        <w:pStyle w:val="FirstParagraph"/>
+      </w:pPr>
+      <w:r>
+        <w:t>The study was funded by a Discovery Grant from the Natural Sciences and Engineering Research Council of Canada (NSERC).</w:t>
+      </w:r>
+    </w:p>
+    <w:p>
+      <w:pPr>
+        <w:pStyle w:val="Heading1"/>
+      </w:pPr>
+      <w:bookmarkStart w:id="11" w:name="conflict-of-interest"/>
+      <w:bookmarkEnd w:id="10"/>
+      <w:r>
+        <w:t>Conflict of Interest</w:t>
+      </w:r>
+    </w:p>
+    <w:p>
+      <w:pPr>
+        <w:pStyle w:val="FirstParagraph"/>
+      </w:pPr>
+      <w:r>
+        <w:t>I declare no conflict of interest.</w:t>
+      </w:r>
+    </w:p>
+    <w:p>
+      <w:pPr>
+        <w:pStyle w:val="Heading1"/>
+      </w:pPr>
+      <w:bookmarkStart w:id="12" w:name="data-availability"/>
+      <w:bookmarkEnd w:id="11"/>
+      <w:r>
         <w:t>Data availability</w:t>
       </w:r>
     </w:p>
@@ -2073,9 +2146,10 @@
       <w:pPr>
         <w:pStyle w:val="Heading1"/>
       </w:pPr>
-      <w:bookmarkStart w:id="10" w:name="author-contributions"/>
-      <w:bookmarkEnd w:id="9"/>
-      <w:r>
+      <w:bookmarkStart w:id="13" w:name="author-contributions"/>
+      <w:bookmarkEnd w:id="12"/>
+      <w:r>
+        <w:lastRenderedPageBreak/>
         <w:t>Author contributions</w:t>
       </w:r>
     </w:p>
@@ -2091,10 +2165,10 @@
       <w:pPr>
         <w:pStyle w:val="Heading1"/>
       </w:pPr>
-      <w:bookmarkStart w:id="11" w:name="funding"/>
-      <w:bookmarkEnd w:id="10"/>
-      <w:r>
-        <w:t>Funding</w:t>
+      <w:bookmarkStart w:id="14" w:name="ethics-statement"/>
+      <w:bookmarkEnd w:id="13"/>
+      <w:r>
+        <w:t>Ethics Statement</w:t>
       </w:r>
     </w:p>
     <w:p>
@@ -2102,17 +2176,27 @@
         <w:pStyle w:val="FirstParagraph"/>
       </w:pPr>
       <w:r>
-        <w:t>The study was funded by a Discovery Grant from the Natural Sciences and Engineering Research Council of Canada (NSERC).</w:t>
+        <w:t>All data were collected using the European earwig (</w:t>
+      </w:r>
+      <w:r>
+        <w:rPr>
+          <w:i/>
+          <w:iCs/>
+        </w:rPr>
+        <w:t>Forficula auricularia</w:t>
+      </w:r>
+      <w:r>
+        <w:t>), an invertebrate species for which institutional animal care approval and collection permits are not required under current regulations. All procedures adhered to standard ethical guidelines for the care and use of animals in research.</w:t>
       </w:r>
     </w:p>
     <w:p>
       <w:pPr>
         <w:pStyle w:val="Heading1"/>
       </w:pPr>
-      <w:bookmarkStart w:id="12" w:name="conflict-of-interest"/>
-      <w:bookmarkEnd w:id="11"/>
-      <w:r>
-        <w:t>Conflict of Interest</w:t>
+      <w:bookmarkStart w:id="15" w:name="X7d9e1dcfd756f6c187f2105ba66c04645353272"/>
+      <w:bookmarkEnd w:id="14"/>
+      <w:r>
+        <w:t>Artificial intelligence (AI)-assisted technologies</w:t>
       </w:r>
     </w:p>
     <w:p>
@@ -2120,39 +2204,20 @@
         <w:pStyle w:val="FirstParagraph"/>
       </w:pPr>
       <w:r>
-        <w:t>I declare no conflict of interest.</w:t>
+        <w:t>Alt text for the two figures was generated with the assistance of AI tools and reviewed and verified by the author for accuracy and completeness.</w:t>
+      </w:r>
+    </w:p>
+    <w:p>
+      <w:r>
+        <w:br w:type="page"/>
       </w:r>
     </w:p>
     <w:p>
       <w:pPr>
         <w:pStyle w:val="Heading1"/>
       </w:pPr>
-      <w:bookmarkStart w:id="13" w:name="acknowledgements"/>
-      <w:bookmarkEnd w:id="12"/>
-      <w:r>
-        <w:lastRenderedPageBreak/>
-        <w:t>Acknowledgements</w:t>
-      </w:r>
-    </w:p>
-    <w:p>
-      <w:pPr>
-        <w:pStyle w:val="FirstParagraph"/>
-      </w:pPr>
-      <w:r>
-        <w:t>I thank Andréanne Nault and Clara Smythe for assistance in animal care and data collection. I also thank Denis Réale, Pierre-Olivier Montiglio, and two anonymous reviewers for their discussion and feedback.</w:t>
-      </w:r>
-    </w:p>
-    <w:p>
-      <w:r>
-        <w:br w:type="page"/>
-      </w:r>
-    </w:p>
-    <w:p>
-      <w:pPr>
-        <w:pStyle w:val="Heading1"/>
-      </w:pPr>
-      <w:bookmarkStart w:id="14" w:name="references"/>
-      <w:bookmarkEnd w:id="13"/>
+      <w:bookmarkStart w:id="16" w:name="references"/>
+      <w:bookmarkEnd w:id="15"/>
       <w:r>
         <w:lastRenderedPageBreak/>
         <w:t>References</w:t>
@@ -2162,8 +2227,8 @@
       <w:pPr>
         <w:pStyle w:val="Bibliography"/>
       </w:pPr>
-      <w:bookmarkStart w:id="15" w:name="ref-bernardo1996"/>
-      <w:bookmarkStart w:id="16" w:name="refs"/>
+      <w:bookmarkStart w:id="17" w:name="ref-bernardo1996"/>
+      <w:bookmarkStart w:id="18" w:name="refs"/>
       <w:r>
         <w:t xml:space="preserve">Bernardo, J., 1996. The particular maternal effect of propagule size, especially egg size: Patterns, models, quality of evidence and interpretations. </w:t>
       </w:r>
@@ -2192,8 +2257,8 @@
       <w:pPr>
         <w:pStyle w:val="Bibliography"/>
       </w:pPr>
-      <w:bookmarkStart w:id="17" w:name="ref-careau2017"/>
-      <w:bookmarkEnd w:id="15"/>
+      <w:bookmarkStart w:id="19" w:name="ref-careau2017"/>
+      <w:bookmarkEnd w:id="17"/>
       <w:r>
         <w:t xml:space="preserve">Careau, V., Wilson, R., 2017. Of uberfleas and krakens: Detecting trade-offs using mixed models. </w:t>
       </w:r>
@@ -2222,8 +2287,8 @@
       <w:pPr>
         <w:pStyle w:val="Bibliography"/>
       </w:pPr>
-      <w:bookmarkStart w:id="18" w:name="ref-clutton-brock1991"/>
-      <w:bookmarkEnd w:id="17"/>
+      <w:bookmarkStart w:id="20" w:name="ref-clutton-brock1991"/>
+      <w:bookmarkEnd w:id="19"/>
       <w:r>
         <w:t>Clutton-Brock, T.H., 1991. The Evolution of Parental Care. Princeton University Press.</w:t>
       </w:r>
@@ -2232,8 +2297,8 @@
       <w:pPr>
         <w:pStyle w:val="Bibliography"/>
       </w:pPr>
-      <w:bookmarkStart w:id="19" w:name="ref-dejong1992"/>
-      <w:bookmarkEnd w:id="18"/>
+      <w:bookmarkStart w:id="21" w:name="ref-dejong1992"/>
+      <w:bookmarkEnd w:id="20"/>
       <w:r>
         <w:t xml:space="preserve">De Jong, G., Van Noordwijk, A., 1992. Acquisition and allocation of resources: Genetic (co) variances, selection, and life histories. </w:t>
       </w:r>
@@ -2262,10 +2327,10 @@
       <w:pPr>
         <w:pStyle w:val="Bibliography"/>
       </w:pPr>
-      <w:bookmarkStart w:id="20" w:name="ref-dingemanse2013"/>
-      <w:bookmarkEnd w:id="19"/>
-      <w:r>
-        <w:t xml:space="preserve">Dingemanse, N., Dochtermann, N., 2013. Quantifying individual variation in behaviour: Mixed-effect modelling approaches. </w:t>
+      <w:bookmarkStart w:id="22" w:name="ref-dingemanse2013"/>
+      <w:bookmarkEnd w:id="21"/>
+      <w:r>
+        <w:t xml:space="preserve">Dingemanse, N.J., Dochtermann, N., 2013. Quantifying individual variation in behaviour: Mixed-effect modelling approaches. </w:t>
       </w:r>
       <w:r>
         <w:rPr>
@@ -2292,8 +2357,8 @@
       <w:pPr>
         <w:pStyle w:val="Bibliography"/>
       </w:pPr>
-      <w:bookmarkStart w:id="21" w:name="ref-dohm2002"/>
-      <w:bookmarkEnd w:id="20"/>
+      <w:bookmarkStart w:id="23" w:name="ref-dohm2002"/>
+      <w:bookmarkEnd w:id="22"/>
       <w:r>
         <w:t xml:space="preserve">Dohm, M.R., 2002. Repeatability estimates do not always set an upper limit to heritability. </w:t>
       </w:r>
@@ -2322,8 +2387,8 @@
       <w:pPr>
         <w:pStyle w:val="Bibliography"/>
       </w:pPr>
-      <w:bookmarkStart w:id="22" w:name="ref-falconer1996"/>
-      <w:bookmarkEnd w:id="21"/>
+      <w:bookmarkStart w:id="24" w:name="ref-falconer1996"/>
+      <w:bookmarkEnd w:id="23"/>
       <w:r>
         <w:t>Falconer, D.S., MacKay, T.F.C., 1996. An Introduction Quantitative Genetics. Pearson Education Limited, Essex, England.</w:t>
       </w:r>
@@ -2332,8 +2397,8 @@
       <w:pPr>
         <w:pStyle w:val="Bibliography"/>
       </w:pPr>
-      <w:bookmarkStart w:id="23" w:name="ref-fox2000"/>
-      <w:bookmarkEnd w:id="22"/>
+      <w:bookmarkStart w:id="25" w:name="ref-fox2000"/>
+      <w:bookmarkEnd w:id="24"/>
       <w:r>
         <w:t xml:space="preserve">Fox, C.W., Czesak, M.E., 2000. Evolutionary ecology of progeny size in arthropods. </w:t>
       </w:r>
@@ -2362,17 +2427,27 @@
       <w:pPr>
         <w:pStyle w:val="Bibliography"/>
       </w:pPr>
-      <w:bookmarkStart w:id="24" w:name="ref-hargitai2005"/>
-      <w:bookmarkEnd w:id="23"/>
-      <w:r>
-        <w:t xml:space="preserve">Hargitai, R., Török, J., Tóth, L., Hegyi, G., Rosivall, B., Szigeti, B., Szöllősi, E., 2005. Effects of environmental conditions and parental quality on inter-and intraclutch egg-size variation in the collared flycatcher (ficedula albicollis). </w:t>
+      <w:bookmarkStart w:id="26" w:name="ref-hargitai2005"/>
+      <w:bookmarkEnd w:id="25"/>
+      <w:r>
+        <w:t>Hargitai, R., Török, J., Tóth, L., Hegyi, G., Rosivall, B., Szigeti, B., Szöllősi, E., 2005. Effects of environmental conditions and parental quality on inter-and intraclutch egg-size variation in the collared flycatcher (</w:t>
       </w:r>
       <w:r>
         <w:rPr>
           <w:i/>
           <w:iCs/>
         </w:rPr>
-        <w:t>The Auk</w:t>
+        <w:t>Ficedula albicollis</w:t>
+      </w:r>
+      <w:r>
+        <w:t xml:space="preserve">). </w:t>
+      </w:r>
+      <w:r>
+        <w:rPr>
+          <w:i/>
+          <w:iCs/>
+        </w:rPr>
+        <w:t>Auk</w:t>
       </w:r>
       <w:r>
         <w:t xml:space="preserve"> </w:t>
@@ -2392,8 +2467,8 @@
       <w:pPr>
         <w:pStyle w:val="Bibliography"/>
       </w:pPr>
-      <w:bookmarkStart w:id="25" w:name="ref-honek1993"/>
-      <w:bookmarkEnd w:id="24"/>
+      <w:bookmarkStart w:id="27" w:name="ref-honek1993"/>
+      <w:bookmarkEnd w:id="26"/>
       <w:r>
         <w:t xml:space="preserve">Honek, A., 1993. Intraspecific variation in body size and fecundity in insects: A general relationship. </w:t>
       </w:r>
@@ -2412,8 +2487,8 @@
       <w:pPr>
         <w:pStyle w:val="Bibliography"/>
       </w:pPr>
-      <w:bookmarkStart w:id="26" w:name="ref-houle1991"/>
-      <w:bookmarkEnd w:id="25"/>
+      <w:bookmarkStart w:id="28" w:name="ref-houle1991"/>
+      <w:bookmarkEnd w:id="27"/>
       <w:r>
         <w:t xml:space="preserve">Houle, D., 1991. Genetic covariance of fitness correlates: What genetic correlations are made of and why it matters. </w:t>
       </w:r>
@@ -2442,8 +2517,8 @@
       <w:pPr>
         <w:pStyle w:val="Bibliography"/>
       </w:pPr>
-      <w:bookmarkStart w:id="27" w:name="ref-houston1999"/>
-      <w:bookmarkEnd w:id="26"/>
+      <w:bookmarkStart w:id="29" w:name="ref-houston1999"/>
+      <w:bookmarkEnd w:id="28"/>
       <w:r>
         <w:t>Houston, A.I., McNamara, J.M., 1999. Models of adaptive behaviour: An approach based on state. Cambridge University Press.</w:t>
       </w:r>
@@ -2452,8 +2527,8 @@
       <w:pPr>
         <w:pStyle w:val="Bibliography"/>
       </w:pPr>
-      <w:bookmarkStart w:id="28" w:name="ref-johnson2024"/>
-      <w:bookmarkEnd w:id="27"/>
+      <w:bookmarkStart w:id="30" w:name="ref-johnson2024"/>
+      <w:bookmarkEnd w:id="29"/>
       <w:r>
         <w:t xml:space="preserve">Johnson, M.T.J., Nassrullah, Z., 2024. The improbability of detecting trade-offs and some practical solutions. </w:t>
       </w:r>
@@ -2482,8 +2557,8 @@
       <w:pPr>
         <w:pStyle w:val="Bibliography"/>
       </w:pPr>
-      <w:bookmarkStart w:id="29" w:name="ref-kay2020"/>
-      <w:bookmarkEnd w:id="28"/>
+      <w:bookmarkStart w:id="31" w:name="ref-kay2020"/>
+      <w:bookmarkEnd w:id="30"/>
       <w:r>
         <w:t xml:space="preserve">Kay, M., 2020. tidybayes: Tidy Data and Geoms for Bayesian Models [WWW Document]. </w:t>
       </w:r>
@@ -2510,8 +2585,8 @@
       <w:pPr>
         <w:pStyle w:val="Bibliography"/>
       </w:pPr>
-      <w:bookmarkStart w:id="30" w:name="ref-kelly2014"/>
-      <w:bookmarkEnd w:id="29"/>
+      <w:bookmarkStart w:id="32" w:name="ref-kelly2014"/>
+      <w:bookmarkEnd w:id="31"/>
       <w:r>
         <w:t xml:space="preserve">Kelly, C.D., Tawes, B., Worthington, A., 2014. Evaluating indices of body condition in two cricket species. </w:t>
       </w:r>
@@ -2520,7 +2595,7 @@
           <w:i/>
           <w:iCs/>
         </w:rPr>
-        <w:t>Ecology and Evolution</w:t>
+        <w:t>Ecol Evol</w:t>
       </w:r>
       <w:r>
         <w:t xml:space="preserve"> </w:t>
@@ -2540,8 +2615,8 @@
       <w:pPr>
         <w:pStyle w:val="Bibliography"/>
       </w:pPr>
-      <w:bookmarkStart w:id="31" w:name="ref-koch2014"/>
-      <w:bookmarkEnd w:id="30"/>
+      <w:bookmarkStart w:id="33" w:name="ref-koch2014"/>
+      <w:bookmarkEnd w:id="32"/>
       <w:r>
         <w:lastRenderedPageBreak/>
         <w:t xml:space="preserve">Koch, L.K., Meunier, J., 2014. Mother and offspring fitness in an insect with maternal care: Phenotypic trade-offs between egg number, egg mass and egg care. </w:t>
@@ -2571,8 +2646,8 @@
       <w:pPr>
         <w:pStyle w:val="Bibliography"/>
       </w:pPr>
-      <w:bookmarkStart w:id="32" w:name="ref-lack1947"/>
-      <w:bookmarkEnd w:id="31"/>
+      <w:bookmarkStart w:id="34" w:name="ref-lack1947"/>
+      <w:bookmarkEnd w:id="33"/>
       <w:r>
         <w:t>Lack, D., 1947. The significance of clutch-size in the partridge (</w:t>
       </w:r>
@@ -2581,7 +2656,7 @@
           <w:i/>
           <w:iCs/>
         </w:rPr>
-        <w:t>perdix perdix</w:t>
+        <w:t>Perdix perdix</w:t>
       </w:r>
       <w:r>
         <w:t xml:space="preserve">). </w:t>
@@ -2591,18 +2666,28 @@
           <w:i/>
           <w:iCs/>
         </w:rPr>
-        <w:t>The Journal of Animal Ecology</w:t>
-      </w:r>
-      <w:r>
-        <w:t xml:space="preserve"> 19–25.</w:t>
+        <w:t>J Anim Ecol</w:t>
+      </w:r>
+      <w:r>
+        <w:t xml:space="preserve"> </w:t>
+      </w:r>
+      <w:r>
+        <w:rPr>
+          <w:b/>
+          <w:bCs/>
+        </w:rPr>
+        <w:t>16</w:t>
+      </w:r>
+      <w:r>
+        <w:t>, 19–25.</w:t>
       </w:r>
     </w:p>
     <w:p>
       <w:pPr>
         <w:pStyle w:val="Bibliography"/>
       </w:pPr>
-      <w:bookmarkStart w:id="33" w:name="ref-lande1980a"/>
-      <w:bookmarkEnd w:id="32"/>
+      <w:bookmarkStart w:id="35" w:name="ref-lande1980a"/>
+      <w:bookmarkEnd w:id="34"/>
       <w:r>
         <w:t xml:space="preserve">Lande, R., 1980. The genetic covariance between characters maintained by pleiotropic mutations. </w:t>
       </w:r>
@@ -2631,8 +2716,8 @@
       <w:pPr>
         <w:pStyle w:val="Bibliography"/>
       </w:pPr>
-      <w:bookmarkStart w:id="34" w:name="ref-lessells1987"/>
-      <w:bookmarkEnd w:id="33"/>
+      <w:bookmarkStart w:id="36" w:name="ref-lessells1987"/>
+      <w:bookmarkEnd w:id="35"/>
       <w:r>
         <w:t xml:space="preserve">Lessells, C., Boag, P.T., 1987. Unrepeatable repeatabilities: A common mistake. </w:t>
       </w:r>
@@ -2641,7 +2726,7 @@
           <w:i/>
           <w:iCs/>
         </w:rPr>
-        <w:t>The Auk</w:t>
+        <w:t>Auk</w:t>
       </w:r>
       <w:r>
         <w:t xml:space="preserve"> </w:t>
@@ -2661,8 +2746,8 @@
       <w:pPr>
         <w:pStyle w:val="Bibliography"/>
       </w:pPr>
-      <w:bookmarkStart w:id="35" w:name="ref-mcnamara1996"/>
-      <w:bookmarkEnd w:id="34"/>
+      <w:bookmarkStart w:id="37" w:name="ref-mcnamara1996"/>
+      <w:bookmarkEnd w:id="36"/>
       <w:r>
         <w:t xml:space="preserve">McNamara, J.M., Houston, A.I., 1996. State-dependent life histories. </w:t>
       </w:r>
@@ -2691,10 +2776,10 @@
       <w:pPr>
         <w:pStyle w:val="Bibliography"/>
       </w:pPr>
-      <w:bookmarkStart w:id="36" w:name="ref-meunier2024"/>
-      <w:bookmarkEnd w:id="35"/>
-      <w:r>
-        <w:t xml:space="preserve">Meunier, J., 2024. The biology and social life of earwigs (dermaptera). </w:t>
+      <w:bookmarkStart w:id="38" w:name="ref-meunier2024"/>
+      <w:bookmarkEnd w:id="37"/>
+      <w:r>
+        <w:t xml:space="preserve">Meunier, J., 2024. The biology and social life of earwigs (Dermaptera). </w:t>
       </w:r>
       <w:r>
         <w:rPr>
@@ -2721,8 +2806,8 @@
       <w:pPr>
         <w:pStyle w:val="Bibliography"/>
       </w:pPr>
-      <w:bookmarkStart w:id="37" w:name="ref-nakagawa2017"/>
-      <w:bookmarkEnd w:id="36"/>
+      <w:bookmarkStart w:id="39" w:name="ref-nakagawa2017"/>
+      <w:bookmarkEnd w:id="38"/>
       <w:r>
         <w:t>Nakagawa, S., Johnson, P.C.D., Schielzeth, H., 2017. The coefficient of determination r</w:t>
       </w:r>
@@ -2760,8 +2845,8 @@
       <w:pPr>
         <w:pStyle w:val="Bibliography"/>
       </w:pPr>
-      <w:bookmarkStart w:id="38" w:name="ref-nakagawa2013"/>
-      <w:bookmarkEnd w:id="37"/>
+      <w:bookmarkStart w:id="40" w:name="ref-nakagawa2013"/>
+      <w:bookmarkEnd w:id="39"/>
       <w:r>
         <w:t xml:space="preserve">Nakagawa, S., Schielzeth, H., 2013. A general and simple method for obtaining R2 from generalized linear mixed‐effects models. </w:t>
       </w:r>
@@ -2790,10 +2875,10 @@
       <w:pPr>
         <w:pStyle w:val="Bibliography"/>
       </w:pPr>
-      <w:bookmarkStart w:id="39" w:name="ref-nakagawa2010"/>
-      <w:bookmarkEnd w:id="38"/>
-      <w:r>
-        <w:t xml:space="preserve">Nakagawa, S., Schielzeth, H., 2010. Repeatability for gaussian and non-gaussian data: A practical guide for biologists. </w:t>
+      <w:bookmarkStart w:id="41" w:name="ref-nakagawa2010"/>
+      <w:bookmarkEnd w:id="40"/>
+      <w:r>
+        <w:t xml:space="preserve">Nakagawa, S., Schielzeth, H., 2010. Repeatability for Gaussian and non-Gaussian data: A practical guide for biologists. </w:t>
       </w:r>
       <w:r>
         <w:rPr>
@@ -2820,8 +2905,8 @@
       <w:pPr>
         <w:pStyle w:val="Bibliography"/>
       </w:pPr>
-      <w:bookmarkStart w:id="40" w:name="ref-parker1982"/>
-      <w:bookmarkEnd w:id="39"/>
+      <w:bookmarkStart w:id="42" w:name="ref-parker1982"/>
+      <w:bookmarkEnd w:id="41"/>
       <w:r>
         <w:t xml:space="preserve">Parker, G.A., 1982. Why are there so many tiny sperm? Sperm competition and the maintenance of two sexes. </w:t>
       </w:r>
@@ -2850,8 +2935,8 @@
       <w:pPr>
         <w:pStyle w:val="Bibliography"/>
       </w:pPr>
-      <w:bookmarkStart w:id="41" w:name="ref-peig2010"/>
-      <w:bookmarkEnd w:id="40"/>
+      <w:bookmarkStart w:id="43" w:name="ref-peig2010"/>
+      <w:bookmarkEnd w:id="42"/>
       <w:r>
         <w:t xml:space="preserve">Peig, J., Green, A.J., 2010. The paradigm of body condition: A critical reappraisal of current methods based on mass and length. </w:t>
       </w:r>
@@ -2880,8 +2965,8 @@
       <w:pPr>
         <w:pStyle w:val="Bibliography"/>
       </w:pPr>
-      <w:bookmarkStart w:id="42" w:name="ref-peig2009"/>
-      <w:bookmarkEnd w:id="41"/>
+      <w:bookmarkStart w:id="44" w:name="ref-peig2009"/>
+      <w:bookmarkEnd w:id="43"/>
       <w:r>
         <w:t xml:space="preserve">Peig, J., Green, A.J., 2009. New perspectives for estimating body condition from mass/length data: The scaled mass index as an alternative method. </w:t>
       </w:r>
@@ -2910,8 +2995,8 @@
       <w:pPr>
         <w:pStyle w:val="Bibliography"/>
       </w:pPr>
-      <w:bookmarkStart w:id="43" w:name="ref-vandepol2009"/>
-      <w:bookmarkEnd w:id="42"/>
+      <w:bookmarkStart w:id="45" w:name="ref-vandepol2009"/>
+      <w:bookmarkEnd w:id="44"/>
       <w:r>
         <w:t xml:space="preserve">Pol, M. van de, Wright, J., 2009. A simple method for distinguishing within- versus between-subject effects using mixed models. </w:t>
       </w:r>
@@ -2940,8 +3025,8 @@
       <w:pPr>
         <w:pStyle w:val="Bibliography"/>
       </w:pPr>
-      <w:bookmarkStart w:id="44" w:name="ref-r2013"/>
-      <w:bookmarkEnd w:id="43"/>
+      <w:bookmarkStart w:id="46" w:name="ref-r2013"/>
+      <w:bookmarkEnd w:id="45"/>
       <w:r>
         <w:t>R Core Team, 2025. R: A language and environment for statistical computing.</w:t>
       </w:r>
@@ -2950,8 +3035,8 @@
       <w:pPr>
         <w:pStyle w:val="Bibliography"/>
       </w:pPr>
-      <w:bookmarkStart w:id="45" w:name="ref-reznick2000"/>
-      <w:bookmarkEnd w:id="44"/>
+      <w:bookmarkStart w:id="47" w:name="ref-reznick2000"/>
+      <w:bookmarkEnd w:id="46"/>
       <w:r>
         <w:t xml:space="preserve">Reznick, D., Nunney, L., Tessier, A., 2000. Big houses, big cars, superfleas and the costs of reproduction. </w:t>
       </w:r>
@@ -2980,8 +3065,8 @@
       <w:pPr>
         <w:pStyle w:val="Bibliography"/>
       </w:pPr>
-      <w:bookmarkStart w:id="46" w:name="ref-ricklefs2002"/>
-      <w:bookmarkEnd w:id="45"/>
+      <w:bookmarkStart w:id="48" w:name="ref-ricklefs2002"/>
+      <w:bookmarkEnd w:id="47"/>
       <w:r>
         <w:t xml:space="preserve">Ricklefs, R.E., Wikelski, M., 2002. The physiology/life-history nexus. </w:t>
       </w:r>
@@ -3010,8 +3095,8 @@
       <w:pPr>
         <w:pStyle w:val="Bibliography"/>
       </w:pPr>
-      <w:bookmarkStart w:id="47" w:name="ref-roff1992a"/>
-      <w:bookmarkEnd w:id="46"/>
+      <w:bookmarkStart w:id="49" w:name="ref-roff1992a"/>
+      <w:bookmarkEnd w:id="48"/>
       <w:r>
         <w:lastRenderedPageBreak/>
         <w:t>Roff, D., 1992. Evolution of Life Histories: Theory and Analysis. Chapman &amp; Hall, Inc., New York, NY.</w:t>
@@ -3021,8 +3106,8 @@
       <w:pPr>
         <w:pStyle w:val="Bibliography"/>
       </w:pPr>
-      <w:bookmarkStart w:id="48" w:name="ref-roff2007a"/>
-      <w:bookmarkEnd w:id="47"/>
+      <w:bookmarkStart w:id="50" w:name="ref-roff2007a"/>
+      <w:bookmarkEnd w:id="49"/>
       <w:r>
         <w:t xml:space="preserve">Roff, D.A., Fairbairn, D.J., 2007. The evolution of trade-offs: Where are we? </w:t>
       </w:r>
@@ -3051,8 +3136,8 @@
       <w:pPr>
         <w:pStyle w:val="Bibliography"/>
       </w:pPr>
-      <w:bookmarkStart w:id="49" w:name="ref-schindelin2012"/>
-      <w:bookmarkEnd w:id="48"/>
+      <w:bookmarkStart w:id="51" w:name="ref-schindelin2012"/>
+      <w:bookmarkEnd w:id="50"/>
       <w:r>
         <w:t xml:space="preserve">Schindelin, J., Arganda-Carreras, I., Frise, E., Kaynig, V., Longair, M., Pietzsch, T., Preibisch, S., Rueden, C., Saalfeld, S., Schmid, B., Tinevez, J.-Y., White, D.J., Hartenstein, V., Eliceiri, K., Tomancak, P., Cardona, A., 2012. Fiji: An open-source platform for biological-image analysis. </w:t>
       </w:r>
@@ -3061,7 +3146,7 @@
           <w:i/>
           <w:iCs/>
         </w:rPr>
-        <w:t>Nat Methods</w:t>
+        <w:t>Nat Method</w:t>
       </w:r>
       <w:r>
         <w:t xml:space="preserve"> </w:t>
@@ -3081,8 +3166,8 @@
       <w:pPr>
         <w:pStyle w:val="Bibliography"/>
       </w:pPr>
-      <w:bookmarkStart w:id="50" w:name="ref-simpson1951"/>
-      <w:bookmarkEnd w:id="49"/>
+      <w:bookmarkStart w:id="52" w:name="ref-simpson1951"/>
+      <w:bookmarkEnd w:id="51"/>
       <w:r>
         <w:t xml:space="preserve">Simpson, E.H., 1951. The interpretation of interaction in contingency tables. </w:t>
       </w:r>
@@ -3091,7 +3176,7 @@
           <w:i/>
           <w:iCs/>
         </w:rPr>
-        <w:t>Journal of the Royal Statistical Society: Series B (Methodological)</w:t>
+        <w:t>J. R. Stat. Soc. Ser. B Stat. Methodol.</w:t>
       </w:r>
       <w:r>
         <w:t xml:space="preserve"> </w:t>
@@ -3111,8 +3196,8 @@
       <w:pPr>
         <w:pStyle w:val="Bibliography"/>
       </w:pPr>
-      <w:bookmarkStart w:id="51" w:name="ref-smith1974"/>
-      <w:bookmarkEnd w:id="50"/>
+      <w:bookmarkStart w:id="53" w:name="ref-smith1974"/>
+      <w:bookmarkEnd w:id="52"/>
       <w:r>
         <w:t xml:space="preserve">Smith, C.C., Fretwell, S.D., 1974. The optimal balance between size and number of offspring. </w:t>
       </w:r>
@@ -3141,8 +3226,8 @@
       <w:pPr>
         <w:pStyle w:val="Bibliography"/>
       </w:pPr>
-      <w:bookmarkStart w:id="52" w:name="ref-staerkle2008"/>
-      <w:bookmarkEnd w:id="51"/>
+      <w:bookmarkStart w:id="54" w:name="ref-staerkle2008"/>
+      <w:bookmarkEnd w:id="53"/>
       <w:r>
         <w:t>Staerkle, M., Kölliker, M., 2008. Maternal food regurgitation to nymphs in earwigs (</w:t>
       </w:r>
@@ -3151,7 +3236,7 @@
           <w:i/>
           <w:iCs/>
         </w:rPr>
-        <w:t>forficula auricularia</w:t>
+        <w:t>Forficula auricularia</w:t>
       </w:r>
       <w:r>
         <w:t xml:space="preserve">). </w:t>
@@ -3181,8 +3266,8 @@
       <w:pPr>
         <w:pStyle w:val="Bibliography"/>
       </w:pPr>
-      <w:bookmarkStart w:id="53" w:name="ref-stearns1992"/>
-      <w:bookmarkEnd w:id="52"/>
+      <w:bookmarkStart w:id="55" w:name="ref-stearns1992"/>
+      <w:bookmarkEnd w:id="54"/>
       <w:r>
         <w:t>Stearns, S.C., 1992. The Evolution of Life Histories. Oxford University Press.</w:t>
       </w:r>
@@ -3191,8 +3276,8 @@
       <w:pPr>
         <w:pStyle w:val="Bibliography"/>
       </w:pPr>
-      <w:bookmarkStart w:id="54" w:name="ref-stearns1989"/>
-      <w:bookmarkEnd w:id="53"/>
+      <w:bookmarkStart w:id="56" w:name="ref-stearns1989"/>
+      <w:bookmarkEnd w:id="55"/>
       <w:r>
         <w:t xml:space="preserve">Stearns, S.C., 1989. Trade-offs in life-history evolution. </w:t>
       </w:r>
@@ -3221,8 +3306,8 @@
       <w:pPr>
         <w:pStyle w:val="Bibliography"/>
       </w:pPr>
-      <w:bookmarkStart w:id="55" w:name="ref-stoffel2017"/>
-      <w:bookmarkEnd w:id="54"/>
+      <w:bookmarkStart w:id="57" w:name="ref-stoffel2017"/>
+      <w:bookmarkEnd w:id="56"/>
       <w:r>
         <w:t xml:space="preserve">Stoffel, M.A., Nakagawa, S., Schielzeth, H., 2017. RptR: Repeatability estimation and variance decomposition by generalized linear mixed‐effects models. </w:t>
       </w:r>
@@ -3251,8 +3336,8 @@
       <w:pPr>
         <w:pStyle w:val="Bibliography"/>
       </w:pPr>
-      <w:bookmarkStart w:id="56" w:name="ref-tourneur2018"/>
-      <w:bookmarkEnd w:id="55"/>
+      <w:bookmarkStart w:id="58" w:name="ref-tourneur2018"/>
+      <w:bookmarkEnd w:id="57"/>
       <w:r>
         <w:t xml:space="preserve">Tourneur, J.-C., 2018. Factors affecting the egg-laying pattern of </w:t>
       </w:r>
@@ -3261,17 +3346,17 @@
           <w:i/>
           <w:iCs/>
         </w:rPr>
-        <w:t>forficula auricularia</w:t>
-      </w:r>
-      <w:r>
-        <w:t xml:space="preserve"> (dermaptera: Forficulidae) in three climatologically different zones of north america. </w:t>
+        <w:t>Forficula auricularia</w:t>
+      </w:r>
+      <w:r>
+        <w:t xml:space="preserve"> (Dermaptera: Forficulidae) in three climatologically different zones of North America. </w:t>
       </w:r>
       <w:r>
         <w:rPr>
           <w:i/>
           <w:iCs/>
         </w:rPr>
-        <w:t>The Canadian Entomologist</w:t>
+        <w:t>Can Entomol</w:t>
       </w:r>
       <w:r>
         <w:t xml:space="preserve"> </w:t>
@@ -3291,27 +3376,27 @@
       <w:pPr>
         <w:pStyle w:val="Bibliography"/>
       </w:pPr>
-      <w:bookmarkStart w:id="57" w:name="ref-tourneur1992"/>
-      <w:bookmarkEnd w:id="56"/>
-      <w:r>
-        <w:t xml:space="preserve">Tourneur, J.-C., Gingras, J., 1992. Egg laying in a northeastern North American (montréal, québec) population of </w:t>
+      <w:bookmarkStart w:id="59" w:name="ref-tourneur1992"/>
+      <w:bookmarkEnd w:id="58"/>
+      <w:r>
+        <w:t xml:space="preserve">Tourneur, J.-C., Gingras, J., 1992. Egg laying in a northeastern North American (Montréal, Québec) population of </w:t>
       </w:r>
       <w:r>
         <w:rPr>
           <w:i/>
           <w:iCs/>
         </w:rPr>
-        <w:t>forficula auricularia</w:t>
-      </w:r>
-      <w:r>
-        <w:t xml:space="preserve"> l. (Dermaptera: Forficulidae). </w:t>
+        <w:t>Forficula auricularia</w:t>
+      </w:r>
+      <w:r>
+        <w:t xml:space="preserve"> L. (Dermaptera: Forficulidae). </w:t>
       </w:r>
       <w:r>
         <w:rPr>
           <w:i/>
           <w:iCs/>
         </w:rPr>
-        <w:t>The Canadian Entomologist</w:t>
+        <w:t>Can Entomol</w:t>
       </w:r>
       <w:r>
         <w:t xml:space="preserve"> </w:t>
@@ -3331,8 +3416,8 @@
       <w:pPr>
         <w:pStyle w:val="Bibliography"/>
       </w:pPr>
-      <w:bookmarkStart w:id="58" w:name="ref-vannoordwijk1986"/>
-      <w:bookmarkEnd w:id="57"/>
+      <w:bookmarkStart w:id="60" w:name="ref-vannoordwijk1986"/>
+      <w:bookmarkEnd w:id="59"/>
       <w:r>
         <w:t xml:space="preserve">Van Noordwijk, A.J., Jong, G. de, 1986. Acquisition and allocation of resources: Their influence on variation in life history tactics. </w:t>
       </w:r>
@@ -3361,8 +3446,8 @@
       <w:pPr>
         <w:pStyle w:val="Bibliography"/>
       </w:pPr>
-      <w:bookmarkStart w:id="59" w:name="ref-westneat2020"/>
-      <w:bookmarkEnd w:id="58"/>
+      <w:bookmarkStart w:id="61" w:name="ref-westneat2020"/>
+      <w:bookmarkEnd w:id="60"/>
       <w:r>
         <w:t xml:space="preserve">Westneat, D.F., Araya-Ajoy, Y.G., Allegue, H., Class, B., Dingemanse, N., Dochtermann, N.A., Garamszegi, L.Z., Martin, J.G.A., Nakagawa, S., Réale, D., Schielzeth, H., 2020. Collision between biological process and statistical analysis revealed by mean centring. </w:t>
       </w:r>
@@ -3391,8 +3476,8 @@
       <w:pPr>
         <w:pStyle w:val="Bibliography"/>
       </w:pPr>
-      <w:bookmarkStart w:id="60" w:name="ref-wickham2016"/>
-      <w:bookmarkEnd w:id="59"/>
+      <w:bookmarkStart w:id="62" w:name="ref-wickham2016"/>
+      <w:bookmarkEnd w:id="61"/>
       <w:r>
         <w:t>Wickham, H., 2016. ggplot2: Elegant graphics for data analysis. Springer, New York.</w:t>
       </w:r>
@@ -3401,8 +3486,8 @@
       <w:pPr>
         <w:pStyle w:val="Bibliography"/>
       </w:pPr>
-      <w:bookmarkStart w:id="61" w:name="ref-winkler1987"/>
-      <w:bookmarkEnd w:id="60"/>
+      <w:bookmarkStart w:id="63" w:name="ref-winkler1987"/>
+      <w:bookmarkEnd w:id="62"/>
       <w:r>
         <w:lastRenderedPageBreak/>
         <w:t xml:space="preserve">Winkler, D.W., Wallin, K., 1987. Offspring size and number: A life history model linking effort per offspring and total effort. </w:t>
@@ -3432,8 +3517,8 @@
       <w:pPr>
         <w:pStyle w:val="Bibliography"/>
       </w:pPr>
-      <w:bookmarkStart w:id="62" w:name="ref-zera2001a"/>
-      <w:bookmarkEnd w:id="61"/>
+      <w:bookmarkStart w:id="64" w:name="ref-zera2001a"/>
+      <w:bookmarkEnd w:id="63"/>
       <w:r>
         <w:t xml:space="preserve">Zera, A.J., Harshman, L.G., 2001. The physiology of life history trade-offs in animals. </w:t>
       </w:r>
@@ -3458,13 +3543,19 @@
         <w:t>, 95–126.</w:t>
       </w:r>
     </w:p>
-    <w:bookmarkEnd w:id="16"/>
-    <w:bookmarkEnd w:id="62"/>
+    <w:bookmarkEnd w:id="18"/>
+    <w:bookmarkEnd w:id="64"/>
+    <w:p>
+      <w:r>
+        <w:br w:type="page"/>
+      </w:r>
+    </w:p>
     <w:p>
       <w:pPr>
         <w:pStyle w:val="BodyText"/>
       </w:pPr>
       <w:r>
+        <w:lastRenderedPageBreak/>
         <w:t>##Figures</w:t>
       </w:r>
     </w:p>
@@ -3488,22 +3579,22 @@
               <w:pStyle w:val="Compact"/>
               <w:jc w:val="center"/>
             </w:pPr>
-            <w:bookmarkStart w:id="63" w:name="fig-one"/>
+            <w:bookmarkStart w:id="65" w:name="fig-one"/>
             <w:r>
               <w:rPr>
                 <w:noProof/>
               </w:rPr>
               <w:drawing>
-                <wp:inline distT="0" distB="0" distL="0" distR="0" wp14:anchorId="688994A5" wp14:editId="01186160">
+                <wp:inline distT="0" distB="0" distL="0" distR="0" wp14:anchorId="7957D9BE" wp14:editId="3A4949BB">
                   <wp:extent cx="3810000" cy="2540000"/>
                   <wp:effectExtent l="0" t="0" r="0" b="0"/>
-                  <wp:docPr id="85" name="Picture"/>
+                  <wp:docPr id="87" name="Picture"/>
                   <wp:cNvGraphicFramePr/>
                   <a:graphic xmlns:a="http://schemas.openxmlformats.org/drawingml/2006/main">
                     <a:graphicData uri="http://schemas.openxmlformats.org/drawingml/2006/picture">
                       <pic:pic xmlns:pic="http://schemas.openxmlformats.org/drawingml/2006/picture">
                         <pic:nvPicPr>
-                          <pic:cNvPr id="86" name="Picture" descr="figure_1.jpg"/>
+                          <pic:cNvPr id="88" name="Picture" descr="figure_1.jpg"/>
                           <pic:cNvPicPr>
                             <a:picLocks noChangeAspect="1" noChangeArrowheads="1"/>
                           </pic:cNvPicPr>
@@ -3602,11 +3693,11 @@
               </m:sSub>
             </m:oMath>
             <w:r>
-              <w:t xml:space="preserve"> = -0.05, 95% CrI (-0.10, 0.00). Together, the panels distinguish plastic allocation within females from strategic differences among females, indicating weak support for a reproductive size–number trade-off.</w:t>
+              <w:t xml:space="preserve"> = -0.05, 95% CrI (-0.10, 0.00). The panels distinguish plastic allocation within females from strategic differences among females, indicating weak support for a reproductive size–number trade-off.</w:t>
             </w:r>
           </w:p>
         </w:tc>
-        <w:bookmarkEnd w:id="63"/>
+        <w:bookmarkEnd w:id="65"/>
       </w:tr>
     </w:tbl>
     <w:p>
@@ -3614,7 +3705,12 @@
         <w:pStyle w:val="BodyText"/>
       </w:pPr>
       <w:r>
-        <w:t xml:space="preserve"> </w:t>
+        <w:t>Alt text: Two-panel scatterplot showing relationships between egg number and mean egg size. Panel (a) plots within-female deviations, with paired points for first and second clutches connected by lines; the trend line is nearly flat, indicating little within-female trade-off. Panel (b) plots between-female deviations, with a downward-sloping regression line indicating that females producing more eggs tend to have smaller eggs.</w:t>
+      </w:r>
+    </w:p>
+    <w:p>
+      <w:r>
+        <w:br w:type="page"/>
       </w:r>
     </w:p>
     <w:tbl>
@@ -3637,23 +3733,23 @@
               <w:pStyle w:val="Compact"/>
               <w:jc w:val="center"/>
             </w:pPr>
-            <w:bookmarkStart w:id="64" w:name="fig-two"/>
+            <w:bookmarkStart w:id="66" w:name="fig-two"/>
             <w:r>
               <w:rPr>
                 <w:noProof/>
               </w:rPr>
               <w:lastRenderedPageBreak/>
               <w:drawing>
-                <wp:inline distT="0" distB="0" distL="0" distR="0" wp14:anchorId="1F5C54C7" wp14:editId="342D12EA">
+                <wp:inline distT="0" distB="0" distL="0" distR="0" wp14:anchorId="289E6094" wp14:editId="5EEBD8D8">
                   <wp:extent cx="3810000" cy="2540000"/>
                   <wp:effectExtent l="0" t="0" r="0" b="0"/>
-                  <wp:docPr id="89" name="Picture"/>
+                  <wp:docPr id="91" name="Picture"/>
                   <wp:cNvGraphicFramePr/>
                   <a:graphic xmlns:a="http://schemas.openxmlformats.org/drawingml/2006/main">
                     <a:graphicData uri="http://schemas.openxmlformats.org/drawingml/2006/picture">
                       <pic:pic xmlns:pic="http://schemas.openxmlformats.org/drawingml/2006/picture">
                         <pic:nvPicPr>
-                          <pic:cNvPr id="90" name="Picture" descr="figure_2.jpg"/>
+                          <pic:cNvPr id="92" name="Picture" descr="figure_2.jpg"/>
                           <pic:cNvPicPr>
                             <a:picLocks noChangeAspect="1" noChangeArrowheads="1"/>
                           </pic:cNvPicPr>
@@ -3692,26 +3788,22 @@
               <w:spacing w:before="200"/>
             </w:pPr>
             <w:r>
-              <w:t xml:space="preserve">Figure 2: </w:t>
+              <w:t>Figure 2: Clutch-specific variance components of egg size. (a) Between-female variance in egg size for first and second clutches, estimated from a hierarchical Bayesian model with clutch-specific female effects. (b) Within-clutch (egg-to-egg) variance for first and second clutches. Orange points represent posterior draws, black points indicate posterior medians, and vertical lines denote 95% credible intervals. Between-female variance did not differ clearly between clutches, whereas within-clutch variance was greater in second clutches.</w:t>
             </w:r>
-            <w:bookmarkStart w:id="65" w:name="OLE_LINK2"/>
-            <w:r>
-              <w:t xml:space="preserve">Clutch-specific variance components of egg size. (a) Between-female variance in egg size for first and second clutches, estimated from a hierarchical Bayesian model with clutch-specific female effects. (b) Within-clutch (egg-to-egg) variance for first and second clutches. </w:t>
-            </w:r>
-            <w:r>
-              <w:t>Orange</w:t>
-            </w:r>
-            <w:r>
-              <w:t xml:space="preserve"> points represent posterior draws, black points indicate posterior medians, and vertical lines denote 95% credible intervals. Between-female variance did not differ clearly between clutches, whereas within-clutch variance was greater in second clutches.</w:t>
-            </w:r>
-            <w:bookmarkEnd w:id="65"/>
           </w:p>
         </w:tc>
-        <w:bookmarkEnd w:id="64"/>
+        <w:bookmarkEnd w:id="66"/>
       </w:tr>
-      <w:bookmarkEnd w:id="14"/>
     </w:tbl>
-    <w:p/>
+    <w:p>
+      <w:pPr>
+        <w:pStyle w:val="BodyText"/>
+      </w:pPr>
+      <w:r>
+        <w:t>Alt text: Two-panel dot plot showing variation in egg size across clutch order. The left panel shows between-female variation, with distributions for first and second clutches; variance is higher for first clutches than second clutches, with mean values indicated by black points and vertical error bars. The right panel shows within-clutch variation, with second clutches exhibiting greater variance than first clutches; means and error bars are shown in black.</w:t>
+      </w:r>
+      <w:bookmarkEnd w:id="16"/>
+    </w:p>
     <w:sectPr>
       <w:headerReference w:type="even" r:id="rId11"/>
       <w:headerReference w:type="default" r:id="rId12"/>
@@ -4156,7 +4248,7 @@
   <w:abstractNum w:abstractNumId="10" w15:restartNumberingAfterBreak="0">
     <w:nsid w:val="0000A990"/>
     <w:multiLevelType w:val="multilevel"/>
-    <w:tmpl w:val="CD024254"/>
+    <w:tmpl w:val="026058AE"/>
     <w:lvl w:ilvl="0">
       <w:numFmt w:val="bullet"/>
       <w:lvlText w:val=" "/>
@@ -4545,7 +4637,7 @@
   <w:num w:numId="13" w16cid:durableId="442194333">
     <w:abstractNumId w:val="12"/>
   </w:num>
-  <w:num w:numId="14" w16cid:durableId="2123646826">
+  <w:num w:numId="14" w16cid:durableId="232472464">
     <w:abstractNumId w:val="10"/>
   </w:num>
 </w:numbering>

</xml_diff>